<commit_message>
feat: Implementa validação de input e corrige log de carregamento da base
</commit_message>
<xml_diff>
--- a/src/reports/relatorio_1.docx
+++ b/src/reports/relatorio_1.docx
@@ -111,7 +111,7 @@
           <w:sz w:val="24"/>
           <w:lang w:val="pt-BR" w:eastAsia="pt-BR" w:bidi="pt-BR"/>
         </w:rPr>
-        <w:t xml:space="preserve">CONTRATO DE </w:t>
+        <w:t xml:space="preserve">CONTRATO Nº </w:t>
       </w:r>
       <w:r>
         <w:rPr>
@@ -121,7 +121,7 @@
           <w:sz w:val="24"/>
           <w:lang w:val="pt-BR" w:eastAsia="pt-BR" w:bidi="pt-BR"/>
         </w:rPr>
-        <w:t>CONCESSÃO DE SERVIÇO PÚBLICO Nº 0.000.000/00</w:t>
+        <w:t>0.000.000/00</w:t>
       </w:r>
     </w:p>
     <w:p>
@@ -200,7 +200,7 @@
       <w:r>
         <w:fldChar w:fldCharType="separate"/>
       </w:r>
-      <w:hyperlink w:anchor="_Toc214919895" w:history="1">
+      <w:hyperlink w:anchor="_Toc214925617" w:history="1">
         <w:r>
           <w:rPr>
             <w:rStyle w:val="Hyperlink"/>
@@ -230,7 +230,7 @@
             <w:noProof/>
             <w:webHidden/>
           </w:rPr>
-          <w:instrText xml:space="preserve"> PAGEREF _Toc214919895 \h </w:instrText>
+          <w:instrText xml:space="preserve"> PAGEREF _Toc214925617 \h </w:instrText>
         </w:r>
         <w:r>
           <w:rPr>
@@ -271,7 +271,7 @@
           <w:noProof/>
         </w:rPr>
       </w:pPr>
-      <w:hyperlink w:anchor="_Toc214919896" w:history="1">
+      <w:hyperlink w:anchor="_Toc214925618" w:history="1">
         <w:r>
           <w:rPr>
             <w:rStyle w:val="Hyperlink"/>
@@ -301,7 +301,7 @@
             <w:noProof/>
             <w:webHidden/>
           </w:rPr>
-          <w:instrText xml:space="preserve"> PAGEREF _Toc214919896 \h </w:instrText>
+          <w:instrText xml:space="preserve"> PAGEREF _Toc214925618 \h </w:instrText>
         </w:r>
         <w:r>
           <w:rPr>
@@ -342,7 +342,7 @@
           <w:noProof/>
         </w:rPr>
       </w:pPr>
-      <w:hyperlink w:anchor="_Toc214919897" w:history="1">
+      <w:hyperlink w:anchor="_Toc214925619" w:history="1">
         <w:r>
           <w:rPr>
             <w:rStyle w:val="Hyperlink"/>
@@ -372,7 +372,7 @@
             <w:noProof/>
             <w:webHidden/>
           </w:rPr>
-          <w:instrText xml:space="preserve"> PAGEREF _Toc214919897 \h </w:instrText>
+          <w:instrText xml:space="preserve"> PAGEREF _Toc214925619 \h </w:instrText>
         </w:r>
         <w:r>
           <w:rPr>
@@ -413,7 +413,7 @@
           <w:noProof/>
         </w:rPr>
       </w:pPr>
-      <w:hyperlink w:anchor="_Toc214919898" w:history="1">
+      <w:hyperlink w:anchor="_Toc214925620" w:history="1">
         <w:r>
           <w:rPr>
             <w:rStyle w:val="Hyperlink"/>
@@ -443,7 +443,7 @@
             <w:noProof/>
             <w:webHidden/>
           </w:rPr>
-          <w:instrText xml:space="preserve"> PAGEREF _Toc214919898 \h </w:instrText>
+          <w:instrText xml:space="preserve"> PAGEREF _Toc214925620 \h </w:instrText>
         </w:r>
         <w:r>
           <w:rPr>
@@ -484,7 +484,7 @@
           <w:noProof/>
         </w:rPr>
       </w:pPr>
-      <w:hyperlink w:anchor="_Toc214919899" w:history="1">
+      <w:hyperlink w:anchor="_Toc214925621" w:history="1">
         <w:r>
           <w:rPr>
             <w:rStyle w:val="Hyperlink"/>
@@ -514,7 +514,7 @@
             <w:noProof/>
             <w:webHidden/>
           </w:rPr>
-          <w:instrText xml:space="preserve"> PAGEREF _Toc214919899 \h </w:instrText>
+          <w:instrText xml:space="preserve"> PAGEREF _Toc214925621 \h </w:instrText>
         </w:r>
         <w:r>
           <w:rPr>
@@ -555,7 +555,7 @@
           <w:noProof/>
         </w:rPr>
       </w:pPr>
-      <w:hyperlink w:anchor="_Toc214919900" w:history="1">
+      <w:hyperlink w:anchor="_Toc214925622" w:history="1">
         <w:r>
           <w:rPr>
             <w:rStyle w:val="Hyperlink"/>
@@ -585,7 +585,7 @@
             <w:noProof/>
             <w:webHidden/>
           </w:rPr>
-          <w:instrText xml:space="preserve"> PAGEREF _Toc214919900 \h </w:instrText>
+          <w:instrText xml:space="preserve"> PAGEREF _Toc214925622 \h </w:instrText>
         </w:r>
         <w:r>
           <w:rPr>
@@ -626,7 +626,7 @@
           <w:noProof/>
         </w:rPr>
       </w:pPr>
-      <w:hyperlink w:anchor="_Toc214919901" w:history="1">
+      <w:hyperlink w:anchor="_Toc214925623" w:history="1">
         <w:r>
           <w:rPr>
             <w:rStyle w:val="Hyperlink"/>
@@ -656,7 +656,7 @@
             <w:noProof/>
             <w:webHidden/>
           </w:rPr>
-          <w:instrText xml:space="preserve"> PAGEREF _Toc214919901 \h </w:instrText>
+          <w:instrText xml:space="preserve"> PAGEREF _Toc214925623 \h </w:instrText>
         </w:r>
         <w:r>
           <w:rPr>
@@ -707,7 +707,7 @@
         <w:pStyle w:val="Ttulo1"/>
         <w:spacing w:after="120"/>
       </w:pPr>
-      <w:bookmarkStart w:id="1" w:name="_Toc214919895"/>
+      <w:bookmarkStart w:id="1" w:name="_Toc214925617"/>
       <w:r>
         <w:rPr>
           <w:rFonts w:ascii="Arial" w:eastAsia="Arial" w:hAnsi="Arial"/>
@@ -726,10 +726,10 @@
         <w:jc w:val="both"/>
       </w:pPr>
       <w:r>
-        <w:t>A Coordenadoria de Transportes e Rodovias da Arpe realizou vi</w:t>
+        <w:t>A Coordenadoria de Transportes e Rodovias da Arpe realizou vistoria nos Terminais Rodoviários</w:t>
       </w:r>
       <w:r>
-        <w:t xml:space="preserve">storia nos Terminais Rodoviários Intermunicipais concedidos com o objetivo de verificar as condições operacionais, de conservação, de manutenção e de segurança dos referidos terminais, conforme Contrato de Serviço Público </w:t>
+        <w:t xml:space="preserve"> Intermunicipais concedidos com o objetivo de verificar as condições operacionais, de conservação, de manutenção e de segurança dos referidos terminais, conforme Contrato de Serviço Público </w:t>
       </w:r>
       <w:r>
         <w:rPr>
@@ -738,10 +738,10 @@
         <w:t>Nº 1.041.080/10</w:t>
       </w:r>
       <w:r>
-        <w:t>, firmado entre o G</w:t>
+        <w:t>, firmado entre o Governo do Estado, representado p</w:t>
       </w:r>
       <w:r>
-        <w:t xml:space="preserve">overno do Estado, representado pela Secretaria de Transportes (SETRA) e a SOCICAM - Administração, Projetos e Representações Ltda. A ação foi no dia </w:t>
+        <w:t xml:space="preserve">ela Secretaria de Transportes (SETRA) e a SOCICAM - Administração, Projetos e Representações Ltda. A ação foi no dia </w:t>
       </w:r>
       <w:r>
         <w:rPr>
@@ -759,10 +759,10 @@
         <w:t>Terminal Rodoviário do Recife - TIP</w:t>
       </w:r>
       <w:r>
-        <w:t xml:space="preserve"> e nos dias 26/04/2025 a 01/05/2043, nas c</w:t>
+        <w:t xml:space="preserve"> e nos dias 26/04/2025 a 01/05/2043, nas cidades de Caruaru, Garanhuns, Ar</w:t>
       </w:r>
       <w:r>
-        <w:t xml:space="preserve">idades de Caruaru, Garanhuns, Arcoverde, Serra Talhada e Petrolina. As visitas técnicas foram realizadas pela equipe formada por </w:t>
+        <w:t xml:space="preserve">coverde, Serra Talhada e Petrolina. As visitas técnicas foram realizadas pela equipe formada por </w:t>
       </w:r>
       <w:r>
         <w:rPr>
@@ -778,13 +778,13 @@
       </w:r>
       <w:r>
         <w:br/>
-        <w:t>Neste Relatório de Fiscalização foram observadas as condições de conservação, limpeza e higien</w:t>
+        <w:t>Neste Relatório de Fiscalização foram observadas as condições de conservação, limpeza e higiene das áreas de embarque e desemb</w:t>
       </w:r>
       <w:r>
-        <w:t>e das áreas de embarque e desembarque, dos sanitários, as condições do pavimento das vias de circulação interna, a infraestrutura oferecida, os locais de estocagem de veículos, a segurança e o atendimento ao usuário, bem como toda estrutura para funcioname</w:t>
+        <w:t>arque, dos sanitários, as condições do pavimento das vias de circulação interna, a infraestrutura oferecida, os locais de estocagem de veículos, a segurança e o atendimento ao usuário, bem como toda estrutura para funcionamento dos terminais. A equipe da A</w:t>
       </w:r>
       <w:r>
-        <w:t>nto dos terminais. A equipe da Arpe conversou com os responsáveis pelos seis terminais que forneceram informações complementares à fiscalização, principalmente sobre a implantação dos sistemas contra incêndio.</w:t>
+        <w:t>rpe conversou com os responsáveis pelos seis terminais que forneceram informações complementares à fiscalização, principalmente sobre a implantação dos sistemas contra incêndio.</w:t>
       </w:r>
     </w:p>
     <w:p>
@@ -792,7 +792,7 @@
         <w:pStyle w:val="Ttulo1"/>
         <w:spacing w:after="120"/>
       </w:pPr>
-      <w:bookmarkStart w:id="2" w:name="_Toc214919896"/>
+      <w:bookmarkStart w:id="2" w:name="_Toc214925618"/>
       <w:r>
         <w:rPr>
           <w:rFonts w:ascii="Arial" w:eastAsia="Arial" w:hAnsi="Arial"/>
@@ -815,7 +815,7 @@
           <w:color w:val="000000"/>
           <w:lang w:val="pt-BR" w:eastAsia="pt-BR" w:bidi="pt-BR"/>
         </w:rPr>
-        <w:t>Este Relatório do 1º Monitoramento</w:t>
+        <w:t>Este Relatório do 1º Monitoramento objetiva apresentar os resultad</w:t>
       </w:r>
       <w:r>
         <w:rPr>
@@ -823,7 +823,7 @@
           <w:color w:val="000000"/>
           <w:lang w:val="pt-BR" w:eastAsia="pt-BR" w:bidi="pt-BR"/>
         </w:rPr>
-        <w:t xml:space="preserve"> objetiva apresentar os resultados das vistorias acerca das Não Conformidades pendentes registradas no Relatório de Fiscalização Técnico-Operacional nº 01/2025 (Doc. SEI nº 12345678), referentes aos Terminais Rodoviários Intermunicipais dos municípios de C</w:t>
+        <w:t>os das vistorias acerca das Não Conformidades pendentes registradas no Relatório de Fiscalização Técnico-Operacional nº 01/2025 (Doc. SEI nº 12345678), referentes aos Terminais Rodoviários Intermunicipais dos municípios de Caruaru, Garanhuns e Recife, conf</w:t>
       </w:r>
       <w:r>
         <w:rPr>
@@ -831,7 +831,7 @@
           <w:color w:val="000000"/>
           <w:lang w:val="pt-BR" w:eastAsia="pt-BR" w:bidi="pt-BR"/>
         </w:rPr>
-        <w:t>aruaru, Garanhuns e Recife, conforme o cronograma de atividades encaminhado pela Concessionária SOCICAM.</w:t>
+        <w:t>orme o cronograma de atividades encaminhado pela Concessionária SOCICAM.</w:t>
       </w:r>
     </w:p>
     <w:p>
@@ -839,7 +839,7 @@
         <w:pStyle w:val="Ttulo1"/>
         <w:spacing w:after="120"/>
       </w:pPr>
-      <w:bookmarkStart w:id="3" w:name="_Toc214919897"/>
+      <w:bookmarkStart w:id="3" w:name="_Toc214925619"/>
       <w:r>
         <w:rPr>
           <w:rFonts w:ascii="Arial" w:eastAsia="Arial" w:hAnsi="Arial"/>
@@ -862,7 +862,7 @@
           <w:color w:val="000000"/>
           <w:lang w:val="pt-BR" w:eastAsia="pt-BR" w:bidi="pt-BR"/>
         </w:rPr>
-        <w:t>Estão registrados para cada Terminal Rodoviário os resultados da verificação pela Arpe das a</w:t>
+        <w:t>Estão registrados para cada Terminal Rodoviário os resultados da verificação pela Arpe das ações desenvolvidas pela SOCICAM,</w:t>
       </w:r>
       <w:r>
         <w:rPr>
@@ -870,7 +870,7 @@
           <w:color w:val="000000"/>
           <w:lang w:val="pt-BR" w:eastAsia="pt-BR" w:bidi="pt-BR"/>
         </w:rPr>
-        <w:t>ções desenvolvidas pela SOCICAM, constante da Carta SAP/PER/ARPE N° 001/2025 e Carta SAP/PER/ARPE N° 002/2025, para solucionar as Não Conformidades ainda pendentes apresentadas no Relatório de Fiscalização Técnico-Operacional ARPE/CTR nº 01/2025.</w:t>
+        <w:t xml:space="preserve"> constante da Carta SAP/PER/ARPE N° 001/2025 e Carta SAP/PER/ARPE N° 002/2025, para solucionar as Não Conformidades ainda pendentes apresentadas no Relatório de Fiscalização Técnico-Operacional ARPE/CTR nº 01/2025.</w:t>
       </w:r>
     </w:p>
     <w:p>
@@ -885,17 +885,7 @@
           <w:sz w:val="24"/>
           <w:lang w:val="pt-BR" w:eastAsia="pt-BR" w:bidi="pt-BR"/>
         </w:rPr>
-        <w:t>3.1 - TER</w:t>
-      </w:r>
-      <w:r>
-        <w:rPr>
-          <w:rFonts w:ascii="Arial" w:eastAsia="Arial" w:hAnsi="Arial"/>
-          <w:b/>
-          <w:color w:val="000000"/>
-          <w:sz w:val="24"/>
-          <w:lang w:val="pt-BR" w:eastAsia="pt-BR" w:bidi="pt-BR"/>
-        </w:rPr>
-        <w:t>MINAL DE CARUARU (CAR)</w:t>
+        <w:t>3.1 - TERMINAL DE CARUARU (CAR)</w:t>
       </w:r>
     </w:p>
     <w:p>
@@ -910,7 +900,17 @@
           <w:u w:val="single"/>
           <w:lang w:val="pt-BR" w:eastAsia="pt-BR" w:bidi="pt-BR"/>
         </w:rPr>
-        <w:t>Não Conformidade CAR 2025_01</w:t>
+        <w:t>Não Confo</w:t>
+      </w:r>
+      <w:r>
+        <w:rPr>
+          <w:rFonts w:ascii="Arial" w:eastAsia="Arial" w:hAnsi="Arial"/>
+          <w:b/>
+          <w:color w:val="000000"/>
+          <w:u w:val="single"/>
+          <w:lang w:val="pt-BR" w:eastAsia="pt-BR" w:bidi="pt-BR"/>
+        </w:rPr>
+        <w:t>rmidade CAR 2025_01</w:t>
       </w:r>
       <w:r>
         <w:rPr>
@@ -1007,17 +1007,7 @@
           <w:u w:val="single"/>
           <w:lang w:val="pt-BR" w:eastAsia="pt-BR" w:bidi="pt-BR"/>
         </w:rPr>
-        <w:t xml:space="preserve">Não Conformidade </w:t>
-      </w:r>
-      <w:r>
-        <w:rPr>
-          <w:rFonts w:ascii="Arial" w:eastAsia="Arial" w:hAnsi="Arial"/>
-          <w:b/>
-          <w:color w:val="000000"/>
-          <w:u w:val="single"/>
-          <w:lang w:val="pt-BR" w:eastAsia="pt-BR" w:bidi="pt-BR"/>
-        </w:rPr>
-        <w:t>CAR 2025_04</w:t>
+        <w:t>Não Conformidade CAR 2025_04</w:t>
       </w:r>
       <w:r>
         <w:rPr>
@@ -1025,7 +1015,15 @@
           <w:color w:val="000000"/>
           <w:lang w:val="pt-BR" w:eastAsia="pt-BR" w:bidi="pt-BR"/>
         </w:rPr>
-        <w:t xml:space="preserve"> – Área precisando de capinação no terreno lateral do Terminal de Caruaru</w:t>
+        <w:t xml:space="preserve"> – Área precisando de</w:t>
+      </w:r>
+      <w:r>
+        <w:rPr>
+          <w:rFonts w:ascii="Arial" w:eastAsia="Arial" w:hAnsi="Arial"/>
+          <w:color w:val="000000"/>
+          <w:lang w:val="pt-BR" w:eastAsia="pt-BR" w:bidi="pt-BR"/>
+        </w:rPr>
+        <w:t xml:space="preserve"> capinação no terreno lateral do Terminal de Caruaru</w:t>
       </w:r>
     </w:p>
     <w:p>
@@ -1123,7 +1121,7 @@
           <w:color w:val="000000"/>
           <w:lang w:val="pt-BR" w:eastAsia="pt-BR" w:bidi="pt-BR"/>
         </w:rPr>
-        <w:t xml:space="preserve"> – Área com infiltraç</w:t>
+        <w:t xml:space="preserve"> – Área com infiltração na fachada lateral do Termina</w:t>
       </w:r>
       <w:r>
         <w:rPr>
@@ -1131,7 +1129,7 @@
           <w:color w:val="000000"/>
           <w:lang w:val="pt-BR" w:eastAsia="pt-BR" w:bidi="pt-BR"/>
         </w:rPr>
-        <w:t>ão na fachada lateral do Terminal de Caruaru</w:t>
+        <w:t>l de Caruaru</w:t>
       </w:r>
     </w:p>
     <w:p>
@@ -1228,15 +1226,7 @@
           <w:color w:val="000000"/>
           <w:lang w:val="pt-BR" w:eastAsia="pt-BR" w:bidi="pt-BR"/>
         </w:rPr>
-        <w:t xml:space="preserve"> – Pintura desgastada no muro e na grade do pátio de manobra no Termi</w:t>
-      </w:r>
-      <w:r>
-        <w:rPr>
-          <w:rFonts w:ascii="Arial" w:eastAsia="Arial" w:hAnsi="Arial"/>
-          <w:color w:val="000000"/>
-          <w:lang w:val="pt-BR" w:eastAsia="pt-BR" w:bidi="pt-BR"/>
-        </w:rPr>
-        <w:t>nal de Caruaru</w:t>
+        <w:t xml:space="preserve"> – Pintura desgastada no muro e na grade do pátio de manobra no Terminal de Caruaru</w:t>
       </w:r>
     </w:p>
     <w:p>
@@ -1251,7 +1241,16 @@
           <w:color w:val="000000"/>
           <w:lang w:val="pt-BR" w:eastAsia="pt-BR" w:bidi="pt-BR"/>
         </w:rPr>
-        <w:t xml:space="preserve">Informação da SOCICAM: </w:t>
+        <w:t>Informação da SOC</w:t>
+      </w:r>
+      <w:r>
+        <w:rPr>
+          <w:rFonts w:ascii="Arial" w:eastAsia="Arial" w:hAnsi="Arial"/>
+          <w:b/>
+          <w:color w:val="000000"/>
+          <w:lang w:val="pt-BR" w:eastAsia="pt-BR" w:bidi="pt-BR"/>
+        </w:rPr>
+        <w:t xml:space="preserve">ICAM: </w:t>
       </w:r>
       <w:r>
         <w:rPr>
@@ -1348,16 +1347,7 @@
           <w:color w:val="000000"/>
           <w:lang w:val="pt-BR" w:eastAsia="pt-BR" w:bidi="pt-BR"/>
         </w:rPr>
-        <w:t>Informação da SOCICA</w:t>
-      </w:r>
-      <w:r>
-        <w:rPr>
-          <w:rFonts w:ascii="Arial" w:eastAsia="Arial" w:hAnsi="Arial"/>
-          <w:b/>
-          <w:color w:val="000000"/>
-          <w:lang w:val="pt-BR" w:eastAsia="pt-BR" w:bidi="pt-BR"/>
-        </w:rPr>
-        <w:t xml:space="preserve">M: </w:t>
+        <w:t xml:space="preserve">Informação da SOCICAM: </w:t>
       </w:r>
       <w:r>
         <w:rPr>
@@ -1388,7 +1378,15 @@
           <w:color w:val="000000"/>
           <w:lang w:val="pt-BR" w:eastAsia="pt-BR" w:bidi="pt-BR"/>
         </w:rPr>
-        <w:t>Pintura desgastada no muro lateral no Terminal</w:t>
+        <w:t>Pintura desg</w:t>
+      </w:r>
+      <w:r>
+        <w:rPr>
+          <w:rFonts w:ascii="Arial" w:eastAsia="Arial" w:hAnsi="Arial"/>
+          <w:color w:val="000000"/>
+          <w:lang w:val="pt-BR" w:eastAsia="pt-BR" w:bidi="pt-BR"/>
+        </w:rPr>
+        <w:t>astada no muro lateral no Terminal</w:t>
       </w:r>
     </w:p>
     <w:p>
@@ -1485,7 +1483,7 @@
           <w:color w:val="000000"/>
           <w:lang w:val="pt-BR" w:eastAsia="pt-BR" w:bidi="pt-BR"/>
         </w:rPr>
-        <w:t xml:space="preserve">Vidraças na parte </w:t>
+        <w:t>Vidraças na parte administrativa precisando de lim</w:t>
       </w:r>
       <w:r>
         <w:rPr>
@@ -1493,7 +1491,7 @@
           <w:color w:val="000000"/>
           <w:lang w:val="pt-BR" w:eastAsia="pt-BR" w:bidi="pt-BR"/>
         </w:rPr>
-        <w:t>administrativa precisando de limpeza</w:t>
+        <w:t>peza</w:t>
       </w:r>
     </w:p>
     <w:p>
@@ -1633,17 +1631,7 @@
           <w:u w:val="single"/>
           <w:lang w:val="pt-BR" w:eastAsia="pt-BR" w:bidi="pt-BR"/>
         </w:rPr>
-        <w:t xml:space="preserve">Não </w:t>
-      </w:r>
-      <w:r>
-        <w:rPr>
-          <w:rFonts w:ascii="Arial" w:eastAsia="Arial" w:hAnsi="Arial"/>
-          <w:b/>
-          <w:color w:val="000000"/>
-          <w:u w:val="single"/>
-          <w:lang w:val="pt-BR" w:eastAsia="pt-BR" w:bidi="pt-BR"/>
-        </w:rPr>
-        <w:t>Conformidade CAR 2025_10</w:t>
+        <w:t>Não Conformidade CAR 2025_10</w:t>
       </w:r>
       <w:r>
         <w:rPr>
@@ -1651,7 +1639,15 @@
           <w:color w:val="000000"/>
           <w:lang w:val="pt-BR" w:eastAsia="pt-BR" w:bidi="pt-BR"/>
         </w:rPr>
-        <w:t xml:space="preserve"> – Rampa para PCD desgastada no Terminal de Caruaru</w:t>
+        <w:t xml:space="preserve"> – Rampa </w:t>
+      </w:r>
+      <w:r>
+        <w:rPr>
+          <w:rFonts w:ascii="Arial" w:eastAsia="Arial" w:hAnsi="Arial"/>
+          <w:color w:val="000000"/>
+          <w:lang w:val="pt-BR" w:eastAsia="pt-BR" w:bidi="pt-BR"/>
+        </w:rPr>
+        <w:t>para PCD desgastada no Terminal de Caruaru</w:t>
       </w:r>
     </w:p>
     <w:p>
@@ -1749,7 +1745,7 @@
           <w:color w:val="000000"/>
           <w:lang w:val="pt-BR" w:eastAsia="pt-BR" w:bidi="pt-BR"/>
         </w:rPr>
-        <w:t xml:space="preserve"> – Desgaste do pavimento na rampa de carga e descarg</w:t>
+        <w:t xml:space="preserve"> – Desgaste do pavimento na rampa de carga e descarga na entrada do Terminal de Carua</w:t>
       </w:r>
       <w:r>
         <w:rPr>
@@ -1757,7 +1753,7 @@
           <w:color w:val="000000"/>
           <w:lang w:val="pt-BR" w:eastAsia="pt-BR" w:bidi="pt-BR"/>
         </w:rPr>
-        <w:t>a na entrada do Terminal de Caruaru</w:t>
+        <w:t>ru</w:t>
       </w:r>
     </w:p>
     <w:p>
@@ -1869,7 +1865,7 @@
           <w:color w:val="000000"/>
           <w:lang w:val="pt-BR" w:eastAsia="pt-BR" w:bidi="pt-BR"/>
         </w:rPr>
-        <w:t xml:space="preserve"> – Pintura desgastada </w:t>
+        <w:t xml:space="preserve"> – Pintura desgastada no muro da lateral do Terminal de</w:t>
       </w:r>
       <w:r>
         <w:rPr>
@@ -1877,7 +1873,7 @@
           <w:color w:val="000000"/>
           <w:lang w:val="pt-BR" w:eastAsia="pt-BR" w:bidi="pt-BR"/>
         </w:rPr>
-        <w:t>no muro da lateral do Terminal de Garanhuns</w:t>
+        <w:t xml:space="preserve"> Garanhuns</w:t>
       </w:r>
     </w:p>
     <w:p>
@@ -1974,15 +1970,7 @@
           <w:color w:val="000000"/>
           <w:lang w:val="pt-BR" w:eastAsia="pt-BR" w:bidi="pt-BR"/>
         </w:rPr>
-        <w:t xml:space="preserve"> – Pintura desgastada do muro do pátio de manobras no Terminal de Garanh</w:t>
-      </w:r>
-      <w:r>
-        <w:rPr>
-          <w:rFonts w:ascii="Arial" w:eastAsia="Arial" w:hAnsi="Arial"/>
-          <w:color w:val="000000"/>
-          <w:lang w:val="pt-BR" w:eastAsia="pt-BR" w:bidi="pt-BR"/>
-        </w:rPr>
-        <w:t>uns</w:t>
+        <w:t xml:space="preserve"> – Pintura desgastada do muro do pátio de manobras no Terminal de Garanhuns</w:t>
       </w:r>
     </w:p>
     <w:p>
@@ -2020,7 +2008,16 @@
           <w:color w:val="000000"/>
           <w:lang w:val="pt-BR" w:eastAsia="pt-BR" w:bidi="pt-BR"/>
         </w:rPr>
-        <w:t xml:space="preserve">Constatação: </w:t>
+        <w:t>Co</w:t>
+      </w:r>
+      <w:r>
+        <w:rPr>
+          <w:rFonts w:ascii="Arial" w:eastAsia="Arial" w:hAnsi="Arial"/>
+          <w:b/>
+          <w:color w:val="000000"/>
+          <w:lang w:val="pt-BR" w:eastAsia="pt-BR" w:bidi="pt-BR"/>
+        </w:rPr>
+        <w:t xml:space="preserve">nstatação: </w:t>
       </w:r>
       <w:r>
         <w:rPr>
@@ -2125,7 +2122,15 @@
           <w:color w:val="000000"/>
           <w:lang w:val="pt-BR" w:eastAsia="pt-BR" w:bidi="pt-BR"/>
         </w:rPr>
-        <w:t>Pintura desgastada das colunas da entrada do Terminal</w:t>
+        <w:t xml:space="preserve">Pintura desgastada das </w:t>
+      </w:r>
+      <w:r>
+        <w:rPr>
+          <w:rFonts w:ascii="Arial" w:eastAsia="Arial" w:hAnsi="Arial"/>
+          <w:color w:val="000000"/>
+          <w:lang w:val="pt-BR" w:eastAsia="pt-BR" w:bidi="pt-BR"/>
+        </w:rPr>
+        <w:t>colunas da entrada do Terminal</w:t>
       </w:r>
     </w:p>
     <w:p>
@@ -2222,7 +2227,15 @@
           <w:color w:val="000000"/>
           <w:lang w:val="pt-BR" w:eastAsia="pt-BR" w:bidi="pt-BR"/>
         </w:rPr>
-        <w:t>Pintura desgastada nas colunas da fachada do lado do pátio de manobras no Terminal</w:t>
+        <w:t xml:space="preserve">Pintura desgastada nas colunas da </w:t>
+      </w:r>
+      <w:r>
+        <w:rPr>
+          <w:rFonts w:ascii="Arial" w:eastAsia="Arial" w:hAnsi="Arial"/>
+          <w:color w:val="000000"/>
+          <w:lang w:val="pt-BR" w:eastAsia="pt-BR" w:bidi="pt-BR"/>
+        </w:rPr>
+        <w:t>fachada do lado do pátio de manobras no Terminal</w:t>
       </w:r>
     </w:p>
     <w:p>
@@ -2319,7 +2332,7 @@
           <w:color w:val="000000"/>
           <w:lang w:val="pt-BR" w:eastAsia="pt-BR" w:bidi="pt-BR"/>
         </w:rPr>
-        <w:t>Pintura de</w:t>
+        <w:t>Pintura desgastada na parede lateral direita</w:t>
       </w:r>
       <w:r>
         <w:rPr>
@@ -2327,7 +2340,7 @@
           <w:color w:val="000000"/>
           <w:lang w:val="pt-BR" w:eastAsia="pt-BR" w:bidi="pt-BR"/>
         </w:rPr>
-        <w:t>sgastada na parede lateral direita no Terminal</w:t>
+        <w:t xml:space="preserve"> no Terminal</w:t>
       </w:r>
     </w:p>
     <w:p>
@@ -2409,16 +2422,7 @@
           <w:color w:val="000000"/>
           <w:lang w:val="pt-BR" w:eastAsia="pt-BR" w:bidi="pt-BR"/>
         </w:rPr>
-        <w:t>Info</w:t>
-      </w:r>
-      <w:r>
-        <w:rPr>
-          <w:rFonts w:ascii="Arial" w:eastAsia="Arial" w:hAnsi="Arial"/>
-          <w:b/>
-          <w:color w:val="000000"/>
-          <w:lang w:val="pt-BR" w:eastAsia="pt-BR" w:bidi="pt-BR"/>
-        </w:rPr>
-        <w:t xml:space="preserve">rmação da SOCICAM: </w:t>
+        <w:t xml:space="preserve">Informação da SOCICAM: </w:t>
       </w:r>
       <w:r>
         <w:rPr>
@@ -2426,7 +2430,15 @@
           <w:color w:val="000000"/>
           <w:lang w:val="pt-BR" w:eastAsia="pt-BR" w:bidi="pt-BR"/>
         </w:rPr>
-        <w:t>A SOCICAM informou que o serviço estava em andamento com a equipe interna de manutenção, com previsão de conclusão em setembro de 2025 (Carta SAP/PER/ARPE N° 002/2025).</w:t>
+        <w:t>A SOCICAM infor</w:t>
+      </w:r>
+      <w:r>
+        <w:rPr>
+          <w:rFonts w:ascii="Arial" w:eastAsia="Arial" w:hAnsi="Arial"/>
+          <w:color w:val="000000"/>
+          <w:lang w:val="pt-BR" w:eastAsia="pt-BR" w:bidi="pt-BR"/>
+        </w:rPr>
+        <w:t>mou que o serviço estava em andamento com a equipe interna de manutenção, com previsão de conclusão em setembro de 2025 (Carta SAP/PER/ARPE N° 002/2025).</w:t>
       </w:r>
     </w:p>
     <w:p>
@@ -2449,7 +2461,7 @@
           <w:color w:val="000000"/>
           <w:lang w:val="pt-BR" w:eastAsia="pt-BR" w:bidi="pt-BR"/>
         </w:rPr>
-        <w:t>Infiltração em coluna de sustentação da estrutura metál</w:t>
+        <w:t>Infiltração em coluna de sustentação da estrutura metálica da área de embarque e desembar</w:t>
       </w:r>
       <w:r>
         <w:rPr>
@@ -2457,7 +2469,7 @@
           <w:color w:val="000000"/>
           <w:lang w:val="pt-BR" w:eastAsia="pt-BR" w:bidi="pt-BR"/>
         </w:rPr>
-        <w:t>ica da área de embarque e desembarque</w:t>
+        <w:t>que</w:t>
       </w:r>
     </w:p>
     <w:p>
@@ -2480,15 +2492,7 @@
           <w:color w:val="000000"/>
           <w:lang w:val="pt-BR" w:eastAsia="pt-BR" w:bidi="pt-BR"/>
         </w:rPr>
-        <w:t>Não Conformidade pendente. Recomenda-se que a SOCICAM encaminhe comprovação de conclusão desses serviços, que se encontram em atraso considerando a informação da SOCICAM constante da Carta SAP/PER/ARPE</w:t>
-      </w:r>
-      <w:r>
-        <w:rPr>
-          <w:rFonts w:ascii="Arial" w:eastAsia="Arial" w:hAnsi="Arial"/>
-          <w:color w:val="000000"/>
-          <w:lang w:val="pt-BR" w:eastAsia="pt-BR" w:bidi="pt-BR"/>
-        </w:rPr>
-        <w:t xml:space="preserve"> N° 002/2025.</w:t>
+        <w:t>Não Conformidade pendente. Recomenda-se que a SOCICAM encaminhe comprovação de conclusão desses serviços, que se encontram em atraso considerando a informação da SOCICAM constante da Carta SAP/PER/ARPE N° 002/2025.</w:t>
       </w:r>
     </w:p>
     <w:p>
@@ -2508,7 +2512,17 @@
           <w:u w:val="single"/>
           <w:lang w:val="pt-BR" w:eastAsia="pt-BR" w:bidi="pt-BR"/>
         </w:rPr>
-        <w:t>Não Conformidade TIP 2025_02</w:t>
+        <w:t>Não Conformidade TI</w:t>
+      </w:r>
+      <w:r>
+        <w:rPr>
+          <w:rFonts w:ascii="Arial" w:eastAsia="Arial" w:hAnsi="Arial"/>
+          <w:b/>
+          <w:color w:val="000000"/>
+          <w:u w:val="single"/>
+          <w:lang w:val="pt-BR" w:eastAsia="pt-BR" w:bidi="pt-BR"/>
+        </w:rPr>
+        <w:t>P 2025_02</w:t>
       </w:r>
       <w:r>
         <w:rPr>
@@ -2559,16 +2573,7 @@
           <w:color w:val="000000"/>
           <w:lang w:val="pt-BR" w:eastAsia="pt-BR" w:bidi="pt-BR"/>
         </w:rPr>
-        <w:t>Não Confo</w:t>
-      </w:r>
-      <w:r>
-        <w:rPr>
-          <w:rFonts w:ascii="Arial" w:eastAsia="Arial" w:hAnsi="Arial"/>
-          <w:b/>
-          <w:color w:val="000000"/>
-          <w:lang w:val="pt-BR" w:eastAsia="pt-BR" w:bidi="pt-BR"/>
-        </w:rPr>
-        <w:t>rmidade TIP 2025_02.2</w:t>
+        <w:t>Não Conformidade TIP 2025_02.2</w:t>
       </w:r>
       <w:r>
         <w:t xml:space="preserve"> – </w:t>
@@ -2579,7 +2584,15 @@
           <w:color w:val="000000"/>
           <w:lang w:val="pt-BR" w:eastAsia="pt-BR" w:bidi="pt-BR"/>
         </w:rPr>
-        <w:t>Barra oxidada em torno da pia</w:t>
+        <w:t>Barra oxid</w:t>
+      </w:r>
+      <w:r>
+        <w:rPr>
+          <w:rFonts w:ascii="Arial" w:eastAsia="Arial" w:hAnsi="Arial"/>
+          <w:color w:val="000000"/>
+          <w:lang w:val="pt-BR" w:eastAsia="pt-BR" w:bidi="pt-BR"/>
+        </w:rPr>
+        <w:t>ada em torno da pia</w:t>
       </w:r>
     </w:p>
     <w:p>
@@ -2629,15 +2642,7 @@
           <w:color w:val="000000"/>
           <w:lang w:val="pt-BR" w:eastAsia="pt-BR" w:bidi="pt-BR"/>
         </w:rPr>
-        <w:t xml:space="preserve">A SOCICAM informou que os serviços estavam em andamento com prazo previsto para julho/2025 (Carta SAP/PER/ARPE N° </w:t>
-      </w:r>
-      <w:r>
-        <w:rPr>
-          <w:rFonts w:ascii="Arial" w:eastAsia="Arial" w:hAnsi="Arial"/>
-          <w:color w:val="000000"/>
-          <w:lang w:val="pt-BR" w:eastAsia="pt-BR" w:bidi="pt-BR"/>
-        </w:rPr>
-        <w:t>002/2025).</w:t>
+        <w:t>A SOCICAM informou que os serviços estavam em andamento com prazo previsto para julho/2025 (Carta SAP/PER/ARPE N° 002/2025).</w:t>
       </w:r>
     </w:p>
     <w:p>
@@ -2660,7 +2665,15 @@
           <w:color w:val="000000"/>
           <w:lang w:val="pt-BR" w:eastAsia="pt-BR" w:bidi="pt-BR"/>
         </w:rPr>
-        <w:t>Falta de manutenção adequada no banheiro feminino para PCD localizado no primeiro andar do Terminal de Recife (TIP)</w:t>
+        <w:t xml:space="preserve">Falta de </w:t>
+      </w:r>
+      <w:r>
+        <w:rPr>
+          <w:rFonts w:ascii="Arial" w:eastAsia="Arial" w:hAnsi="Arial"/>
+          <w:color w:val="000000"/>
+          <w:lang w:val="pt-BR" w:eastAsia="pt-BR" w:bidi="pt-BR"/>
+        </w:rPr>
+        <w:t>manutenção adequada no banheiro feminino para PCD localizado no primeiro andar do Terminal de Recife (TIP)</w:t>
       </w:r>
     </w:p>
     <w:p>
@@ -2711,7 +2724,7 @@
           <w:color w:val="000000"/>
           <w:lang w:val="pt-BR" w:eastAsia="pt-BR" w:bidi="pt-BR"/>
         </w:rPr>
-        <w:t xml:space="preserve"> – Porta com avaria no banheiro feminino do p</w:t>
+        <w:t xml:space="preserve"> – Porta com avaria no banheiro feminino do primeiro andar do Terminal de Reci</w:t>
       </w:r>
       <w:r>
         <w:rPr>
@@ -2719,7 +2732,7 @@
           <w:color w:val="000000"/>
           <w:lang w:val="pt-BR" w:eastAsia="pt-BR" w:bidi="pt-BR"/>
         </w:rPr>
-        <w:t>rimeiro andar do Terminal de Recife (TIP)</w:t>
+        <w:t>fe (TIP)</w:t>
       </w:r>
     </w:p>
     <w:p>
@@ -2816,7 +2829,7 @@
           <w:color w:val="000000"/>
           <w:lang w:val="pt-BR" w:eastAsia="pt-BR" w:bidi="pt-BR"/>
         </w:rPr>
-        <w:t xml:space="preserve"> – Pintura do meio-fio desgastada na </w:t>
+        <w:t xml:space="preserve"> – Pintura do meio-fio desgastada na área de circulação e manobra dos </w:t>
       </w:r>
       <w:r>
         <w:rPr>
@@ -2824,7 +2837,7 @@
           <w:color w:val="000000"/>
           <w:lang w:val="pt-BR" w:eastAsia="pt-BR" w:bidi="pt-BR"/>
         </w:rPr>
-        <w:t>área de circulação e manobra dos ônibus no pátio interno do Terminal de Recife (TIP)</w:t>
+        <w:t>ônibus no pátio interno do Terminal de Recife (TIP)</w:t>
       </w:r>
     </w:p>
     <w:p>
@@ -2921,7 +2934,7 @@
           <w:color w:val="000000"/>
           <w:lang w:val="pt-BR" w:eastAsia="pt-BR" w:bidi="pt-BR"/>
         </w:rPr>
-        <w:t xml:space="preserve"> – Falt</w:t>
+        <w:t xml:space="preserve"> – Falta de manutenção adequada na infra</w:t>
       </w:r>
       <w:r>
         <w:rPr>
@@ -2929,7 +2942,7 @@
           <w:color w:val="000000"/>
           <w:lang w:val="pt-BR" w:eastAsia="pt-BR" w:bidi="pt-BR"/>
         </w:rPr>
-        <w:t>a de manutenção adequada na infraestrutura do ponto de embarque e desembarque dos ônibus urbanos da RMR e na sinalização horizontal (faixa de pedestre) na entrada do Terminal de Recife (TIP), que se associa a duas Não Conformidades.</w:t>
+        <w:t>estrutura do ponto de embarque e desembarque dos ônibus urbanos da RMR e na sinalização horizontal (faixa de pedestre) na entrada do Terminal de Recife (TIP), que se associa a duas Não Conformidades.</w:t>
       </w:r>
     </w:p>
     <w:p>
@@ -2945,16 +2958,7 @@
           <w:color w:val="000000"/>
           <w:lang w:val="pt-BR" w:eastAsia="pt-BR" w:bidi="pt-BR"/>
         </w:rPr>
-        <w:t>Não Conformidade TIP 20</w:t>
-      </w:r>
-      <w:r>
-        <w:rPr>
-          <w:rFonts w:ascii="Arial" w:eastAsia="Arial" w:hAnsi="Arial"/>
-          <w:b/>
-          <w:color w:val="000000"/>
-          <w:lang w:val="pt-BR" w:eastAsia="pt-BR" w:bidi="pt-BR"/>
-        </w:rPr>
-        <w:t>25_06.1</w:t>
+        <w:t>Não Conformidade TIP 2025_06.1</w:t>
       </w:r>
       <w:r>
         <w:t xml:space="preserve"> – </w:t>
@@ -2965,7 +2969,15 @@
           <w:color w:val="000000"/>
           <w:lang w:val="pt-BR" w:eastAsia="pt-BR" w:bidi="pt-BR"/>
         </w:rPr>
-        <w:t>Parada de ônibus com pintura desgastada,</w:t>
+        <w:t>Parada de ônibus com pi</w:t>
+      </w:r>
+      <w:r>
+        <w:rPr>
+          <w:rFonts w:ascii="Arial" w:eastAsia="Arial" w:hAnsi="Arial"/>
+          <w:color w:val="000000"/>
+          <w:lang w:val="pt-BR" w:eastAsia="pt-BR" w:bidi="pt-BR"/>
+        </w:rPr>
+        <w:t>ntura desgastada,</w:t>
       </w:r>
     </w:p>
     <w:p>
@@ -3054,16 +3066,7 @@
           <w:color w:val="000000"/>
           <w:lang w:val="pt-BR" w:eastAsia="pt-BR" w:bidi="pt-BR"/>
         </w:rPr>
-        <w:t xml:space="preserve">Análise </w:t>
-      </w:r>
-      <w:r>
-        <w:rPr>
-          <w:rFonts w:ascii="Arial" w:eastAsia="Arial" w:hAnsi="Arial"/>
-          <w:b/>
-          <w:color w:val="000000"/>
-          <w:lang w:val="pt-BR" w:eastAsia="pt-BR" w:bidi="pt-BR"/>
-        </w:rPr>
-        <w:t xml:space="preserve">da ARPE: </w:t>
+        <w:t xml:space="preserve">Análise da ARPE: </w:t>
       </w:r>
       <w:r>
         <w:rPr>
@@ -3089,7 +3092,7 @@
         <w:pStyle w:val="Ttulo1"/>
         <w:spacing w:after="120"/>
       </w:pPr>
-      <w:bookmarkStart w:id="4" w:name="_Toc214919898"/>
+      <w:bookmarkStart w:id="4" w:name="_Toc214925620"/>
       <w:r>
         <w:rPr>
           <w:rFonts w:ascii="Arial" w:eastAsia="Arial" w:hAnsi="Arial"/>
@@ -3098,7 +3101,17 @@
           <w:sz w:val="24"/>
           <w:lang w:val="pt-BR" w:eastAsia="pt-BR" w:bidi="pt-BR"/>
         </w:rPr>
-        <w:t>4. RESUMO DA SITUAÇÃO DAS NÃO CONFORMIDADES MONITORADAS</w:t>
+        <w:t>4. RESUMO DA SITUA</w:t>
+      </w:r>
+      <w:r>
+        <w:rPr>
+          <w:rFonts w:ascii="Arial" w:eastAsia="Arial" w:hAnsi="Arial"/>
+          <w:caps/>
+          <w:color w:val="000000"/>
+          <w:sz w:val="24"/>
+          <w:lang w:val="pt-BR" w:eastAsia="pt-BR" w:bidi="pt-BR"/>
+        </w:rPr>
+        <w:t>ÇÃO DAS NÃO CONFORMIDADES MONITORADAS</w:t>
       </w:r>
       <w:bookmarkEnd w:id="4"/>
     </w:p>
@@ -3311,16 +3324,7 @@
                 <w:color w:val="000000"/>
                 <w:lang w:val="pt-BR" w:eastAsia="pt-BR" w:bidi="pt-BR"/>
               </w:rPr>
-              <w:t xml:space="preserve">CAR </w:t>
-            </w:r>
-            <w:r>
-              <w:rPr>
-                <w:rFonts w:ascii="Arial" w:eastAsia="Arial" w:hAnsi="Arial"/>
-                <w:b/>
-                <w:color w:val="000000"/>
-                <w:lang w:val="pt-BR" w:eastAsia="pt-BR" w:bidi="pt-BR"/>
-              </w:rPr>
-              <w:t>2025_01</w:t>
+              <w:t>CAR 2025_01</w:t>
             </w:r>
             <w:r>
               <w:rPr>
@@ -5268,7 +5272,7 @@
         <w:pStyle w:val="Ttulo1"/>
         <w:spacing w:after="120"/>
       </w:pPr>
-      <w:bookmarkStart w:id="5" w:name="_Toc214919899"/>
+      <w:bookmarkStart w:id="5" w:name="_Toc214925621"/>
       <w:r>
         <w:rPr>
           <w:rFonts w:ascii="Arial" w:eastAsia="Arial" w:hAnsi="Arial"/>
@@ -5312,7 +5316,7 @@
           <w:color w:val="000000"/>
           <w:lang w:val="pt-BR" w:eastAsia="pt-BR" w:bidi="pt-BR"/>
         </w:rPr>
-        <w:t>Recife, 24/11/2025.</w:t>
+        <w:t>Recife, 25/11/2025.</w:t>
       </w:r>
     </w:p>
     <w:p/>
@@ -5470,7 +5474,7 @@
         <w:shd w:val="clear" w:color="auto" w:fill="BFBFBF"/>
         <w:spacing w:after="120"/>
       </w:pPr>
-      <w:bookmarkStart w:id="6" w:name="_Toc214919900"/>
+      <w:bookmarkStart w:id="6" w:name="_Toc214925622"/>
       <w:r>
         <w:rPr>
           <w:rFonts w:ascii="Arial" w:eastAsia="Arial" w:hAnsi="Arial"/>
@@ -5516,7 +5520,7 @@
         <w:pStyle w:val="Ttulo2"/>
         <w:spacing w:after="120"/>
       </w:pPr>
-      <w:bookmarkStart w:id="7" w:name="_Toc214919901"/>
+      <w:bookmarkStart w:id="7" w:name="_Toc214925623"/>
       <w:r>
         <w:rPr>
           <w:rFonts w:ascii="Arial" w:eastAsia="Arial" w:hAnsi="Arial"/>
@@ -17222,7 +17226,7 @@
     <w:uiPriority w:val="99"/>
     <w:semiHidden/>
     <w:unhideWhenUsed/>
-    <w:rsid w:val="00CF3CB1"/>
+    <w:rsid w:val="004B5A15"/>
     <w:pPr>
       <w:spacing w:after="0" w:line="240" w:lineRule="auto"/>
     </w:pPr>
@@ -17238,7 +17242,7 @@
     <w:link w:val="Textodebalo"/>
     <w:uiPriority w:val="99"/>
     <w:semiHidden/>
-    <w:rsid w:val="00CF3CB1"/>
+    <w:rsid w:val="004B5A15"/>
     <w:rPr>
       <w:rFonts w:ascii="Tahoma" w:hAnsi="Tahoma" w:cs="Tahoma"/>
       <w:sz w:val="16"/>
@@ -17252,7 +17256,7 @@
     <w:autoRedefine/>
     <w:uiPriority w:val="39"/>
     <w:unhideWhenUsed/>
-    <w:rsid w:val="00CF3CB1"/>
+    <w:rsid w:val="004B5A15"/>
     <w:pPr>
       <w:spacing w:after="100"/>
     </w:pPr>
@@ -17264,7 +17268,7 @@
     <w:autoRedefine/>
     <w:uiPriority w:val="39"/>
     <w:unhideWhenUsed/>
-    <w:rsid w:val="00CF3CB1"/>
+    <w:rsid w:val="004B5A15"/>
     <w:pPr>
       <w:spacing w:after="100"/>
       <w:ind w:left="220"/>
@@ -17275,7 +17279,7 @@
     <w:basedOn w:val="Fontepargpadro"/>
     <w:uiPriority w:val="99"/>
     <w:unhideWhenUsed/>
-    <w:rsid w:val="00CF3CB1"/>
+    <w:rsid w:val="004B5A15"/>
     <w:rPr>
       <w:color w:val="0000FF" w:themeColor="hyperlink"/>
       <w:u w:val="single"/>
@@ -28441,7 +28445,7 @@
     <w:uiPriority w:val="99"/>
     <w:semiHidden/>
     <w:unhideWhenUsed/>
-    <w:rsid w:val="00CF3CB1"/>
+    <w:rsid w:val="004B5A15"/>
     <w:pPr>
       <w:spacing w:after="0" w:line="240" w:lineRule="auto"/>
     </w:pPr>
@@ -28457,7 +28461,7 @@
     <w:link w:val="Textodebalo"/>
     <w:uiPriority w:val="99"/>
     <w:semiHidden/>
-    <w:rsid w:val="00CF3CB1"/>
+    <w:rsid w:val="004B5A15"/>
     <w:rPr>
       <w:rFonts w:ascii="Tahoma" w:hAnsi="Tahoma" w:cs="Tahoma"/>
       <w:sz w:val="16"/>
@@ -28471,7 +28475,7 @@
     <w:autoRedefine/>
     <w:uiPriority w:val="39"/>
     <w:unhideWhenUsed/>
-    <w:rsid w:val="00CF3CB1"/>
+    <w:rsid w:val="004B5A15"/>
     <w:pPr>
       <w:spacing w:after="100"/>
     </w:pPr>
@@ -28483,7 +28487,7 @@
     <w:autoRedefine/>
     <w:uiPriority w:val="39"/>
     <w:unhideWhenUsed/>
-    <w:rsid w:val="00CF3CB1"/>
+    <w:rsid w:val="004B5A15"/>
     <w:pPr>
       <w:spacing w:after="100"/>
       <w:ind w:left="220"/>
@@ -28494,7 +28498,7 @@
     <w:basedOn w:val="Fontepargpadro"/>
     <w:uiPriority w:val="99"/>
     <w:unhideWhenUsed/>
-    <w:rsid w:val="00CF3CB1"/>
+    <w:rsid w:val="004B5A15"/>
     <w:rPr>
       <w:color w:val="0000FF" w:themeColor="hyperlink"/>
       <w:u w:val="single"/>
@@ -28828,7 +28832,7 @@
 </file>
 
 <file path=customXml/itemProps1.xml><?xml version="1.0" encoding="utf-8"?>
-<ds:datastoreItem xmlns:ds="http://schemas.openxmlformats.org/officeDocument/2006/customXml" ds:itemID="{C056BA9F-4B6E-47E2-9BDD-FD149781F3D4}">
+<ds:datastoreItem xmlns:ds="http://schemas.openxmlformats.org/officeDocument/2006/customXml" ds:itemID="{FF7CC280-831C-410A-B6DE-5C36F6816BEF}">
   <ds:schemaRefs>
     <ds:schemaRef ds:uri="http://schemas.openxmlformats.org/officeDocument/2006/bibliography"/>
   </ds:schemaRefs>

</xml_diff>

<commit_message>
fix: resolve problema de NCs não encontradas devido a filtro estrito de terminal
</commit_message>
<xml_diff>
--- a/src/reports/relatorio_1.docx
+++ b/src/reports/relatorio_1.docx
@@ -44,7 +44,7 @@
           <w:noProof/>
         </w:rPr>
         <w:drawing>
-          <wp:inline distT="0" distB="0" distL="0" distR="0" wp14:anchorId="00790EA0" wp14:editId="3F32BA9C">
+          <wp:inline distT="0" distB="0" distL="0" distR="0" wp14:anchorId="734BCBE1" wp14:editId="3DD969D4">
             <wp:extent cx="5943600" cy="5029200"/>
             <wp:effectExtent l="0" t="0" r="0" b="0"/>
             <wp:docPr id="1" name="Picture 1"/>
@@ -187,7 +187,7 @@
       <w:r>
         <w:fldChar w:fldCharType="separate"/>
       </w:r>
-      <w:hyperlink w:anchor="_Toc214951427" w:history="1">
+      <w:hyperlink w:anchor="_Toc214961113" w:history="1">
         <w:r>
           <w:rPr>
             <w:rStyle w:val="Hyperlink"/>
@@ -217,7 +217,7 @@
             <w:noProof/>
             <w:webHidden/>
           </w:rPr>
-          <w:instrText xml:space="preserve"> PAGEREF _Toc214951427 \h </w:instrText>
+          <w:instrText xml:space="preserve"> PAGEREF _Toc214961113 \h </w:instrText>
         </w:r>
         <w:r>
           <w:rPr>
@@ -258,7 +258,7 @@
           <w:noProof/>
         </w:rPr>
       </w:pPr>
-      <w:hyperlink w:anchor="_Toc214951428" w:history="1">
+      <w:hyperlink w:anchor="_Toc214961114" w:history="1">
         <w:r>
           <w:rPr>
             <w:rStyle w:val="Hyperlink"/>
@@ -288,7 +288,7 @@
             <w:noProof/>
             <w:webHidden/>
           </w:rPr>
-          <w:instrText xml:space="preserve"> PAGEREF _Toc214951428 \h </w:instrText>
+          <w:instrText xml:space="preserve"> PAGEREF _Toc214961114 \h </w:instrText>
         </w:r>
         <w:r>
           <w:rPr>
@@ -329,7 +329,7 @@
           <w:noProof/>
         </w:rPr>
       </w:pPr>
-      <w:hyperlink w:anchor="_Toc214951429" w:history="1">
+      <w:hyperlink w:anchor="_Toc214961115" w:history="1">
         <w:r>
           <w:rPr>
             <w:rStyle w:val="Hyperlink"/>
@@ -359,7 +359,7 @@
             <w:noProof/>
             <w:webHidden/>
           </w:rPr>
-          <w:instrText xml:space="preserve"> PAGEREF _Toc214951429 \h </w:instrText>
+          <w:instrText xml:space="preserve"> PAGEREF _Toc214961115 \h </w:instrText>
         </w:r>
         <w:r>
           <w:rPr>
@@ -400,7 +400,7 @@
           <w:noProof/>
         </w:rPr>
       </w:pPr>
-      <w:hyperlink w:anchor="_Toc214951430" w:history="1">
+      <w:hyperlink w:anchor="_Toc214961116" w:history="1">
         <w:r>
           <w:rPr>
             <w:rStyle w:val="Hyperlink"/>
@@ -430,7 +430,7 @@
             <w:noProof/>
             <w:webHidden/>
           </w:rPr>
-          <w:instrText xml:space="preserve"> PAGEREF _Toc214951430 \h </w:instrText>
+          <w:instrText xml:space="preserve"> PAGEREF _Toc214961116 \h </w:instrText>
         </w:r>
         <w:r>
           <w:rPr>
@@ -450,7 +450,7 @@
             <w:noProof/>
             <w:webHidden/>
           </w:rPr>
-          <w:t>7</w:t>
+          <w:t>6</w:t>
         </w:r>
         <w:r>
           <w:rPr>
@@ -471,7 +471,7 @@
           <w:noProof/>
         </w:rPr>
       </w:pPr>
-      <w:hyperlink w:anchor="_Toc214951431" w:history="1">
+      <w:hyperlink w:anchor="_Toc214961117" w:history="1">
         <w:r>
           <w:rPr>
             <w:rStyle w:val="Hyperlink"/>
@@ -501,7 +501,7 @@
             <w:noProof/>
             <w:webHidden/>
           </w:rPr>
-          <w:instrText xml:space="preserve"> PAGEREF _Toc214951431 \h </w:instrText>
+          <w:instrText xml:space="preserve"> PAGEREF _Toc214961117 \h </w:instrText>
         </w:r>
         <w:r>
           <w:rPr>
@@ -542,7 +542,7 @@
           <w:noProof/>
         </w:rPr>
       </w:pPr>
-      <w:hyperlink w:anchor="_Toc214951432" w:history="1">
+      <w:hyperlink w:anchor="_Toc214961118" w:history="1">
         <w:r>
           <w:rPr>
             <w:rStyle w:val="Hyperlink"/>
@@ -572,7 +572,7 @@
             <w:noProof/>
             <w:webHidden/>
           </w:rPr>
-          <w:instrText xml:space="preserve"> PAGEREF _Toc214951432 \h </w:instrText>
+          <w:instrText xml:space="preserve"> PAGEREF _Toc214961118 \h </w:instrText>
         </w:r>
         <w:r>
           <w:rPr>
@@ -613,7 +613,7 @@
           <w:noProof/>
         </w:rPr>
       </w:pPr>
-      <w:hyperlink w:anchor="_Toc214951433" w:history="1">
+      <w:hyperlink w:anchor="_Toc214961119" w:history="1">
         <w:r>
           <w:rPr>
             <w:rStyle w:val="Hyperlink"/>
@@ -643,7 +643,7 @@
             <w:noProof/>
             <w:webHidden/>
           </w:rPr>
-          <w:instrText xml:space="preserve"> PAGEREF _Toc214951433 \h </w:instrText>
+          <w:instrText xml:space="preserve"> PAGEREF _Toc214961119 \h </w:instrText>
         </w:r>
         <w:r>
           <w:rPr>
@@ -694,7 +694,7 @@
         <w:pStyle w:val="Ttulo1"/>
         <w:spacing w:after="120"/>
       </w:pPr>
-      <w:bookmarkStart w:id="0" w:name="_Toc214951427"/>
+      <w:bookmarkStart w:id="0" w:name="_Toc214961113"/>
       <w:r>
         <w:rPr>
           <w:rFonts w:ascii="Arial" w:eastAsia="Arial" w:hAnsi="Arial"/>
@@ -767,7 +767,7 @@
         <w:pStyle w:val="Ttulo1"/>
         <w:spacing w:after="120"/>
       </w:pPr>
-      <w:bookmarkStart w:id="1" w:name="_Toc214951428"/>
+      <w:bookmarkStart w:id="1" w:name="_Toc214961114"/>
       <w:r>
         <w:rPr>
           <w:rFonts w:ascii="Arial" w:eastAsia="Arial" w:hAnsi="Arial"/>
@@ -798,7 +798,7 @@
         <w:pStyle w:val="Ttulo1"/>
         <w:spacing w:after="120"/>
       </w:pPr>
-      <w:bookmarkStart w:id="2" w:name="_Toc214951429"/>
+      <w:bookmarkStart w:id="2" w:name="_Toc214961115"/>
       <w:r>
         <w:rPr>
           <w:rFonts w:ascii="Arial" w:eastAsia="Arial" w:hAnsi="Arial"/>
@@ -859,7 +859,7 @@
           <w:color w:val="000000"/>
           <w:lang w:val="pt-BR" w:eastAsia="pt-BR" w:bidi="pt-BR"/>
         </w:rPr>
-        <w:t xml:space="preserve">  Área precisando de capinação no pátio de manobras do Terminal de Caruaru</w:t>
+        <w:t xml:space="preserve"> - Área precisando de capinação no pátio de manobras do Terminal de Caruaru</w:t>
       </w:r>
     </w:p>
     <w:p>
@@ -905,7 +905,7 @@
           <w:color w:val="000000"/>
           <w:lang w:val="pt-BR" w:eastAsia="pt-BR" w:bidi="pt-BR"/>
         </w:rPr>
-        <w:t>Área precisando de capinação no pátio de manobras</w:t>
+        <w:t>N/A</w:t>
       </w:r>
     </w:p>
     <w:p>
@@ -956,7 +956,7 @@
           <w:color w:val="000000"/>
           <w:lang w:val="pt-BR" w:eastAsia="pt-BR" w:bidi="pt-BR"/>
         </w:rPr>
-        <w:t xml:space="preserve">  Área precisando de capinação no terreno lateral do Terminal de Caruaru</w:t>
+        <w:t xml:space="preserve"> - Área precisando de capinação no terreno lateral do Terminal de Caruaru</w:t>
       </w:r>
     </w:p>
     <w:p>
@@ -1003,7 +1003,7 @@
           <w:color w:val="000000"/>
           <w:lang w:val="pt-BR" w:eastAsia="pt-BR" w:bidi="pt-BR"/>
         </w:rPr>
-        <w:t>Área precisando de capinação no terreno lateral do Terminal</w:t>
+        <w:t>N/A</w:t>
       </w:r>
     </w:p>
     <w:p>
@@ -1054,7 +1054,7 @@
           <w:color w:val="000000"/>
           <w:lang w:val="pt-BR" w:eastAsia="pt-BR" w:bidi="pt-BR"/>
         </w:rPr>
-        <w:t xml:space="preserve">  Área com infiltração na fachada lateral do Terminal de Caruaru</w:t>
+        <w:t xml:space="preserve"> - Área com infiltração na fachada lateral do Terminal de Caruaru</w:t>
       </w:r>
     </w:p>
     <w:p>
@@ -1100,7 +1100,7 @@
           <w:color w:val="000000"/>
           <w:lang w:val="pt-BR" w:eastAsia="pt-BR" w:bidi="pt-BR"/>
         </w:rPr>
-        <w:t>Área com infiltração na fachada lateral do Terminal</w:t>
+        <w:t>N/A</w:t>
       </w:r>
     </w:p>
     <w:p>
@@ -1151,7 +1151,7 @@
           <w:color w:val="000000"/>
           <w:lang w:val="pt-BR" w:eastAsia="pt-BR" w:bidi="pt-BR"/>
         </w:rPr>
-        <w:t xml:space="preserve">  Pintura desgastada no muro e na grade do pátio de manobra no Terminal de Caruaru</w:t>
+        <w:t xml:space="preserve"> - Pintura desgastada no muro e na grade do pátio de manobra no Terminal de Caruaru</w:t>
       </w:r>
     </w:p>
     <w:p>
@@ -1197,7 +1197,7 @@
           <w:color w:val="000000"/>
           <w:lang w:val="pt-BR" w:eastAsia="pt-BR" w:bidi="pt-BR"/>
         </w:rPr>
-        <w:t>Pintura desgastada no muro e na grade do pátio de manobra no Terminal</w:t>
+        <w:t>N/A</w:t>
       </w:r>
     </w:p>
     <w:p>
@@ -1240,15 +1240,15 @@
           <w:u w:val="single"/>
           <w:lang w:val="pt-BR" w:eastAsia="pt-BR" w:bidi="pt-BR"/>
         </w:rPr>
-        <w:t>Não Conformidade CAR 2025_07</w:t>
-      </w:r>
-      <w:r>
-        <w:rPr>
-          <w:rFonts w:ascii="Arial" w:eastAsia="Arial" w:hAnsi="Arial"/>
-          <w:color w:val="000000"/>
-          <w:lang w:val="pt-BR" w:eastAsia="pt-BR" w:bidi="pt-BR"/>
-        </w:rPr>
-        <w:t xml:space="preserve">  Pintura desgastada no muro lateral no Terminal de Caruaru</w:t>
+        <w:t>Não Conformidade CAR 2025_08</w:t>
+      </w:r>
+      <w:r>
+        <w:rPr>
+          <w:rFonts w:ascii="Arial" w:eastAsia="Arial" w:hAnsi="Arial"/>
+          <w:color w:val="000000"/>
+          <w:lang w:val="pt-BR" w:eastAsia="pt-BR" w:bidi="pt-BR"/>
+        </w:rPr>
+        <w:t xml:space="preserve"> - Vidraças na parte administrativa precisando de limpeza no Terminal de Caruaru</w:t>
       </w:r>
     </w:p>
     <w:p>
@@ -1294,7 +1294,7 @@
           <w:color w:val="000000"/>
           <w:lang w:val="pt-BR" w:eastAsia="pt-BR" w:bidi="pt-BR"/>
         </w:rPr>
-        <w:t>Pintura desgastada no muro lateral no Terminal</w:t>
+        <w:t>N/A</w:t>
       </w:r>
     </w:p>
     <w:p>
@@ -1337,15 +1337,15 @@
           <w:u w:val="single"/>
           <w:lang w:val="pt-BR" w:eastAsia="pt-BR" w:bidi="pt-BR"/>
         </w:rPr>
-        <w:t>Não Conformidade CAR 2025_08</w:t>
-      </w:r>
-      <w:r>
-        <w:rPr>
-          <w:rFonts w:ascii="Arial" w:eastAsia="Arial" w:hAnsi="Arial"/>
-          <w:color w:val="000000"/>
-          <w:lang w:val="pt-BR" w:eastAsia="pt-BR" w:bidi="pt-BR"/>
-        </w:rPr>
-        <w:t xml:space="preserve">  Vidraças na parte administrativa precisando de limpeza no Terminal de Caruaru</w:t>
+        <w:t>Não Conformidade CAR 2025_09</w:t>
+      </w:r>
+      <w:r>
+        <w:rPr>
+          <w:rFonts w:ascii="Arial" w:eastAsia="Arial" w:hAnsi="Arial"/>
+          <w:color w:val="000000"/>
+          <w:lang w:val="pt-BR" w:eastAsia="pt-BR" w:bidi="pt-BR"/>
+        </w:rPr>
+        <w:t xml:space="preserve"> - Meio-fio desgastado na entrada do Terminal de Caruaru</w:t>
       </w:r>
     </w:p>
     <w:p>
@@ -1391,7 +1391,7 @@
           <w:color w:val="000000"/>
           <w:lang w:val="pt-BR" w:eastAsia="pt-BR" w:bidi="pt-BR"/>
         </w:rPr>
-        <w:t>Vidraças na parte administrativa precisando de limpeza</w:t>
+        <w:t>N/A</w:t>
       </w:r>
     </w:p>
     <w:p>
@@ -1434,23 +1434,15 @@
           <w:u w:val="single"/>
           <w:lang w:val="pt-BR" w:eastAsia="pt-BR" w:bidi="pt-BR"/>
         </w:rPr>
-        <w:t>Não Conformidade CAR 2025_09</w:t>
-      </w:r>
-      <w:r>
-        <w:rPr>
-          <w:rFonts w:ascii="Arial" w:eastAsia="Arial" w:hAnsi="Arial"/>
-          <w:color w:val="000000"/>
-          <w:lang w:val="pt-BR" w:eastAsia="pt-BR" w:bidi="pt-BR"/>
-        </w:rPr>
-        <w:t xml:space="preserve">  </w:t>
-      </w:r>
-      <w:r>
-        <w:rPr>
-          <w:rFonts w:ascii="Arial" w:eastAsia="Arial" w:hAnsi="Arial"/>
-          <w:color w:val="000000"/>
-          <w:lang w:val="pt-BR" w:eastAsia="pt-BR" w:bidi="pt-BR"/>
-        </w:rPr>
-        <w:t>Meio-fio desgastado na entrada do Terminal de Caruaru</w:t>
+        <w:t>Não Conformidade CAR 2025_10</w:t>
+      </w:r>
+      <w:r>
+        <w:rPr>
+          <w:rFonts w:ascii="Arial" w:eastAsia="Arial" w:hAnsi="Arial"/>
+          <w:color w:val="000000"/>
+          <w:lang w:val="pt-BR" w:eastAsia="pt-BR" w:bidi="pt-BR"/>
+        </w:rPr>
+        <w:t xml:space="preserve"> - Rampa para PCD desgastada no Terminal de Caruaru</w:t>
       </w:r>
     </w:p>
     <w:p>
@@ -1496,7 +1488,7 @@
           <w:color w:val="000000"/>
           <w:lang w:val="pt-BR" w:eastAsia="pt-BR" w:bidi="pt-BR"/>
         </w:rPr>
-        <w:t>Meio-fio desgastado na entrada do Terminal</w:t>
+        <w:t>N/A</w:t>
       </w:r>
     </w:p>
     <w:p>
@@ -1539,23 +1531,15 @@
           <w:u w:val="single"/>
           <w:lang w:val="pt-BR" w:eastAsia="pt-BR" w:bidi="pt-BR"/>
         </w:rPr>
-        <w:t>Não Conformidade CAR 2025_10</w:t>
-      </w:r>
-      <w:r>
-        <w:rPr>
-          <w:rFonts w:ascii="Arial" w:eastAsia="Arial" w:hAnsi="Arial"/>
-          <w:color w:val="000000"/>
-          <w:lang w:val="pt-BR" w:eastAsia="pt-BR" w:bidi="pt-BR"/>
-        </w:rPr>
-        <w:t xml:space="preserve">  </w:t>
-      </w:r>
-      <w:r>
-        <w:rPr>
-          <w:rFonts w:ascii="Arial" w:eastAsia="Arial" w:hAnsi="Arial"/>
-          <w:color w:val="000000"/>
-          <w:lang w:val="pt-BR" w:eastAsia="pt-BR" w:bidi="pt-BR"/>
-        </w:rPr>
-        <w:t>Rampa para PCD desgastada no Terminal de Caruaru</w:t>
+        <w:t>Não Conformidade CAR 2025_11</w:t>
+      </w:r>
+      <w:r>
+        <w:rPr>
+          <w:rFonts w:ascii="Arial" w:eastAsia="Arial" w:hAnsi="Arial"/>
+          <w:color w:val="000000"/>
+          <w:lang w:val="pt-BR" w:eastAsia="pt-BR" w:bidi="pt-BR"/>
+        </w:rPr>
+        <w:t xml:space="preserve"> - Desgaste do pavimento na rampa de carga e descarga na entrada do Terminal de Caruaru</w:t>
       </w:r>
     </w:p>
     <w:p>
@@ -1601,7 +1585,7 @@
           <w:color w:val="000000"/>
           <w:lang w:val="pt-BR" w:eastAsia="pt-BR" w:bidi="pt-BR"/>
         </w:rPr>
-        <w:t>Rampa para PCD desgastada no Terminal</w:t>
+        <w:t>N/A</w:t>
       </w:r>
     </w:p>
     <w:p>
@@ -1634,30 +1618,45 @@
     </w:p>
     <w:p>
       <w:pPr>
-        <w:jc w:val="lowKashida"/>
+        <w:spacing w:before="240"/>
       </w:pPr>
       <w:r>
         <w:rPr>
           <w:rFonts w:ascii="Arial" w:eastAsia="Arial" w:hAnsi="Arial"/>
           <w:b/>
           <w:color w:val="000000"/>
-          <w:u w:val="single"/>
+          <w:sz w:val="24"/>
           <w:lang w:val="pt-BR" w:eastAsia="pt-BR" w:bidi="pt-BR"/>
         </w:rPr>
         <w:lastRenderedPageBreak/>
-        <w:t>Não Conformidade CAR 2025_11</w:t>
-      </w:r>
-      <w:r>
-        <w:rPr>
-          <w:rFonts w:ascii="Arial" w:eastAsia="Arial" w:hAnsi="Arial"/>
-          <w:color w:val="000000"/>
-          <w:lang w:val="pt-BR" w:eastAsia="pt-BR" w:bidi="pt-BR"/>
-        </w:rPr>
-        <w:t xml:space="preserve">  Desgaste do pavimento na rampa de carga e descarga na entrada do Terminal de Caruaru</w:t>
+        <w:t>3.2 - TERMINAL DE GARANHUNS (GAR)</w:t>
       </w:r>
     </w:p>
     <w:p>
       <w:pPr>
+        <w:jc w:val="lowKashida"/>
+      </w:pPr>
+      <w:r>
+        <w:rPr>
+          <w:rFonts w:ascii="Arial" w:eastAsia="Arial" w:hAnsi="Arial"/>
+          <w:b/>
+          <w:color w:val="000000"/>
+          <w:u w:val="single"/>
+          <w:lang w:val="pt-BR" w:eastAsia="pt-BR" w:bidi="pt-BR"/>
+        </w:rPr>
+        <w:t>Não Conformidade GAR 2025_07</w:t>
+      </w:r>
+      <w:r>
+        <w:rPr>
+          <w:rFonts w:ascii="Arial" w:eastAsia="Arial" w:hAnsi="Arial"/>
+          <w:color w:val="000000"/>
+          <w:lang w:val="pt-BR" w:eastAsia="pt-BR" w:bidi="pt-BR"/>
+        </w:rPr>
+        <w:t xml:space="preserve"> - Pintura desgastada no muro da lateral do Terminal de Garanhuns</w:t>
+      </w:r>
+    </w:p>
+    <w:p>
+      <w:pPr>
         <w:spacing w:after="0" w:line="260" w:lineRule="exact"/>
         <w:jc w:val="lowKashida"/>
       </w:pPr>
@@ -1699,7 +1698,7 @@
           <w:color w:val="000000"/>
           <w:lang w:val="pt-BR" w:eastAsia="pt-BR" w:bidi="pt-BR"/>
         </w:rPr>
-        <w:t>Desgaste do pavimento na rampa de carga e descarga na entrada do Terminal</w:t>
+        <w:t>N/A</w:t>
       </w:r>
     </w:p>
     <w:p>
@@ -1732,21 +1731,30 @@
     </w:p>
     <w:p>
       <w:pPr>
-        <w:spacing w:before="240"/>
+        <w:jc w:val="lowKashida"/>
       </w:pPr>
       <w:r>
         <w:rPr>
           <w:rFonts w:ascii="Arial" w:eastAsia="Arial" w:hAnsi="Arial"/>
           <w:b/>
           <w:color w:val="000000"/>
-          <w:sz w:val="24"/>
-          <w:lang w:val="pt-BR" w:eastAsia="pt-BR" w:bidi="pt-BR"/>
-        </w:rPr>
-        <w:t>3.2 - TERMINAL DE GARANHUNS (GAR)</w:t>
+          <w:u w:val="single"/>
+          <w:lang w:val="pt-BR" w:eastAsia="pt-BR" w:bidi="pt-BR"/>
+        </w:rPr>
+        <w:t>Não Conformidade GAR 2025_09</w:t>
+      </w:r>
+      <w:r>
+        <w:rPr>
+          <w:rFonts w:ascii="Arial" w:eastAsia="Arial" w:hAnsi="Arial"/>
+          <w:color w:val="000000"/>
+          <w:lang w:val="pt-BR" w:eastAsia="pt-BR" w:bidi="pt-BR"/>
+        </w:rPr>
+        <w:t xml:space="preserve"> - Pintura desgastada das colunas da entrada do Terminal de Garanhuns</w:t>
       </w:r>
     </w:p>
     <w:p>
       <w:pPr>
+        <w:spacing w:after="0" w:line="260" w:lineRule="exact"/>
         <w:jc w:val="lowKashida"/>
       </w:pPr>
       <w:r>
@@ -1754,18 +1762,17 @@
           <w:rFonts w:ascii="Arial" w:eastAsia="Arial" w:hAnsi="Arial"/>
           <w:b/>
           <w:color w:val="000000"/>
-          <w:u w:val="single"/>
-          <w:lang w:val="pt-BR" w:eastAsia="pt-BR" w:bidi="pt-BR"/>
-        </w:rPr>
-        <w:t>Não Conformidade GAR 2025_07</w:t>
-      </w:r>
-      <w:r>
-        <w:rPr>
-          <w:rFonts w:ascii="Arial" w:eastAsia="Arial" w:hAnsi="Arial"/>
-          <w:color w:val="000000"/>
-          <w:lang w:val="pt-BR" w:eastAsia="pt-BR" w:bidi="pt-BR"/>
-        </w:rPr>
-        <w:t xml:space="preserve">  Pintura desgastada no muro da lateral do Terminal de Garanhuns</w:t>
+          <w:lang w:val="pt-BR" w:eastAsia="pt-BR" w:bidi="pt-BR"/>
+        </w:rPr>
+        <w:t xml:space="preserve">Informação da SOCICAM: </w:t>
+      </w:r>
+      <w:r>
+        <w:rPr>
+          <w:rFonts w:ascii="Arial" w:eastAsia="Arial" w:hAnsi="Arial"/>
+          <w:color w:val="000000"/>
+          <w:lang w:val="pt-BR" w:eastAsia="pt-BR" w:bidi="pt-BR"/>
+        </w:rPr>
+        <w:t>N/A</w:t>
       </w:r>
     </w:p>
     <w:p>
@@ -1780,7 +1787,7 @@
           <w:color w:val="000000"/>
           <w:lang w:val="pt-BR" w:eastAsia="pt-BR" w:bidi="pt-BR"/>
         </w:rPr>
-        <w:t xml:space="preserve">Informação da SOCICAM: </w:t>
+        <w:t xml:space="preserve">Constatação: </w:t>
       </w:r>
       <w:r>
         <w:rPr>
@@ -1803,19 +1810,47 @@
           <w:color w:val="000000"/>
           <w:lang w:val="pt-BR" w:eastAsia="pt-BR" w:bidi="pt-BR"/>
         </w:rPr>
-        <w:t xml:space="preserve">Constatação: </w:t>
-      </w:r>
-      <w:r>
-        <w:rPr>
-          <w:rFonts w:ascii="Arial" w:eastAsia="Arial" w:hAnsi="Arial"/>
-          <w:color w:val="000000"/>
-          <w:lang w:val="pt-BR" w:eastAsia="pt-BR" w:bidi="pt-BR"/>
-        </w:rPr>
-        <w:t>"Pintura desgastada no muro da lateral do Terminal</w:t>
+        <w:t xml:space="preserve">Análise da ARPE: </w:t>
+      </w:r>
+      <w:r>
+        <w:rPr>
+          <w:rFonts w:ascii="Arial" w:eastAsia="Arial" w:hAnsi="Arial"/>
+          <w:color w:val="000000"/>
+          <w:lang w:val="pt-BR" w:eastAsia="pt-BR" w:bidi="pt-BR"/>
+        </w:rPr>
+        <w:t>N/A</w:t>
       </w:r>
     </w:p>
     <w:p>
       <w:pPr>
+        <w:spacing w:after="240"/>
+      </w:pPr>
+    </w:p>
+    <w:p>
+      <w:pPr>
+        <w:jc w:val="lowKashida"/>
+      </w:pPr>
+      <w:r>
+        <w:rPr>
+          <w:rFonts w:ascii="Arial" w:eastAsia="Arial" w:hAnsi="Arial"/>
+          <w:b/>
+          <w:color w:val="000000"/>
+          <w:u w:val="single"/>
+          <w:lang w:val="pt-BR" w:eastAsia="pt-BR" w:bidi="pt-BR"/>
+        </w:rPr>
+        <w:t>Não Conformidade GAR 2025_10</w:t>
+      </w:r>
+      <w:r>
+        <w:rPr>
+          <w:rFonts w:ascii="Arial" w:eastAsia="Arial" w:hAnsi="Arial"/>
+          <w:color w:val="000000"/>
+          <w:lang w:val="pt-BR" w:eastAsia="pt-BR" w:bidi="pt-BR"/>
+        </w:rPr>
+        <w:t xml:space="preserve"> - Pintura desgastada nas colunas da fachada do lado do pátio de manobras no Terminal de Garanhuns</w:t>
+      </w:r>
+    </w:p>
+    <w:p>
+      <w:pPr>
         <w:spacing w:after="0" w:line="260" w:lineRule="exact"/>
         <w:jc w:val="lowKashida"/>
       </w:pPr>
@@ -1826,7 +1861,7 @@
           <w:color w:val="000000"/>
           <w:lang w:val="pt-BR" w:eastAsia="pt-BR" w:bidi="pt-BR"/>
         </w:rPr>
-        <w:t xml:space="preserve">Análise da ARPE: </w:t>
+        <w:t xml:space="preserve">Informação da SOCICAM: </w:t>
       </w:r>
       <w:r>
         <w:rPr>
@@ -1839,11 +1874,30 @@
     </w:p>
     <w:p>
       <w:pPr>
-        <w:spacing w:after="240"/>
-      </w:pPr>
+        <w:spacing w:after="0" w:line="260" w:lineRule="exact"/>
+        <w:jc w:val="lowKashida"/>
+      </w:pPr>
+      <w:r>
+        <w:rPr>
+          <w:rFonts w:ascii="Arial" w:eastAsia="Arial" w:hAnsi="Arial"/>
+          <w:b/>
+          <w:color w:val="000000"/>
+          <w:lang w:val="pt-BR" w:eastAsia="pt-BR" w:bidi="pt-BR"/>
+        </w:rPr>
+        <w:t xml:space="preserve">Constatação: </w:t>
+      </w:r>
+      <w:r>
+        <w:rPr>
+          <w:rFonts w:ascii="Arial" w:eastAsia="Arial" w:hAnsi="Arial"/>
+          <w:color w:val="000000"/>
+          <w:lang w:val="pt-BR" w:eastAsia="pt-BR" w:bidi="pt-BR"/>
+        </w:rPr>
+        <w:t>N/A</w:t>
+      </w:r>
     </w:p>
     <w:p>
       <w:pPr>
+        <w:spacing w:after="0" w:line="260" w:lineRule="exact"/>
         <w:jc w:val="lowKashida"/>
       </w:pPr>
       <w:r>
@@ -1851,22 +1905,49 @@
           <w:rFonts w:ascii="Arial" w:eastAsia="Arial" w:hAnsi="Arial"/>
           <w:b/>
           <w:color w:val="000000"/>
-          <w:u w:val="single"/>
-          <w:lang w:val="pt-BR" w:eastAsia="pt-BR" w:bidi="pt-BR"/>
-        </w:rPr>
-        <w:t>Não Conformidade GAR 2025_08</w:t>
-      </w:r>
-      <w:r>
-        <w:rPr>
-          <w:rFonts w:ascii="Arial" w:eastAsia="Arial" w:hAnsi="Arial"/>
-          <w:color w:val="000000"/>
-          <w:lang w:val="pt-BR" w:eastAsia="pt-BR" w:bidi="pt-BR"/>
-        </w:rPr>
-        <w:t xml:space="preserve">  Pintura desgastada do muro do pátio de manobras no Terminal de Garanhuns</w:t>
+          <w:lang w:val="pt-BR" w:eastAsia="pt-BR" w:bidi="pt-BR"/>
+        </w:rPr>
+        <w:t xml:space="preserve">Análise da ARPE: </w:t>
+      </w:r>
+      <w:r>
+        <w:rPr>
+          <w:rFonts w:ascii="Arial" w:eastAsia="Arial" w:hAnsi="Arial"/>
+          <w:color w:val="000000"/>
+          <w:lang w:val="pt-BR" w:eastAsia="pt-BR" w:bidi="pt-BR"/>
+        </w:rPr>
+        <w:t>N/A</w:t>
       </w:r>
     </w:p>
     <w:p>
       <w:pPr>
+        <w:spacing w:after="240"/>
+      </w:pPr>
+    </w:p>
+    <w:p>
+      <w:pPr>
+        <w:jc w:val="lowKashida"/>
+      </w:pPr>
+      <w:r>
+        <w:rPr>
+          <w:rFonts w:ascii="Arial" w:eastAsia="Arial" w:hAnsi="Arial"/>
+          <w:b/>
+          <w:color w:val="000000"/>
+          <w:u w:val="single"/>
+          <w:lang w:val="pt-BR" w:eastAsia="pt-BR" w:bidi="pt-BR"/>
+        </w:rPr>
+        <w:t>Não Conformidade GAR 2025_11</w:t>
+      </w:r>
+      <w:r>
+        <w:rPr>
+          <w:rFonts w:ascii="Arial" w:eastAsia="Arial" w:hAnsi="Arial"/>
+          <w:color w:val="000000"/>
+          <w:lang w:val="pt-BR" w:eastAsia="pt-BR" w:bidi="pt-BR"/>
+        </w:rPr>
+        <w:t xml:space="preserve"> - Pintura desgastada na parede lateral direita no Terminal de Garanhuns</w:t>
+      </w:r>
+    </w:p>
+    <w:p>
+      <w:pPr>
         <w:spacing w:after="0" w:line="260" w:lineRule="exact"/>
         <w:jc w:val="lowKashida"/>
       </w:pPr>
@@ -1908,7 +1989,7 @@
           <w:color w:val="000000"/>
           <w:lang w:val="pt-BR" w:eastAsia="pt-BR" w:bidi="pt-BR"/>
         </w:rPr>
-        <w:t>Pintura desgastada do muro do pátio de manobras no Terminal</w:t>
+        <w:t>N/A</w:t>
       </w:r>
     </w:p>
     <w:p>
@@ -1941,37 +2022,52 @@
     </w:p>
     <w:p>
       <w:pPr>
-        <w:jc w:val="lowKashida"/>
+        <w:spacing w:before="240"/>
       </w:pPr>
       <w:r>
         <w:rPr>
           <w:rFonts w:ascii="Arial" w:eastAsia="Arial" w:hAnsi="Arial"/>
           <w:b/>
           <w:color w:val="000000"/>
-          <w:u w:val="single"/>
-          <w:lang w:val="pt-BR" w:eastAsia="pt-BR" w:bidi="pt-BR"/>
-        </w:rPr>
-        <w:t>Não Conformidade GAR 2025_09</w:t>
-      </w:r>
-      <w:r>
-        <w:rPr>
-          <w:rFonts w:ascii="Arial" w:eastAsia="Arial" w:hAnsi="Arial"/>
-          <w:color w:val="000000"/>
-          <w:lang w:val="pt-BR" w:eastAsia="pt-BR" w:bidi="pt-BR"/>
-        </w:rPr>
-        <w:t xml:space="preserve">  </w:t>
-      </w:r>
-      <w:r>
-        <w:rPr>
-          <w:rFonts w:ascii="Arial" w:eastAsia="Arial" w:hAnsi="Arial"/>
-          <w:color w:val="000000"/>
-          <w:lang w:val="pt-BR" w:eastAsia="pt-BR" w:bidi="pt-BR"/>
-        </w:rPr>
-        <w:t>Pintura desgastada das colunas da entrada do Terminal de Garanhuns</w:t>
+          <w:sz w:val="24"/>
+          <w:lang w:val="pt-BR" w:eastAsia="pt-BR" w:bidi="pt-BR"/>
+        </w:rPr>
+        <w:t>3.3 - TERMINAL DE RECIFE (TIP)</w:t>
       </w:r>
     </w:p>
     <w:p>
       <w:pPr>
+        <w:jc w:val="lowKashida"/>
+      </w:pPr>
+      <w:r>
+        <w:rPr>
+          <w:rFonts w:ascii="Arial" w:eastAsia="Arial" w:hAnsi="Arial"/>
+          <w:b/>
+          <w:color w:val="000000"/>
+          <w:u w:val="single"/>
+          <w:lang w:val="pt-BR" w:eastAsia="pt-BR" w:bidi="pt-BR"/>
+        </w:rPr>
+        <w:t>Não Conformidade TIP 2025_01</w:t>
+      </w:r>
+      <w:r>
+        <w:rPr>
+          <w:rFonts w:ascii="Arial" w:eastAsia="Arial" w:hAnsi="Arial"/>
+          <w:color w:val="000000"/>
+          <w:lang w:val="pt-BR" w:eastAsia="pt-BR" w:bidi="pt-BR"/>
+        </w:rPr>
+        <w:t xml:space="preserve"> - </w:t>
+      </w:r>
+      <w:r>
+        <w:rPr>
+          <w:rFonts w:ascii="Arial" w:eastAsia="Arial" w:hAnsi="Arial"/>
+          <w:color w:val="000000"/>
+          <w:lang w:val="pt-BR" w:eastAsia="pt-BR" w:bidi="pt-BR"/>
+        </w:rPr>
+        <w:t>Infiltração em coluna de sustentação da estrutura metálica da área de embarque e desembarque do Terminal de Recife (TIP)</w:t>
+      </w:r>
+    </w:p>
+    <w:p>
+      <w:pPr>
         <w:spacing w:after="0" w:line="260" w:lineRule="exact"/>
         <w:jc w:val="lowKashida"/>
       </w:pPr>
@@ -1990,7 +2086,7 @@
           <w:color w:val="000000"/>
           <w:lang w:val="pt-BR" w:eastAsia="pt-BR" w:bidi="pt-BR"/>
         </w:rPr>
-        <w:t>N/A</w:t>
+        <w:t>A SOCICAM informou que o serviço estava em andamento com a equipe interna de manutenção, com previsão de conclusão em setembro de 2025 (Carta SAP/PER/ARPE N° 002/2025).</w:t>
       </w:r>
     </w:p>
     <w:p>
@@ -2013,7 +2109,7 @@
           <w:color w:val="000000"/>
           <w:lang w:val="pt-BR" w:eastAsia="pt-BR" w:bidi="pt-BR"/>
         </w:rPr>
-        <w:t>Pintura desgastada das colunas da entrada do Terminal</w:t>
+        <w:t>O serviço de pintura está em andamento, conforme demonstrado no Memorial Fotográfico pelo comparativo entre a Foto 01 de 18/06/2025 e a Foto 02 de 30/09/2025.</w:t>
       </w:r>
     </w:p>
     <w:p>
@@ -2036,7 +2132,7 @@
           <w:color w:val="000000"/>
           <w:lang w:val="pt-BR" w:eastAsia="pt-BR" w:bidi="pt-BR"/>
         </w:rPr>
-        <w:t>N/A</w:t>
+        <w:t>Não Conformidade pendente. Recomenda-se que a SOCICAM encaminhe comprovação de conclusão desses serviços, que se encontram em atraso considerando a informação da SOCICAM constante da Carta SAP/PER/ARPE N° 002/2025.</w:t>
       </w:r>
     </w:p>
     <w:p>
@@ -2056,418 +2152,7 @@
           <w:u w:val="single"/>
           <w:lang w:val="pt-BR" w:eastAsia="pt-BR" w:bidi="pt-BR"/>
         </w:rPr>
-        <w:t>Não Conformidade GAR 2025_10</w:t>
-      </w:r>
-      <w:r>
-        <w:rPr>
-          <w:rFonts w:ascii="Arial" w:eastAsia="Arial" w:hAnsi="Arial"/>
-          <w:color w:val="000000"/>
-          <w:lang w:val="pt-BR" w:eastAsia="pt-BR" w:bidi="pt-BR"/>
-        </w:rPr>
-        <w:t xml:space="preserve">  </w:t>
-      </w:r>
-      <w:r>
-        <w:rPr>
-          <w:rFonts w:ascii="Arial" w:eastAsia="Arial" w:hAnsi="Arial"/>
-          <w:color w:val="000000"/>
-          <w:lang w:val="pt-BR" w:eastAsia="pt-BR" w:bidi="pt-BR"/>
-        </w:rPr>
-        <w:t>Pintura desgastada nas colunas da fachada do lado do pátio de manobras no Terminal de Garanhuns</w:t>
-      </w:r>
-    </w:p>
-    <w:p>
-      <w:pPr>
-        <w:spacing w:after="0" w:line="260" w:lineRule="exact"/>
-        <w:jc w:val="lowKashida"/>
-      </w:pPr>
-      <w:r>
-        <w:rPr>
-          <w:rFonts w:ascii="Arial" w:eastAsia="Arial" w:hAnsi="Arial"/>
-          <w:b/>
-          <w:color w:val="000000"/>
-          <w:lang w:val="pt-BR" w:eastAsia="pt-BR" w:bidi="pt-BR"/>
-        </w:rPr>
-        <w:t xml:space="preserve">Informação da SOCICAM: </w:t>
-      </w:r>
-      <w:r>
-        <w:rPr>
-          <w:rFonts w:ascii="Arial" w:eastAsia="Arial" w:hAnsi="Arial"/>
-          <w:color w:val="000000"/>
-          <w:lang w:val="pt-BR" w:eastAsia="pt-BR" w:bidi="pt-BR"/>
-        </w:rPr>
-        <w:t>N/A</w:t>
-      </w:r>
-    </w:p>
-    <w:p>
-      <w:pPr>
-        <w:spacing w:after="0" w:line="260" w:lineRule="exact"/>
-        <w:jc w:val="lowKashida"/>
-      </w:pPr>
-      <w:r>
-        <w:rPr>
-          <w:rFonts w:ascii="Arial" w:eastAsia="Arial" w:hAnsi="Arial"/>
-          <w:b/>
-          <w:color w:val="000000"/>
-          <w:lang w:val="pt-BR" w:eastAsia="pt-BR" w:bidi="pt-BR"/>
-        </w:rPr>
-        <w:t xml:space="preserve">Constatação: </w:t>
-      </w:r>
-      <w:r>
-        <w:rPr>
-          <w:rFonts w:ascii="Arial" w:eastAsia="Arial" w:hAnsi="Arial"/>
-          <w:color w:val="000000"/>
-          <w:lang w:val="pt-BR" w:eastAsia="pt-BR" w:bidi="pt-BR"/>
-        </w:rPr>
-        <w:t>Pintura desgastada nas colunas da fachada do lado do pátio de manobras no Terminal</w:t>
-      </w:r>
-    </w:p>
-    <w:p>
-      <w:pPr>
-        <w:spacing w:after="0" w:line="260" w:lineRule="exact"/>
-        <w:jc w:val="lowKashida"/>
-      </w:pPr>
-      <w:r>
-        <w:rPr>
-          <w:rFonts w:ascii="Arial" w:eastAsia="Arial" w:hAnsi="Arial"/>
-          <w:b/>
-          <w:color w:val="000000"/>
-          <w:lang w:val="pt-BR" w:eastAsia="pt-BR" w:bidi="pt-BR"/>
-        </w:rPr>
-        <w:t xml:space="preserve">Análise da ARPE: </w:t>
-      </w:r>
-      <w:r>
-        <w:rPr>
-          <w:rFonts w:ascii="Arial" w:eastAsia="Arial" w:hAnsi="Arial"/>
-          <w:color w:val="000000"/>
-          <w:lang w:val="pt-BR" w:eastAsia="pt-BR" w:bidi="pt-BR"/>
-        </w:rPr>
-        <w:t>N/A</w:t>
-      </w:r>
-    </w:p>
-    <w:p>
-      <w:pPr>
-        <w:spacing w:after="240"/>
-      </w:pPr>
-    </w:p>
-    <w:p>
-      <w:pPr>
-        <w:jc w:val="lowKashida"/>
-      </w:pPr>
-      <w:r>
-        <w:rPr>
-          <w:rFonts w:ascii="Arial" w:eastAsia="Arial" w:hAnsi="Arial"/>
-          <w:b/>
-          <w:color w:val="000000"/>
-          <w:u w:val="single"/>
-          <w:lang w:val="pt-BR" w:eastAsia="pt-BR" w:bidi="pt-BR"/>
-        </w:rPr>
-        <w:t>Não Conformidade GAR 2025_11</w:t>
-      </w:r>
-      <w:r>
-        <w:rPr>
-          <w:rFonts w:ascii="Arial" w:eastAsia="Arial" w:hAnsi="Arial"/>
-          <w:color w:val="000000"/>
-          <w:lang w:val="pt-BR" w:eastAsia="pt-BR" w:bidi="pt-BR"/>
-        </w:rPr>
-        <w:t xml:space="preserve">  Pintura desgastada na parede lateral direita no Terminal de Garanhuns</w:t>
-      </w:r>
-    </w:p>
-    <w:p>
-      <w:pPr>
-        <w:spacing w:after="0" w:line="260" w:lineRule="exact"/>
-        <w:jc w:val="lowKashida"/>
-      </w:pPr>
-      <w:r>
-        <w:rPr>
-          <w:rFonts w:ascii="Arial" w:eastAsia="Arial" w:hAnsi="Arial"/>
-          <w:b/>
-          <w:color w:val="000000"/>
-          <w:lang w:val="pt-BR" w:eastAsia="pt-BR" w:bidi="pt-BR"/>
-        </w:rPr>
-        <w:t xml:space="preserve">Informação da SOCICAM: </w:t>
-      </w:r>
-      <w:r>
-        <w:rPr>
-          <w:rFonts w:ascii="Arial" w:eastAsia="Arial" w:hAnsi="Arial"/>
-          <w:color w:val="000000"/>
-          <w:lang w:val="pt-BR" w:eastAsia="pt-BR" w:bidi="pt-BR"/>
-        </w:rPr>
-        <w:t>N/A</w:t>
-      </w:r>
-    </w:p>
-    <w:p>
-      <w:pPr>
-        <w:spacing w:after="0" w:line="260" w:lineRule="exact"/>
-        <w:jc w:val="lowKashida"/>
-      </w:pPr>
-      <w:r>
-        <w:rPr>
-          <w:rFonts w:ascii="Arial" w:eastAsia="Arial" w:hAnsi="Arial"/>
-          <w:b/>
-          <w:color w:val="000000"/>
-          <w:lang w:val="pt-BR" w:eastAsia="pt-BR" w:bidi="pt-BR"/>
-        </w:rPr>
-        <w:t xml:space="preserve">Constatação: </w:t>
-      </w:r>
-      <w:r>
-        <w:rPr>
-          <w:rFonts w:ascii="Arial" w:eastAsia="Arial" w:hAnsi="Arial"/>
-          <w:color w:val="000000"/>
-          <w:lang w:val="pt-BR" w:eastAsia="pt-BR" w:bidi="pt-BR"/>
-        </w:rPr>
-        <w:t>Pintura desgastada na parede lateral direita no Terminal</w:t>
-      </w:r>
-    </w:p>
-    <w:p>
-      <w:pPr>
-        <w:spacing w:after="0" w:line="260" w:lineRule="exact"/>
-        <w:jc w:val="lowKashida"/>
-      </w:pPr>
-      <w:r>
-        <w:rPr>
-          <w:rFonts w:ascii="Arial" w:eastAsia="Arial" w:hAnsi="Arial"/>
-          <w:b/>
-          <w:color w:val="000000"/>
-          <w:lang w:val="pt-BR" w:eastAsia="pt-BR" w:bidi="pt-BR"/>
-        </w:rPr>
-        <w:t xml:space="preserve">Análise da ARPE: </w:t>
-      </w:r>
-      <w:r>
-        <w:rPr>
-          <w:rFonts w:ascii="Arial" w:eastAsia="Arial" w:hAnsi="Arial"/>
-          <w:color w:val="000000"/>
-          <w:lang w:val="pt-BR" w:eastAsia="pt-BR" w:bidi="pt-BR"/>
-        </w:rPr>
-        <w:t>N/A</w:t>
-      </w:r>
-    </w:p>
-    <w:p>
-      <w:pPr>
-        <w:spacing w:after="240"/>
-      </w:pPr>
-    </w:p>
-    <w:p>
-      <w:pPr>
-        <w:jc w:val="lowKashida"/>
-      </w:pPr>
-      <w:r>
-        <w:rPr>
-          <w:rFonts w:ascii="Arial" w:eastAsia="Arial" w:hAnsi="Arial"/>
-          <w:b/>
-          <w:color w:val="000000"/>
-          <w:u w:val="single"/>
-          <w:lang w:val="pt-BR" w:eastAsia="pt-BR" w:bidi="pt-BR"/>
-        </w:rPr>
-        <w:t>Não Conformidade ID_NAO_ENCONTRADO</w:t>
-      </w:r>
-      <w:r>
-        <w:rPr>
-          <w:rFonts w:ascii="Arial" w:eastAsia="Arial" w:hAnsi="Arial"/>
-          <w:color w:val="000000"/>
-          <w:lang w:val="pt-BR" w:eastAsia="pt-BR" w:bidi="pt-BR"/>
-        </w:rPr>
-        <w:t xml:space="preserve">  "</w:t>
-      </w:r>
-    </w:p>
-    <w:p>
-      <w:pPr>
-        <w:spacing w:after="0" w:line="260" w:lineRule="exact"/>
-        <w:jc w:val="lowKashida"/>
-      </w:pPr>
-      <w:r>
-        <w:rPr>
-          <w:rFonts w:ascii="Arial" w:eastAsia="Arial" w:hAnsi="Arial"/>
-          <w:b/>
-          <w:color w:val="000000"/>
-          <w:lang w:val="pt-BR" w:eastAsia="pt-BR" w:bidi="pt-BR"/>
-        </w:rPr>
         <w:lastRenderedPageBreak/>
-        <w:t xml:space="preserve">Informação da SOCICAM: </w:t>
-      </w:r>
-      <w:r>
-        <w:rPr>
-          <w:rFonts w:ascii="Arial" w:eastAsia="Arial" w:hAnsi="Arial"/>
-          <w:color w:val="000000"/>
-          <w:lang w:val="pt-BR" w:eastAsia="pt-BR" w:bidi="pt-BR"/>
-        </w:rPr>
-        <w:t>N/A</w:t>
-      </w:r>
-    </w:p>
-    <w:p>
-      <w:pPr>
-        <w:spacing w:after="0" w:line="260" w:lineRule="exact"/>
-        <w:jc w:val="lowKashida"/>
-      </w:pPr>
-      <w:r>
-        <w:rPr>
-          <w:rFonts w:ascii="Arial" w:eastAsia="Arial" w:hAnsi="Arial"/>
-          <w:b/>
-          <w:color w:val="000000"/>
-          <w:lang w:val="pt-BR" w:eastAsia="pt-BR" w:bidi="pt-BR"/>
-        </w:rPr>
-        <w:t xml:space="preserve">Constatação: </w:t>
-      </w:r>
-      <w:r>
-        <w:rPr>
-          <w:rFonts w:ascii="Arial" w:eastAsia="Arial" w:hAnsi="Arial"/>
-          <w:color w:val="000000"/>
-          <w:lang w:val="pt-BR" w:eastAsia="pt-BR" w:bidi="pt-BR"/>
-        </w:rPr>
-        <w:t>"</w:t>
-      </w:r>
-    </w:p>
-    <w:p>
-      <w:pPr>
-        <w:spacing w:after="0" w:line="260" w:lineRule="exact"/>
-        <w:jc w:val="lowKashida"/>
-      </w:pPr>
-      <w:r>
-        <w:rPr>
-          <w:rFonts w:ascii="Arial" w:eastAsia="Arial" w:hAnsi="Arial"/>
-          <w:b/>
-          <w:color w:val="000000"/>
-          <w:lang w:val="pt-BR" w:eastAsia="pt-BR" w:bidi="pt-BR"/>
-        </w:rPr>
-        <w:t xml:space="preserve">Análise da ARPE: </w:t>
-      </w:r>
-      <w:r>
-        <w:rPr>
-          <w:rFonts w:ascii="Arial" w:eastAsia="Arial" w:hAnsi="Arial"/>
-          <w:color w:val="000000"/>
-          <w:lang w:val="pt-BR" w:eastAsia="pt-BR" w:bidi="pt-BR"/>
-        </w:rPr>
-        <w:t>N/A</w:t>
-      </w:r>
-    </w:p>
-    <w:p>
-      <w:pPr>
-        <w:spacing w:after="240"/>
-      </w:pPr>
-    </w:p>
-    <w:p>
-      <w:pPr>
-        <w:spacing w:before="240"/>
-      </w:pPr>
-      <w:r>
-        <w:rPr>
-          <w:rFonts w:ascii="Arial" w:eastAsia="Arial" w:hAnsi="Arial"/>
-          <w:b/>
-          <w:color w:val="000000"/>
-          <w:sz w:val="24"/>
-          <w:lang w:val="pt-BR" w:eastAsia="pt-BR" w:bidi="pt-BR"/>
-        </w:rPr>
-        <w:t>3.3 - TERMINAL DE RECIFE (TIP)</w:t>
-      </w:r>
-    </w:p>
-    <w:p>
-      <w:pPr>
-        <w:jc w:val="lowKashida"/>
-      </w:pPr>
-      <w:r>
-        <w:rPr>
-          <w:rFonts w:ascii="Arial" w:eastAsia="Arial" w:hAnsi="Arial"/>
-          <w:b/>
-          <w:color w:val="000000"/>
-          <w:u w:val="single"/>
-          <w:lang w:val="pt-BR" w:eastAsia="pt-BR" w:bidi="pt-BR"/>
-        </w:rPr>
-        <w:t>Não Conformidade TIP 2025_01</w:t>
-      </w:r>
-      <w:r>
-        <w:rPr>
-          <w:rFonts w:ascii="Arial" w:eastAsia="Arial" w:hAnsi="Arial"/>
-          <w:color w:val="000000"/>
-          <w:lang w:val="pt-BR" w:eastAsia="pt-BR" w:bidi="pt-BR"/>
-        </w:rPr>
-        <w:t xml:space="preserve">  Infiltração em coluna de sustentação da estrutura metálica da área de embarque e desembarque do Terminal de Recife (TIP)</w:t>
-      </w:r>
-    </w:p>
-    <w:p>
-      <w:pPr>
-        <w:spacing w:after="0" w:line="260" w:lineRule="exact"/>
-        <w:jc w:val="lowKashida"/>
-      </w:pPr>
-      <w:r>
-        <w:rPr>
-          <w:rFonts w:ascii="Arial" w:eastAsia="Arial" w:hAnsi="Arial"/>
-          <w:b/>
-          <w:color w:val="000000"/>
-          <w:lang w:val="pt-BR" w:eastAsia="pt-BR" w:bidi="pt-BR"/>
-        </w:rPr>
-        <w:t xml:space="preserve">Informação da SOCICAM: </w:t>
-      </w:r>
-      <w:r>
-        <w:rPr>
-          <w:rFonts w:ascii="Arial" w:eastAsia="Arial" w:hAnsi="Arial"/>
-          <w:color w:val="000000"/>
-          <w:lang w:val="pt-BR" w:eastAsia="pt-BR" w:bidi="pt-BR"/>
-        </w:rPr>
-        <w:t>A SOCICAM informou que o serviço estava em andamento com a equipe interna de manutenção, com previsão de conclusão em setembro de 2025 (Carta SAP/PER/ARPE N° 002/2025).</w:t>
-      </w:r>
-    </w:p>
-    <w:p>
-      <w:pPr>
-        <w:spacing w:after="0" w:line="260" w:lineRule="exact"/>
-        <w:jc w:val="lowKashida"/>
-      </w:pPr>
-      <w:r>
-        <w:rPr>
-          <w:rFonts w:ascii="Arial" w:eastAsia="Arial" w:hAnsi="Arial"/>
-          <w:b/>
-          <w:color w:val="000000"/>
-          <w:lang w:val="pt-BR" w:eastAsia="pt-BR" w:bidi="pt-BR"/>
-        </w:rPr>
-        <w:t xml:space="preserve">Constatação: </w:t>
-      </w:r>
-      <w:r>
-        <w:rPr>
-          <w:rFonts w:ascii="Arial" w:eastAsia="Arial" w:hAnsi="Arial"/>
-          <w:color w:val="000000"/>
-          <w:lang w:val="pt-BR" w:eastAsia="pt-BR" w:bidi="pt-BR"/>
-        </w:rPr>
-        <w:t>Infiltração em coluna de sustentação da estrutura metálica da área de embarque e desembarque</w:t>
-      </w:r>
-    </w:p>
-    <w:p>
-      <w:pPr>
-        <w:spacing w:after="0" w:line="260" w:lineRule="exact"/>
-        <w:jc w:val="lowKashida"/>
-      </w:pPr>
-      <w:r>
-        <w:rPr>
-          <w:rFonts w:ascii="Arial" w:eastAsia="Arial" w:hAnsi="Arial"/>
-          <w:b/>
-          <w:color w:val="000000"/>
-          <w:lang w:val="pt-BR" w:eastAsia="pt-BR" w:bidi="pt-BR"/>
-        </w:rPr>
-        <w:t xml:space="preserve">Análise da ARPE: </w:t>
-      </w:r>
-      <w:r>
-        <w:rPr>
-          <w:rFonts w:ascii="Arial" w:eastAsia="Arial" w:hAnsi="Arial"/>
-          <w:color w:val="000000"/>
-          <w:lang w:val="pt-BR" w:eastAsia="pt-BR" w:bidi="pt-BR"/>
-        </w:rPr>
-        <w:t>Não Conformidade pendente. Recomenda-se que a SOCICAM encaminhe comprovação de conclusão desses serviços, que se encontram em atraso considerando a informação da SOCICAM constante da Carta SAP/PER/ARPE N° 002/2025.</w:t>
-      </w:r>
-    </w:p>
-    <w:p>
-      <w:pPr>
-        <w:spacing w:after="240"/>
-      </w:pPr>
-    </w:p>
-    <w:p>
-      <w:pPr>
-        <w:jc w:val="lowKashida"/>
-      </w:pPr>
-      <w:r>
-        <w:rPr>
-          <w:rFonts w:ascii="Arial" w:eastAsia="Arial" w:hAnsi="Arial"/>
-          <w:b/>
-          <w:color w:val="000000"/>
-          <w:u w:val="single"/>
-          <w:lang w:val="pt-BR" w:eastAsia="pt-BR" w:bidi="pt-BR"/>
-        </w:rPr>
         <w:t>Não Conformidade TIP 2025_02</w:t>
       </w:r>
       <w:r>
@@ -2476,7 +2161,7 @@
           <w:color w:val="000000"/>
           <w:lang w:val="pt-BR" w:eastAsia="pt-BR" w:bidi="pt-BR"/>
         </w:rPr>
-        <w:t xml:space="preserve">  Falta de manutenção adequada no banheiro feminino para PCD localizado no primeiro andar do Terminal de Recife (TIP) associada a três Não Conformidades.</w:t>
+        <w:t xml:space="preserve"> - Falta de manutenção adequada no banheiro feminino para PCD localizado no primeiro andar do Terminal de Recife (TIP) associada a três Não Conformidades.</w:t>
       </w:r>
     </w:p>
     <w:p>
@@ -2495,7 +2180,7 @@
         <w:t>Não Conformidade TIP 2025_02.1</w:t>
       </w:r>
       <w:r>
-        <w:t xml:space="preserve">  </w:t>
+        <w:t xml:space="preserve"> - </w:t>
       </w:r>
       <w:r>
         <w:rPr>
@@ -2522,7 +2207,7 @@
         <w:t>Não Conformidade TIP 2025_02.2</w:t>
       </w:r>
       <w:r>
-        <w:t xml:space="preserve">  </w:t>
+        <w:t xml:space="preserve"> - </w:t>
       </w:r>
       <w:r>
         <w:rPr>
@@ -2549,7 +2234,7 @@
         <w:t>Não Conformidade TIP 2025_02.3</w:t>
       </w:r>
       <w:r>
-        <w:t xml:space="preserve">  </w:t>
+        <w:t xml:space="preserve"> - </w:t>
       </w:r>
       <w:r>
         <w:rPr>
@@ -2603,7 +2288,7 @@
           <w:color w:val="000000"/>
           <w:lang w:val="pt-BR" w:eastAsia="pt-BR" w:bidi="pt-BR"/>
         </w:rPr>
-        <w:t>Falta de manutenção adequada no banheiro feminino para PCD localizado no primeiro andar do Terminal de Recife (TIP)</w:t>
+        <w:t>A pintura na porta foi finalizada, conforme demonstra o Memorial Fotográfico pelo comparativo entre a Foto 05 de 18/06/2025 e a Foto 06 de 30/09/2025.</w:t>
       </w:r>
     </w:p>
     <w:p>
@@ -2654,7 +2339,7 @@
           <w:color w:val="000000"/>
           <w:lang w:val="pt-BR" w:eastAsia="pt-BR" w:bidi="pt-BR"/>
         </w:rPr>
-        <w:t xml:space="preserve">  Porta com avaria no banheiro feminino do primeiro andar do Terminal de Recife (TIP)</w:t>
+        <w:t xml:space="preserve"> - Porta com avaria no banheiro feminino do primeiro andar do Terminal de Recife (TIP)</w:t>
       </w:r>
     </w:p>
     <w:p>
@@ -2700,7 +2385,7 @@
           <w:color w:val="000000"/>
           <w:lang w:val="pt-BR" w:eastAsia="pt-BR" w:bidi="pt-BR"/>
         </w:rPr>
-        <w:t>Porta com avaria no banheiro feminino do primeiro andar do Terminal de Recife (TIP).</w:t>
+        <w:t>N/A</w:t>
       </w:r>
     </w:p>
     <w:p>
@@ -2751,7 +2436,7 @@
           <w:color w:val="000000"/>
           <w:lang w:val="pt-BR" w:eastAsia="pt-BR" w:bidi="pt-BR"/>
         </w:rPr>
-        <w:t xml:space="preserve">  Pintura do meio-fio desgastada na área de circulação e manobra dos ônibus no pátio interno do Terminal de Recife (TIP)</w:t>
+        <w:t xml:space="preserve"> - Pintura do meio-fio desgastada na área de circulação e manobra dos ônibus no pátio interno do Terminal de Recife (TIP)</w:t>
       </w:r>
     </w:p>
     <w:p>
@@ -2797,7 +2482,7 @@
           <w:color w:val="000000"/>
           <w:lang w:val="pt-BR" w:eastAsia="pt-BR" w:bidi="pt-BR"/>
         </w:rPr>
-        <w:t>Pintura do meio-fio desgastada na área de circulação e manobra dos ônibus</w:t>
+        <w:t>N/A</w:t>
       </w:r>
     </w:p>
     <w:p>
@@ -2840,7 +2525,6 @@
           <w:u w:val="single"/>
           <w:lang w:val="pt-BR" w:eastAsia="pt-BR" w:bidi="pt-BR"/>
         </w:rPr>
-        <w:lastRenderedPageBreak/>
         <w:t>Não Conformidade TIP 2025_06</w:t>
       </w:r>
       <w:r>
@@ -2849,7 +2533,7 @@
           <w:color w:val="000000"/>
           <w:lang w:val="pt-BR" w:eastAsia="pt-BR" w:bidi="pt-BR"/>
         </w:rPr>
-        <w:t xml:space="preserve">  Falta de manutenção adequada na infraestrutura do ponto de embarque e desembarque dos ônibus urbanos da RMR e na sinalização horizontal (faixa de pedestre) na entrada do Terminal de Recife (TIP), que se associa a duas Não Conformidades.</w:t>
+        <w:t xml:space="preserve"> - Falta de manutenção adequada na infraestrutura do ponto de embarque e desembarque dos ônibus urbanos da RMR e na sinalização horizontal (faixa de pedestre) na entrada do Terminal de Recife (TIP), que se associa a duas Não Conformidades.</w:t>
       </w:r>
     </w:p>
     <w:p>
@@ -2868,7 +2552,7 @@
         <w:t>Não Conformidade TIP 2025_06.1</w:t>
       </w:r>
       <w:r>
-        <w:t xml:space="preserve">  </w:t>
+        <w:t xml:space="preserve"> - </w:t>
       </w:r>
       <w:r>
         <w:rPr>
@@ -2895,7 +2579,7 @@
         <w:t>Não Conformidade TIP 2025_06.2</w:t>
       </w:r>
       <w:r>
-        <w:t xml:space="preserve">  </w:t>
+        <w:t xml:space="preserve"> - </w:t>
       </w:r>
       <w:r>
         <w:rPr>
@@ -2949,7 +2633,7 @@
           <w:color w:val="000000"/>
           <w:lang w:val="pt-BR" w:eastAsia="pt-BR" w:bidi="pt-BR"/>
         </w:rPr>
-        <w:t>Falta de manutenção adequada na infraestrutura do ponto de embarque e desembarque.</w:t>
+        <w:t>N/A</w:t>
       </w:r>
     </w:p>
     <w:p>
@@ -2990,7 +2674,7 @@
         <w:pStyle w:val="Ttulo1"/>
         <w:spacing w:after="120"/>
       </w:pPr>
-      <w:bookmarkStart w:id="3" w:name="_Toc214951430"/>
+      <w:bookmarkStart w:id="3" w:name="_Toc214961116"/>
       <w:r>
         <w:rPr>
           <w:rFonts w:ascii="Arial" w:eastAsia="Arial" w:hAnsi="Arial"/>
@@ -3011,11 +2695,11 @@
         <w:tblLook w:val="04A0" w:firstRow="1" w:lastRow="0" w:firstColumn="1" w:lastColumn="0" w:noHBand="0" w:noVBand="1"/>
       </w:tblPr>
       <w:tblGrid>
-        <w:gridCol w:w="1538"/>
-        <w:gridCol w:w="2555"/>
-        <w:gridCol w:w="1731"/>
-        <w:gridCol w:w="1234"/>
-        <w:gridCol w:w="1798"/>
+        <w:gridCol w:w="1660"/>
+        <w:gridCol w:w="2241"/>
+        <w:gridCol w:w="2014"/>
+        <w:gridCol w:w="1470"/>
+        <w:gridCol w:w="1471"/>
       </w:tblGrid>
       <w:tr>
         <w:trPr>
@@ -3117,7 +2801,17 @@
                 <w:lang w:val="pt-BR" w:eastAsia="pt-BR" w:bidi="pt-BR"/>
               </w:rPr>
               <w:br/>
-              <w:t>001/2025 002/2025</w:t>
+              <w:t xml:space="preserve">001/2025 </w:t>
+            </w:r>
+            <w:r>
+              <w:rPr>
+                <w:rFonts w:ascii="Arial" w:eastAsia="Arial" w:hAnsi="Arial"/>
+                <w:b/>
+                <w:color w:val="000000"/>
+                <w:lang w:val="pt-BR" w:eastAsia="pt-BR" w:bidi="pt-BR"/>
+              </w:rPr>
+              <w:lastRenderedPageBreak/>
+              <w:t>002/2025</w:t>
             </w:r>
           </w:p>
         </w:tc>
@@ -3137,6 +2831,7 @@
                 <w:color w:val="000000"/>
                 <w:lang w:val="pt-BR" w:eastAsia="pt-BR" w:bidi="pt-BR"/>
               </w:rPr>
+              <w:lastRenderedPageBreak/>
               <w:t>VISTORIA DA ARPE</w:t>
             </w:r>
             <w:r>
@@ -3147,7 +2842,17 @@
                 <w:lang w:val="pt-BR" w:eastAsia="pt-BR" w:bidi="pt-BR"/>
               </w:rPr>
               <w:br/>
-              <w:t>01 A 22/09/2025 e   30/09/2025</w:t>
+              <w:t xml:space="preserve">01 A 22/09/2025 e   </w:t>
+            </w:r>
+            <w:r>
+              <w:rPr>
+                <w:rFonts w:ascii="Arial" w:eastAsia="Arial" w:hAnsi="Arial"/>
+                <w:b/>
+                <w:color w:val="000000"/>
+                <w:lang w:val="pt-BR" w:eastAsia="pt-BR" w:bidi="pt-BR"/>
+              </w:rPr>
+              <w:lastRenderedPageBreak/>
+              <w:t>30/09/2025</w:t>
             </w:r>
           </w:p>
         </w:tc>
@@ -3167,6 +2872,7 @@
                 <w:color w:val="000000"/>
                 <w:lang w:val="pt-BR" w:eastAsia="pt-BR" w:bidi="pt-BR"/>
               </w:rPr>
+              <w:lastRenderedPageBreak/>
               <w:t>SITUAÇÃO</w:t>
             </w:r>
           </w:p>
@@ -3596,7 +3302,7 @@
                 <w:color w:val="000000"/>
                 <w:lang w:val="pt-BR" w:eastAsia="pt-BR" w:bidi="pt-BR"/>
               </w:rPr>
-              <w:t>CAR 2025_07</w:t>
+              <w:t>CAR 2025_08</w:t>
             </w:r>
             <w:r>
               <w:rPr>
@@ -3604,7 +3310,7 @@
                 <w:color w:val="000000"/>
                 <w:lang w:val="pt-BR" w:eastAsia="pt-BR" w:bidi="pt-BR"/>
               </w:rPr>
-              <w:t xml:space="preserve"> – Pintura desgastada no muro lateral no Terminal de Caruaru</w:t>
+              <w:t xml:space="preserve"> – Vidraças na parte administrativa precisando de limpeza no Terminal de Caruaru</w:t>
             </w:r>
           </w:p>
         </w:tc>
@@ -3622,112 +3328,6 @@
                 <w:color w:val="000000"/>
                 <w:lang w:val="pt-BR" w:eastAsia="pt-BR" w:bidi="pt-BR"/>
               </w:rPr>
-              <w:t>N/A</w:t>
-            </w:r>
-          </w:p>
-        </w:tc>
-        <w:tc>
-          <w:tcPr>
-            <w:tcW w:w="1728" w:type="dxa"/>
-            <w:vAlign w:val="center"/>
-          </w:tcPr>
-          <w:p>
-            <w:pPr>
-              <w:jc w:val="center"/>
-            </w:pPr>
-            <w:r>
-              <w:rPr>
-                <w:rFonts w:ascii="Arial" w:eastAsia="Arial" w:hAnsi="Arial"/>
-                <w:color w:val="000000"/>
-                <w:lang w:val="pt-BR" w:eastAsia="pt-BR" w:bidi="pt-BR"/>
-              </w:rPr>
-              <w:t>09/06/2025</w:t>
-            </w:r>
-          </w:p>
-        </w:tc>
-        <w:tc>
-          <w:tcPr>
-            <w:tcW w:w="1728" w:type="dxa"/>
-            <w:vAlign w:val="center"/>
-          </w:tcPr>
-          <w:p>
-            <w:pPr>
-              <w:jc w:val="center"/>
-            </w:pPr>
-            <w:r>
-              <w:rPr>
-                <w:rFonts w:ascii="Arial" w:eastAsia="Arial" w:hAnsi="Arial"/>
-                <w:b/>
-                <w:color w:val="000000"/>
-                <w:lang w:val="pt-BR" w:eastAsia="pt-BR" w:bidi="pt-BR"/>
-              </w:rPr>
-              <w:t>PENDENTE</w:t>
-            </w:r>
-          </w:p>
-        </w:tc>
-      </w:tr>
-      <w:tr>
-        <w:trPr>
-          <w:jc w:val="center"/>
-        </w:trPr>
-        <w:tc>
-          <w:tcPr>
-            <w:tcW w:w="1728" w:type="dxa"/>
-            <w:vMerge/>
-          </w:tcPr>
-          <w:p/>
-        </w:tc>
-        <w:tc>
-          <w:tcPr>
-            <w:tcW w:w="1728" w:type="dxa"/>
-          </w:tcPr>
-          <w:p>
-            <w:pPr>
-              <w:spacing w:line="260" w:lineRule="exact"/>
-            </w:pPr>
-            <w:r>
-              <w:rPr>
-                <w:rFonts w:ascii="Arial" w:eastAsia="Arial" w:hAnsi="Arial"/>
-                <w:b/>
-                <w:color w:val="000000"/>
-                <w:lang w:val="pt-BR" w:eastAsia="pt-BR" w:bidi="pt-BR"/>
-              </w:rPr>
-              <w:t>CAR 2025_08</w:t>
-            </w:r>
-            <w:r>
-              <w:rPr>
-                <w:rFonts w:ascii="Arial" w:eastAsia="Arial" w:hAnsi="Arial"/>
-                <w:color w:val="000000"/>
-                <w:lang w:val="pt-BR" w:eastAsia="pt-BR" w:bidi="pt-BR"/>
-              </w:rPr>
-              <w:t xml:space="preserve"> – Vidraças na parte administrativa precisando de limpeza </w:t>
-            </w:r>
-            <w:r>
-              <w:rPr>
-                <w:rFonts w:ascii="Arial" w:eastAsia="Arial" w:hAnsi="Arial"/>
-                <w:color w:val="000000"/>
-                <w:lang w:val="pt-BR" w:eastAsia="pt-BR" w:bidi="pt-BR"/>
-              </w:rPr>
-              <w:lastRenderedPageBreak/>
-              <w:t>no Terminal de Caruaru</w:t>
-            </w:r>
-          </w:p>
-        </w:tc>
-        <w:tc>
-          <w:tcPr>
-            <w:tcW w:w="1728" w:type="dxa"/>
-          </w:tcPr>
-          <w:p>
-            <w:pPr>
-              <w:spacing w:line="260" w:lineRule="exact"/>
-            </w:pPr>
-            <w:r>
-              <w:rPr>
-                <w:rFonts w:ascii="Arial" w:eastAsia="Arial" w:hAnsi="Arial"/>
-                <w:color w:val="000000"/>
-                <w:lang w:val="pt-BR" w:eastAsia="pt-BR" w:bidi="pt-BR"/>
-              </w:rPr>
-              <w:lastRenderedPageBreak/>
               <w:t>N/A</w:t>
             </w:r>
           </w:p>
@@ -4196,102 +3796,6 @@
                 <w:color w:val="000000"/>
                 <w:lang w:val="pt-BR" w:eastAsia="pt-BR" w:bidi="pt-BR"/>
               </w:rPr>
-              <w:t>GAR 2025_08</w:t>
-            </w:r>
-            <w:r>
-              <w:rPr>
-                <w:rFonts w:ascii="Arial" w:eastAsia="Arial" w:hAnsi="Arial"/>
-                <w:color w:val="000000"/>
-                <w:lang w:val="pt-BR" w:eastAsia="pt-BR" w:bidi="pt-BR"/>
-              </w:rPr>
-              <w:t xml:space="preserve"> – Pintura desgastada do muro do pátio de manobras no Terminal de Garanhuns</w:t>
-            </w:r>
-          </w:p>
-        </w:tc>
-        <w:tc>
-          <w:tcPr>
-            <w:tcW w:w="1728" w:type="dxa"/>
-          </w:tcPr>
-          <w:p>
-            <w:pPr>
-              <w:spacing w:line="260" w:lineRule="exact"/>
-            </w:pPr>
-            <w:r>
-              <w:rPr>
-                <w:rFonts w:ascii="Arial" w:eastAsia="Arial" w:hAnsi="Arial"/>
-                <w:color w:val="000000"/>
-                <w:lang w:val="pt-BR" w:eastAsia="pt-BR" w:bidi="pt-BR"/>
-              </w:rPr>
-              <w:t>LOREM IPSUM</w:t>
-            </w:r>
-          </w:p>
-        </w:tc>
-        <w:tc>
-          <w:tcPr>
-            <w:tcW w:w="1728" w:type="dxa"/>
-            <w:vAlign w:val="center"/>
-          </w:tcPr>
-          <w:p>
-            <w:pPr>
-              <w:jc w:val="center"/>
-            </w:pPr>
-            <w:r>
-              <w:rPr>
-                <w:rFonts w:ascii="Arial" w:eastAsia="Arial" w:hAnsi="Arial"/>
-                <w:color w:val="000000"/>
-                <w:lang w:val="pt-BR" w:eastAsia="pt-BR" w:bidi="pt-BR"/>
-              </w:rPr>
-              <w:t>12/06/2025</w:t>
-            </w:r>
-          </w:p>
-        </w:tc>
-        <w:tc>
-          <w:tcPr>
-            <w:tcW w:w="1728" w:type="dxa"/>
-            <w:vAlign w:val="center"/>
-          </w:tcPr>
-          <w:p>
-            <w:pPr>
-              <w:jc w:val="center"/>
-            </w:pPr>
-            <w:r>
-              <w:rPr>
-                <w:rFonts w:ascii="Arial" w:eastAsia="Arial" w:hAnsi="Arial"/>
-                <w:b/>
-                <w:color w:val="000000"/>
-                <w:lang w:val="pt-BR" w:eastAsia="pt-BR" w:bidi="pt-BR"/>
-              </w:rPr>
-              <w:t>PENDENTE</w:t>
-            </w:r>
-          </w:p>
-        </w:tc>
-      </w:tr>
-      <w:tr>
-        <w:trPr>
-          <w:jc w:val="center"/>
-        </w:trPr>
-        <w:tc>
-          <w:tcPr>
-            <w:tcW w:w="1728" w:type="dxa"/>
-            <w:vMerge/>
-          </w:tcPr>
-          <w:p/>
-        </w:tc>
-        <w:tc>
-          <w:tcPr>
-            <w:tcW w:w="1728" w:type="dxa"/>
-          </w:tcPr>
-          <w:p>
-            <w:pPr>
-              <w:spacing w:line="260" w:lineRule="exact"/>
-            </w:pPr>
-            <w:r>
-              <w:rPr>
-                <w:rFonts w:ascii="Arial" w:eastAsia="Arial" w:hAnsi="Arial"/>
-                <w:b/>
-                <w:color w:val="000000"/>
-                <w:lang w:val="pt-BR" w:eastAsia="pt-BR" w:bidi="pt-BR"/>
-              </w:rPr>
               <w:t>GAR 2025_09</w:t>
             </w:r>
             <w:r>
@@ -4396,7 +3900,16 @@
                 <w:color w:val="000000"/>
                 <w:lang w:val="pt-BR" w:eastAsia="pt-BR" w:bidi="pt-BR"/>
               </w:rPr>
-              <w:t xml:space="preserve"> – Pintura desgastada nas colunas da fachada do lado do pátio de manobras no Terminal de Garanhuns</w:t>
+              <w:t xml:space="preserve"> – </w:t>
+            </w:r>
+            <w:r>
+              <w:rPr>
+                <w:rFonts w:ascii="Arial" w:eastAsia="Arial" w:hAnsi="Arial"/>
+                <w:color w:val="000000"/>
+                <w:lang w:val="pt-BR" w:eastAsia="pt-BR" w:bidi="pt-BR"/>
+              </w:rPr>
+              <w:lastRenderedPageBreak/>
+              <w:t>Pintura desgastada nas colunas da fachada do lado do pátio de manobras no Terminal de Garanhuns</w:t>
             </w:r>
           </w:p>
         </w:tc>
@@ -4414,6 +3927,7 @@
                 <w:color w:val="000000"/>
                 <w:lang w:val="pt-BR" w:eastAsia="pt-BR" w:bidi="pt-BR"/>
               </w:rPr>
+              <w:lastRenderedPageBreak/>
               <w:t>N/A</w:t>
             </w:r>
           </w:p>
@@ -4550,93 +4064,6 @@
                 <w:lang w:val="pt-BR" w:eastAsia="pt-BR" w:bidi="pt-BR"/>
               </w:rPr>
               <w:t>PENDENTE</w:t>
-            </w:r>
-          </w:p>
-        </w:tc>
-      </w:tr>
-      <w:tr>
-        <w:trPr>
-          <w:jc w:val="center"/>
-        </w:trPr>
-        <w:tc>
-          <w:tcPr>
-            <w:tcW w:w="1728" w:type="dxa"/>
-            <w:vMerge/>
-          </w:tcPr>
-          <w:p/>
-        </w:tc>
-        <w:tc>
-          <w:tcPr>
-            <w:tcW w:w="1728" w:type="dxa"/>
-          </w:tcPr>
-          <w:p>
-            <w:pPr>
-              <w:spacing w:line="260" w:lineRule="exact"/>
-            </w:pPr>
-            <w:r>
-              <w:rPr>
-                <w:rFonts w:ascii="Arial" w:eastAsia="Arial" w:hAnsi="Arial"/>
-                <w:b/>
-                <w:color w:val="000000"/>
-                <w:lang w:val="pt-BR" w:eastAsia="pt-BR" w:bidi="pt-BR"/>
-              </w:rPr>
-              <w:t>ID_NAO_ENCONTRADO</w:t>
-            </w:r>
-            <w:r>
-              <w:rPr>
-                <w:rFonts w:ascii="Arial" w:eastAsia="Arial" w:hAnsi="Arial"/>
-                <w:color w:val="000000"/>
-                <w:lang w:val="pt-BR" w:eastAsia="pt-BR" w:bidi="pt-BR"/>
-              </w:rPr>
-              <w:t xml:space="preserve"> – "</w:t>
-            </w:r>
-          </w:p>
-        </w:tc>
-        <w:tc>
-          <w:tcPr>
-            <w:tcW w:w="1728" w:type="dxa"/>
-          </w:tcPr>
-          <w:p>
-            <w:pPr>
-              <w:spacing w:line="260" w:lineRule="exact"/>
-            </w:pPr>
-            <w:r>
-              <w:rPr>
-                <w:rFonts w:ascii="Arial" w:eastAsia="Arial" w:hAnsi="Arial"/>
-                <w:color w:val="000000"/>
-                <w:lang w:val="pt-BR" w:eastAsia="pt-BR" w:bidi="pt-BR"/>
-              </w:rPr>
-              <w:t>N/A</w:t>
-            </w:r>
-          </w:p>
-        </w:tc>
-        <w:tc>
-          <w:tcPr>
-            <w:tcW w:w="1728" w:type="dxa"/>
-            <w:vAlign w:val="center"/>
-          </w:tcPr>
-          <w:p>
-            <w:pPr>
-              <w:jc w:val="center"/>
-            </w:pPr>
-          </w:p>
-        </w:tc>
-        <w:tc>
-          <w:tcPr>
-            <w:tcW w:w="1728" w:type="dxa"/>
-            <w:vAlign w:val="center"/>
-          </w:tcPr>
-          <w:p>
-            <w:pPr>
-              <w:jc w:val="center"/>
-            </w:pPr>
-            <w:r>
-              <w:rPr>
-                <w:rFonts w:ascii="Arial" w:eastAsia="Arial" w:hAnsi="Arial"/>
-                <w:color w:val="000000"/>
-                <w:lang w:val="pt-BR" w:eastAsia="pt-BR" w:bidi="pt-BR"/>
-              </w:rPr>
-              <w:t>NÃO IDENTIFICADO</w:t>
             </w:r>
           </w:p>
         </w:tc>
@@ -4785,16 +4212,7 @@
                 <w:color w:val="000000"/>
                 <w:lang w:val="pt-BR" w:eastAsia="pt-BR" w:bidi="pt-BR"/>
               </w:rPr>
-              <w:t xml:space="preserve"> – Falta de manutenção adequada no banheiro feminino para PCD localizado no primeiro andar do Terminal de Recife </w:t>
-            </w:r>
-            <w:r>
-              <w:rPr>
-                <w:rFonts w:ascii="Arial" w:eastAsia="Arial" w:hAnsi="Arial"/>
-                <w:color w:val="000000"/>
-                <w:lang w:val="pt-BR" w:eastAsia="pt-BR" w:bidi="pt-BR"/>
-              </w:rPr>
-              <w:lastRenderedPageBreak/>
-              <w:t>(TIP) associada a três Não Conformidades.</w:t>
+              <w:t xml:space="preserve"> – Falta de manutenção adequada no banheiro feminino para PCD localizado no primeiro andar do Terminal de Recife (TIP) associada a três Não Conformidades.</w:t>
             </w:r>
             <w:r>
               <w:rPr>
@@ -4839,7 +4257,6 @@
                 <w:color w:val="000000"/>
                 <w:lang w:val="pt-BR" w:eastAsia="pt-BR" w:bidi="pt-BR"/>
               </w:rPr>
-              <w:lastRenderedPageBreak/>
               <w:t>LOREM IPSUM</w:t>
             </w:r>
           </w:p>
@@ -4875,10 +4292,11 @@
             <w:r>
               <w:rPr>
                 <w:rFonts w:ascii="Arial" w:eastAsia="Arial" w:hAnsi="Arial"/>
+                <w:b/>
                 <w:color w:val="000000"/>
                 <w:lang w:val="pt-BR" w:eastAsia="pt-BR" w:bidi="pt-BR"/>
               </w:rPr>
-              <w:t>PARCIALMENTE SANADA</w:t>
+              <w:t>PENDENTE</w:t>
             </w:r>
           </w:p>
         </w:tc>
@@ -5196,7 +4614,7 @@
         <w:pStyle w:val="Ttulo1"/>
         <w:spacing w:after="120"/>
       </w:pPr>
-      <w:bookmarkStart w:id="4" w:name="_Toc214951431"/>
+      <w:bookmarkStart w:id="4" w:name="_Toc214961117"/>
       <w:r>
         <w:rPr>
           <w:rFonts w:ascii="Arial" w:eastAsia="Arial" w:hAnsi="Arial"/>
@@ -5248,7 +4666,6 @@
           <w:sz w:val="24"/>
           <w:lang w:val="pt-BR" w:eastAsia="pt-BR" w:bidi="pt-BR"/>
         </w:rPr>
-        <w:lastRenderedPageBreak/>
         <w:t>Débora Marcolino</w:t>
       </w:r>
     </w:p>
@@ -5347,6 +4764,7 @@
           <w:sz w:val="24"/>
           <w:lang w:val="pt-BR" w:eastAsia="pt-BR" w:bidi="pt-BR"/>
         </w:rPr>
+        <w:lastRenderedPageBreak/>
         <w:t>Maria Ângela Albuquerque de Freitas</w:t>
       </w:r>
     </w:p>
@@ -5390,7 +4808,7 @@
         <w:shd w:val="clear" w:color="auto" w:fill="BFBFBF"/>
         <w:spacing w:after="120"/>
       </w:pPr>
-      <w:bookmarkStart w:id="5" w:name="_Toc214951432"/>
+      <w:bookmarkStart w:id="5" w:name="_Toc214961118"/>
       <w:r>
         <w:rPr>
           <w:rFonts w:ascii="Arial" w:eastAsia="Arial" w:hAnsi="Arial"/>
@@ -5428,7 +4846,7 @@
         <w:pStyle w:val="Ttulo2"/>
         <w:spacing w:after="120"/>
       </w:pPr>
-      <w:bookmarkStart w:id="6" w:name="_Toc214951433"/>
+      <w:bookmarkStart w:id="6" w:name="_Toc214961119"/>
       <w:r>
         <w:rPr>
           <w:rFonts w:ascii="Arial" w:eastAsia="Arial" w:hAnsi="Arial"/>
@@ -5492,7 +4910,7 @@
                 <w:noProof/>
               </w:rPr>
               <w:drawing>
-                <wp:inline distT="0" distB="0" distL="0" distR="0" wp14:anchorId="182DCC24" wp14:editId="2FFD3B60">
+                <wp:inline distT="0" distB="0" distL="0" distR="0" wp14:anchorId="58BDC3DA" wp14:editId="030F7A3C">
                   <wp:extent cx="2743200" cy="2468880"/>
                   <wp:effectExtent l="0" t="0" r="0" b="0"/>
                   <wp:docPr id="2" name="Picture 2"/>
@@ -5542,7 +4960,7 @@
                 <w:noProof/>
               </w:rPr>
               <w:drawing>
-                <wp:inline distT="0" distB="0" distL="0" distR="0" wp14:anchorId="20DB917E" wp14:editId="22694A6B">
+                <wp:inline distT="0" distB="0" distL="0" distR="0" wp14:anchorId="03D102D4" wp14:editId="046626E2">
                   <wp:extent cx="2743200" cy="2468880"/>
                   <wp:effectExtent l="0" t="0" r="0" b="0"/>
                   <wp:docPr id="3" name="Picture 3"/>
@@ -5596,7 +5014,7 @@
                 <w:sz w:val="20"/>
                 <w:lang w:val="pt-BR" w:eastAsia="pt-BR" w:bidi="pt-BR"/>
               </w:rPr>
-              <w:t>Infiltração em coluna de sustentação da estrutura metálica da área de embarque e desembarque</w:t>
+              <w:t>Situação da infiltração em coluna de sustentação do Terminal de Recife em 18/06/2025.</w:t>
             </w:r>
           </w:p>
         </w:tc>
@@ -5612,7 +5030,190 @@
                 <w:sz w:val="20"/>
                 <w:lang w:val="pt-BR" w:eastAsia="pt-BR" w:bidi="pt-BR"/>
               </w:rPr>
-              <w:t>Falta de manutenção adequada no banheiro feminino para PCD localizado no primeiro andar do Terminal de Recife (TIP)</w:t>
+              <w:t>Situação da coluna de sustentação em processo de restauração no Terminal de Recife em 30/09/2025.</w:t>
+            </w:r>
+          </w:p>
+        </w:tc>
+      </w:tr>
+    </w:tbl>
+    <w:p>
+      <w:pPr>
+        <w:spacing w:after="240"/>
+      </w:pPr>
+    </w:p>
+    <w:p>
+      <w:pPr>
+        <w:spacing w:before="240" w:after="120"/>
+      </w:pPr>
+      <w:r>
+        <w:rPr>
+          <w:rFonts w:ascii="Arial" w:eastAsia="Arial" w:hAnsi="Arial"/>
+          <w:b/>
+          <w:color w:val="000000"/>
+          <w:sz w:val="24"/>
+          <w:lang w:val="pt-BR" w:eastAsia="pt-BR" w:bidi="pt-BR"/>
+        </w:rPr>
+        <w:t>TIP 2025_02</w:t>
+      </w:r>
+      <w:r>
+        <w:rPr>
+          <w:rFonts w:ascii="Arial" w:eastAsia="Arial" w:hAnsi="Arial"/>
+          <w:color w:val="000000"/>
+          <w:lang w:val="pt-BR" w:eastAsia="pt-BR" w:bidi="pt-BR"/>
+        </w:rPr>
+        <w:t xml:space="preserve"> - Falta de manutenção adequada no banheiro feminino para PCD localizado no primeiro andar do Terminal de Recife (TIP) associada a três Não Conformidades.</w:t>
+      </w:r>
+    </w:p>
+    <w:tbl>
+      <w:tblPr>
+        <w:tblStyle w:val="Tabelacomgrade"/>
+        <w:tblW w:w="0" w:type="auto"/>
+        <w:jc w:val="center"/>
+        <w:tblLook w:val="04A0" w:firstRow="1" w:lastRow="0" w:firstColumn="1" w:lastColumn="0" w:noHBand="0" w:noVBand="1"/>
+      </w:tblPr>
+      <w:tblGrid>
+        <w:gridCol w:w="4428"/>
+        <w:gridCol w:w="4428"/>
+      </w:tblGrid>
+      <w:tr>
+        <w:trPr>
+          <w:jc w:val="center"/>
+        </w:trPr>
+        <w:tc>
+          <w:tcPr>
+            <w:tcW w:w="4680" w:type="dxa"/>
+          </w:tcPr>
+          <w:p>
+            <w:pPr>
+              <w:jc w:val="center"/>
+            </w:pPr>
+            <w:r>
+              <w:rPr>
+                <w:noProof/>
+              </w:rPr>
+              <w:lastRenderedPageBreak/>
+              <w:drawing>
+                <wp:inline distT="0" distB="0" distL="0" distR="0" wp14:anchorId="5DEE687C" wp14:editId="1E2B3711">
+                  <wp:extent cx="2743200" cy="2468880"/>
+                  <wp:effectExtent l="0" t="0" r="0" b="0"/>
+                  <wp:docPr id="4" name="Picture 4"/>
+                  <wp:cNvGraphicFramePr>
+                    <a:graphicFrameLocks xmlns:a="http://schemas.openxmlformats.org/drawingml/2006/main" noChangeAspect="1"/>
+                  </wp:cNvGraphicFramePr>
+                  <a:graphic xmlns:a="http://schemas.openxmlformats.org/drawingml/2006/main">
+                    <a:graphicData uri="http://schemas.openxmlformats.org/drawingml/2006/picture">
+                      <pic:pic xmlns:pic="http://schemas.openxmlformats.org/drawingml/2006/picture">
+                        <pic:nvPicPr>
+                          <pic:cNvPr id="0" name="image.jpg"/>
+                          <pic:cNvPicPr/>
+                        </pic:nvPicPr>
+                        <pic:blipFill>
+                          <a:blip r:embed="rId9"/>
+                          <a:stretch>
+                            <a:fillRect/>
+                          </a:stretch>
+                        </pic:blipFill>
+                        <pic:spPr>
+                          <a:xfrm>
+                            <a:off x="0" y="0"/>
+                            <a:ext cx="2743200" cy="2468880"/>
+                          </a:xfrm>
+                          <a:prstGeom prst="rect">
+                            <a:avLst/>
+                          </a:prstGeom>
+                        </pic:spPr>
+                      </pic:pic>
+                    </a:graphicData>
+                  </a:graphic>
+                </wp:inline>
+              </w:drawing>
+            </w:r>
+          </w:p>
+        </w:tc>
+        <w:tc>
+          <w:tcPr>
+            <w:tcW w:w="4680" w:type="dxa"/>
+          </w:tcPr>
+          <w:p>
+            <w:pPr>
+              <w:jc w:val="center"/>
+            </w:pPr>
+            <w:r>
+              <w:rPr>
+                <w:noProof/>
+              </w:rPr>
+              <w:drawing>
+                <wp:inline distT="0" distB="0" distL="0" distR="0" wp14:anchorId="7AEC47D6" wp14:editId="558CD394">
+                  <wp:extent cx="2743200" cy="2468880"/>
+                  <wp:effectExtent l="0" t="0" r="0" b="0"/>
+                  <wp:docPr id="5" name="Picture 5"/>
+                  <wp:cNvGraphicFramePr>
+                    <a:graphicFrameLocks xmlns:a="http://schemas.openxmlformats.org/drawingml/2006/main" noChangeAspect="1"/>
+                  </wp:cNvGraphicFramePr>
+                  <a:graphic xmlns:a="http://schemas.openxmlformats.org/drawingml/2006/main">
+                    <a:graphicData uri="http://schemas.openxmlformats.org/drawingml/2006/picture">
+                      <pic:pic xmlns:pic="http://schemas.openxmlformats.org/drawingml/2006/picture">
+                        <pic:nvPicPr>
+                          <pic:cNvPr id="0" name="image.jpg"/>
+                          <pic:cNvPicPr/>
+                        </pic:nvPicPr>
+                        <pic:blipFill>
+                          <a:blip r:embed="rId10"/>
+                          <a:stretch>
+                            <a:fillRect/>
+                          </a:stretch>
+                        </pic:blipFill>
+                        <pic:spPr>
+                          <a:xfrm>
+                            <a:off x="0" y="0"/>
+                            <a:ext cx="2743200" cy="2468880"/>
+                          </a:xfrm>
+                          <a:prstGeom prst="rect">
+                            <a:avLst/>
+                          </a:prstGeom>
+                        </pic:spPr>
+                      </pic:pic>
+                    </a:graphicData>
+                  </a:graphic>
+                </wp:inline>
+              </w:drawing>
+            </w:r>
+          </w:p>
+        </w:tc>
+      </w:tr>
+      <w:tr>
+        <w:trPr>
+          <w:jc w:val="center"/>
+        </w:trPr>
+        <w:tc>
+          <w:tcPr>
+            <w:tcW w:w="4680" w:type="dxa"/>
+          </w:tcPr>
+          <w:p>
+            <w:r>
+              <w:rPr>
+                <w:rFonts w:ascii="Arial" w:eastAsia="Arial" w:hAnsi="Arial"/>
+                <w:color w:val="5A5A5A"/>
+                <w:sz w:val="20"/>
+                <w:lang w:val="pt-BR" w:eastAsia="pt-BR" w:bidi="pt-BR"/>
+              </w:rPr>
+              <w:t>Barras repintadas, mas espelho ainda oxidado no banheiro feminino para PCD do Terminal de Recife em 18/06/2025</w:t>
+            </w:r>
+          </w:p>
+        </w:tc>
+        <w:tc>
+          <w:tcPr>
+            <w:tcW w:w="4680" w:type="dxa"/>
+          </w:tcPr>
+          <w:p>
+            <w:r>
+              <w:rPr>
+                <w:rFonts w:ascii="Arial" w:eastAsia="Arial" w:hAnsi="Arial"/>
+                <w:color w:val="5A5A5A"/>
+                <w:sz w:val="20"/>
+                <w:lang w:val="pt-BR" w:eastAsia="pt-BR" w:bidi="pt-BR"/>
+              </w:rPr>
+              <w:t>Espelho substituído no banheiro feminino para PCD 30/09/2025.</w:t>
             </w:r>
           </w:p>
         </w:tc>
@@ -5672,12 +5273,11 @@
               <w:rPr>
                 <w:noProof/>
               </w:rPr>
-              <w:lastRenderedPageBreak/>
               <w:drawing>
-                <wp:inline distT="0" distB="0" distL="0" distR="0" wp14:anchorId="3C58B4D3" wp14:editId="321DE735">
+                <wp:inline distT="0" distB="0" distL="0" distR="0" wp14:anchorId="169DB1E8" wp14:editId="3ABEBC4A">
                   <wp:extent cx="5486400" cy="3082916"/>
                   <wp:effectExtent l="0" t="0" r="0" b="0"/>
-                  <wp:docPr id="4" name="Picture 4"/>
+                  <wp:docPr id="6" name="Picture 6"/>
                   <wp:cNvGraphicFramePr>
                     <a:graphicFrameLocks xmlns:a="http://schemas.openxmlformats.org/drawingml/2006/main" noChangeAspect="1"/>
                   </wp:cNvGraphicFramePr>
@@ -5689,7 +5289,7 @@
                           <pic:cNvPicPr/>
                         </pic:nvPicPr>
                         <pic:blipFill>
-                          <a:blip r:embed="rId9"/>
+                          <a:blip r:embed="rId11"/>
                           <a:stretch>
                             <a:fillRect/>
                           </a:stretch>
@@ -5728,7 +5328,7 @@
                 <w:sz w:val="20"/>
                 <w:lang w:val="pt-BR" w:eastAsia="pt-BR" w:bidi="pt-BR"/>
               </w:rPr>
-              <w:t>Porta com avaria no banheiro feminino do primeiro andar do Terminal de Recife (TIP).</w:t>
+              <w:t>Porta com avaria no banheiro feminino no Terminal de Recife em 18/06/2025.</w:t>
             </w:r>
           </w:p>
         </w:tc>
@@ -5927,31 +5527,31 @@
       </w:rPr>
     </w:lvl>
   </w:abstractNum>
-  <w:num w:numId="1" w16cid:durableId="459156955">
+  <w:num w:numId="1" w16cid:durableId="258147621">
     <w:abstractNumId w:val="8"/>
   </w:num>
-  <w:num w:numId="2" w16cid:durableId="1568496989">
+  <w:num w:numId="2" w16cid:durableId="551844274">
     <w:abstractNumId w:val="6"/>
   </w:num>
-  <w:num w:numId="3" w16cid:durableId="1423910804">
+  <w:num w:numId="3" w16cid:durableId="1739205807">
     <w:abstractNumId w:val="5"/>
   </w:num>
-  <w:num w:numId="4" w16cid:durableId="239875287">
+  <w:num w:numId="4" w16cid:durableId="134415020">
     <w:abstractNumId w:val="4"/>
   </w:num>
-  <w:num w:numId="5" w16cid:durableId="430517355">
+  <w:num w:numId="5" w16cid:durableId="954679691">
     <w:abstractNumId w:val="7"/>
   </w:num>
-  <w:num w:numId="6" w16cid:durableId="27224500">
+  <w:num w:numId="6" w16cid:durableId="501312862">
     <w:abstractNumId w:val="3"/>
   </w:num>
-  <w:num w:numId="7" w16cid:durableId="334696341">
+  <w:num w:numId="7" w16cid:durableId="444615351">
     <w:abstractNumId w:val="2"/>
   </w:num>
-  <w:num w:numId="8" w16cid:durableId="1307512674">
+  <w:num w:numId="8" w16cid:durableId="716321873">
     <w:abstractNumId w:val="1"/>
   </w:num>
-  <w:num w:numId="9" w16cid:durableId="549419150">
+  <w:num w:numId="9" w16cid:durableId="2131196261">
     <w:abstractNumId w:val="0"/>
   </w:num>
 </w:numbering>
@@ -17344,7 +16944,7 @@
     <w:autoRedefine/>
     <w:uiPriority w:val="39"/>
     <w:unhideWhenUsed/>
-    <w:rsid w:val="009F325E"/>
+    <w:rsid w:val="00370CC1"/>
     <w:pPr>
       <w:spacing w:after="100"/>
     </w:pPr>
@@ -17356,7 +16956,7 @@
     <w:autoRedefine/>
     <w:uiPriority w:val="39"/>
     <w:unhideWhenUsed/>
-    <w:rsid w:val="009F325E"/>
+    <w:rsid w:val="00370CC1"/>
     <w:pPr>
       <w:spacing w:after="100"/>
       <w:ind w:left="220"/>
@@ -17367,7 +16967,7 @@
     <w:basedOn w:val="Fontepargpadro"/>
     <w:uiPriority w:val="99"/>
     <w:unhideWhenUsed/>
-    <w:rsid w:val="009F325E"/>
+    <w:rsid w:val="00370CC1"/>
     <w:rPr>
       <w:color w:val="0000FF" w:themeColor="hyperlink"/>
       <w:u w:val="single"/>

</xml_diff>

<commit_message>
fix: corrige filtro de terminais e adiciona logs de debug no utils.py
</commit_message>
<xml_diff>
--- a/src/reports/relatorio_1.docx
+++ b/src/reports/relatorio_1.docx
@@ -44,7 +44,7 @@
           <w:noProof/>
         </w:rPr>
         <w:drawing>
-          <wp:inline distT="0" distB="0" distL="0" distR="0" wp14:anchorId="734BCBE1" wp14:editId="3DD969D4">
+          <wp:inline distT="0" distB="0" distL="0" distR="0" wp14:anchorId="11558DF2" wp14:editId="1A334034">
             <wp:extent cx="5943600" cy="5029200"/>
             <wp:effectExtent l="0" t="0" r="0" b="0"/>
             <wp:docPr id="1" name="Picture 1"/>
@@ -187,7 +187,7 @@
       <w:r>
         <w:fldChar w:fldCharType="separate"/>
       </w:r>
-      <w:hyperlink w:anchor="_Toc214961113" w:history="1">
+      <w:hyperlink w:anchor="_Toc215211539" w:history="1">
         <w:r>
           <w:rPr>
             <w:rStyle w:val="Hyperlink"/>
@@ -217,7 +217,7 @@
             <w:noProof/>
             <w:webHidden/>
           </w:rPr>
-          <w:instrText xml:space="preserve"> PAGEREF _Toc214961113 \h </w:instrText>
+          <w:instrText xml:space="preserve"> PAGEREF _Toc215211539 \h </w:instrText>
         </w:r>
         <w:r>
           <w:rPr>
@@ -258,7 +258,7 @@
           <w:noProof/>
         </w:rPr>
       </w:pPr>
-      <w:hyperlink w:anchor="_Toc214961114" w:history="1">
+      <w:hyperlink w:anchor="_Toc215211540" w:history="1">
         <w:r>
           <w:rPr>
             <w:rStyle w:val="Hyperlink"/>
@@ -288,7 +288,7 @@
             <w:noProof/>
             <w:webHidden/>
           </w:rPr>
-          <w:instrText xml:space="preserve"> PAGEREF _Toc214961114 \h </w:instrText>
+          <w:instrText xml:space="preserve"> PAGEREF _Toc215211540 \h </w:instrText>
         </w:r>
         <w:r>
           <w:rPr>
@@ -329,7 +329,7 @@
           <w:noProof/>
         </w:rPr>
       </w:pPr>
-      <w:hyperlink w:anchor="_Toc214961115" w:history="1">
+      <w:hyperlink w:anchor="_Toc215211541" w:history="1">
         <w:r>
           <w:rPr>
             <w:rStyle w:val="Hyperlink"/>
@@ -359,7 +359,7 @@
             <w:noProof/>
             <w:webHidden/>
           </w:rPr>
-          <w:instrText xml:space="preserve"> PAGEREF _Toc214961115 \h </w:instrText>
+          <w:instrText xml:space="preserve"> PAGEREF _Toc215211541 \h </w:instrText>
         </w:r>
         <w:r>
           <w:rPr>
@@ -400,7 +400,7 @@
           <w:noProof/>
         </w:rPr>
       </w:pPr>
-      <w:hyperlink w:anchor="_Toc214961116" w:history="1">
+      <w:hyperlink w:anchor="_Toc215211542" w:history="1">
         <w:r>
           <w:rPr>
             <w:rStyle w:val="Hyperlink"/>
@@ -430,7 +430,7 @@
             <w:noProof/>
             <w:webHidden/>
           </w:rPr>
-          <w:instrText xml:space="preserve"> PAGEREF _Toc214961116 \h </w:instrText>
+          <w:instrText xml:space="preserve"> PAGEREF _Toc215211542 \h </w:instrText>
         </w:r>
         <w:r>
           <w:rPr>
@@ -450,7 +450,7 @@
             <w:noProof/>
             <w:webHidden/>
           </w:rPr>
-          <w:t>6</w:t>
+          <w:t>7</w:t>
         </w:r>
         <w:r>
           <w:rPr>
@@ -471,7 +471,7 @@
           <w:noProof/>
         </w:rPr>
       </w:pPr>
-      <w:hyperlink w:anchor="_Toc214961117" w:history="1">
+      <w:hyperlink w:anchor="_Toc215211543" w:history="1">
         <w:r>
           <w:rPr>
             <w:rStyle w:val="Hyperlink"/>
@@ -501,7 +501,7 @@
             <w:noProof/>
             <w:webHidden/>
           </w:rPr>
-          <w:instrText xml:space="preserve"> PAGEREF _Toc214961117 \h </w:instrText>
+          <w:instrText xml:space="preserve"> PAGEREF _Toc215211543 \h </w:instrText>
         </w:r>
         <w:r>
           <w:rPr>
@@ -521,7 +521,7 @@
             <w:noProof/>
             <w:webHidden/>
           </w:rPr>
-          <w:t>9</w:t>
+          <w:t>10</w:t>
         </w:r>
         <w:r>
           <w:rPr>
@@ -542,7 +542,7 @@
           <w:noProof/>
         </w:rPr>
       </w:pPr>
-      <w:hyperlink w:anchor="_Toc214961118" w:history="1">
+      <w:hyperlink w:anchor="_Toc215211544" w:history="1">
         <w:r>
           <w:rPr>
             <w:rStyle w:val="Hyperlink"/>
@@ -572,7 +572,7 @@
             <w:noProof/>
             <w:webHidden/>
           </w:rPr>
-          <w:instrText xml:space="preserve"> PAGEREF _Toc214961118 \h </w:instrText>
+          <w:instrText xml:space="preserve"> PAGEREF _Toc215211544 \h </w:instrText>
         </w:r>
         <w:r>
           <w:rPr>
@@ -592,7 +592,7 @@
             <w:noProof/>
             <w:webHidden/>
           </w:rPr>
-          <w:t>11</w:t>
+          <w:t>12</w:t>
         </w:r>
         <w:r>
           <w:rPr>
@@ -613,7 +613,7 @@
           <w:noProof/>
         </w:rPr>
       </w:pPr>
-      <w:hyperlink w:anchor="_Toc214961119" w:history="1">
+      <w:hyperlink w:anchor="_Toc215211545" w:history="1">
         <w:r>
           <w:rPr>
             <w:rStyle w:val="Hyperlink"/>
@@ -643,7 +643,7 @@
             <w:noProof/>
             <w:webHidden/>
           </w:rPr>
-          <w:instrText xml:space="preserve"> PAGEREF _Toc214961119 \h </w:instrText>
+          <w:instrText xml:space="preserve"> PAGEREF _Toc215211545 \h </w:instrText>
         </w:r>
         <w:r>
           <w:rPr>
@@ -663,7 +663,7 @@
             <w:noProof/>
             <w:webHidden/>
           </w:rPr>
-          <w:t>11</w:t>
+          <w:t>12</w:t>
         </w:r>
         <w:r>
           <w:rPr>
@@ -694,7 +694,7 @@
         <w:pStyle w:val="Ttulo1"/>
         <w:spacing w:after="120"/>
       </w:pPr>
-      <w:bookmarkStart w:id="0" w:name="_Toc214961113"/>
+      <w:bookmarkStart w:id="0" w:name="_Toc215211539"/>
       <w:r>
         <w:rPr>
           <w:rFonts w:ascii="Arial" w:eastAsia="Arial" w:hAnsi="Arial"/>
@@ -767,7 +767,7 @@
         <w:pStyle w:val="Ttulo1"/>
         <w:spacing w:after="120"/>
       </w:pPr>
-      <w:bookmarkStart w:id="1" w:name="_Toc214961114"/>
+      <w:bookmarkStart w:id="1" w:name="_Toc215211540"/>
       <w:r>
         <w:rPr>
           <w:rFonts w:ascii="Arial" w:eastAsia="Arial" w:hAnsi="Arial"/>
@@ -798,7 +798,7 @@
         <w:pStyle w:val="Ttulo1"/>
         <w:spacing w:after="120"/>
       </w:pPr>
-      <w:bookmarkStart w:id="2" w:name="_Toc214961115"/>
+      <w:bookmarkStart w:id="2" w:name="_Toc215211541"/>
       <w:r>
         <w:rPr>
           <w:rFonts w:ascii="Arial" w:eastAsia="Arial" w:hAnsi="Arial"/>
@@ -859,7 +859,7 @@
           <w:color w:val="000000"/>
           <w:lang w:val="pt-BR" w:eastAsia="pt-BR" w:bidi="pt-BR"/>
         </w:rPr>
-        <w:t xml:space="preserve"> - Área precisando de capinação no pátio de manobras do Terminal de Caruaru</w:t>
+        <w:t xml:space="preserve">  Área precisando de capinação no pátio de manobras do Terminal de Caruaru</w:t>
       </w:r>
     </w:p>
     <w:p>
@@ -905,7 +905,7 @@
           <w:color w:val="000000"/>
           <w:lang w:val="pt-BR" w:eastAsia="pt-BR" w:bidi="pt-BR"/>
         </w:rPr>
-        <w:t>N/A</w:t>
+        <w:t>Falta de capinação no pátio de manobras do Terminal de Caruaru em 09/06/2025.</w:t>
       </w:r>
     </w:p>
     <w:p>
@@ -948,6 +948,7 @@
           <w:u w:val="single"/>
           <w:lang w:val="pt-BR" w:eastAsia="pt-BR" w:bidi="pt-BR"/>
         </w:rPr>
+        <w:lastRenderedPageBreak/>
         <w:t>Não Conformidade CAR 2025_04</w:t>
       </w:r>
       <w:r>
@@ -956,7 +957,7 @@
           <w:color w:val="000000"/>
           <w:lang w:val="pt-BR" w:eastAsia="pt-BR" w:bidi="pt-BR"/>
         </w:rPr>
-        <w:t xml:space="preserve"> - Área precisando de capinação no terreno lateral do Terminal de Caruaru</w:t>
+        <w:t xml:space="preserve">  Área precisando de capinação no terreno lateral do Terminal de Caruaru</w:t>
       </w:r>
     </w:p>
     <w:p>
@@ -971,7 +972,6 @@
           <w:color w:val="000000"/>
           <w:lang w:val="pt-BR" w:eastAsia="pt-BR" w:bidi="pt-BR"/>
         </w:rPr>
-        <w:lastRenderedPageBreak/>
         <w:t xml:space="preserve">Informação da SOCICAM: </w:t>
       </w:r>
       <w:r>
@@ -1003,7 +1003,7 @@
           <w:color w:val="000000"/>
           <w:lang w:val="pt-BR" w:eastAsia="pt-BR" w:bidi="pt-BR"/>
         </w:rPr>
-        <w:t>N/A</w:t>
+        <w:t>Falta capinação no terreno lateral do Terminal de Caruaru em 09/06/2025.</w:t>
       </w:r>
     </w:p>
     <w:p>
@@ -1054,7 +1054,7 @@
           <w:color w:val="000000"/>
           <w:lang w:val="pt-BR" w:eastAsia="pt-BR" w:bidi="pt-BR"/>
         </w:rPr>
-        <w:t xml:space="preserve"> - Área com infiltração na fachada lateral do Terminal de Caruaru</w:t>
+        <w:t xml:space="preserve">  Área com infiltração na fachada lateral do Terminal de Caruaru</w:t>
       </w:r>
     </w:p>
     <w:p>
@@ -1100,7 +1100,7 @@
           <w:color w:val="000000"/>
           <w:lang w:val="pt-BR" w:eastAsia="pt-BR" w:bidi="pt-BR"/>
         </w:rPr>
-        <w:t>N/A</w:t>
+        <w:t>Detalhe da infiltração na parte lateral do Terminal de Caruaru em 09/06/2025.</w:t>
       </w:r>
     </w:p>
     <w:p>
@@ -1151,7 +1151,7 @@
           <w:color w:val="000000"/>
           <w:lang w:val="pt-BR" w:eastAsia="pt-BR" w:bidi="pt-BR"/>
         </w:rPr>
-        <w:t xml:space="preserve"> - Pintura desgastada no muro e na grade do pátio de manobra no Terminal de Caruaru</w:t>
+        <w:t xml:space="preserve">  Pintura desgastada no muro e na grade do pátio de manobra no Terminal de Caruaru</w:t>
       </w:r>
     </w:p>
     <w:p>
@@ -1197,7 +1197,7 @@
           <w:color w:val="000000"/>
           <w:lang w:val="pt-BR" w:eastAsia="pt-BR" w:bidi="pt-BR"/>
         </w:rPr>
-        <w:t>N/A</w:t>
+        <w:t>Muro e grade internos com pinturas desgastadas no pátio de manobras do Terminal de Caruaru em 09/06/2025.</w:t>
       </w:r>
     </w:p>
     <w:p>
@@ -1240,15 +1240,15 @@
           <w:u w:val="single"/>
           <w:lang w:val="pt-BR" w:eastAsia="pt-BR" w:bidi="pt-BR"/>
         </w:rPr>
-        <w:t>Não Conformidade CAR 2025_08</w:t>
-      </w:r>
-      <w:r>
-        <w:rPr>
-          <w:rFonts w:ascii="Arial" w:eastAsia="Arial" w:hAnsi="Arial"/>
-          <w:color w:val="000000"/>
-          <w:lang w:val="pt-BR" w:eastAsia="pt-BR" w:bidi="pt-BR"/>
-        </w:rPr>
-        <w:t xml:space="preserve"> - Vidraças na parte administrativa precisando de limpeza no Terminal de Caruaru</w:t>
+        <w:t>Não Conformidade CAR 2025_07</w:t>
+      </w:r>
+      <w:r>
+        <w:rPr>
+          <w:rFonts w:ascii="Arial" w:eastAsia="Arial" w:hAnsi="Arial"/>
+          <w:color w:val="000000"/>
+          <w:lang w:val="pt-BR" w:eastAsia="pt-BR" w:bidi="pt-BR"/>
+        </w:rPr>
+        <w:t xml:space="preserve">  Pintura desgastada no muro lateral no Terminal de Caruaru</w:t>
       </w:r>
     </w:p>
     <w:p>
@@ -1294,7 +1294,7 @@
           <w:color w:val="000000"/>
           <w:lang w:val="pt-BR" w:eastAsia="pt-BR" w:bidi="pt-BR"/>
         </w:rPr>
-        <w:t>N/A</w:t>
+        <w:t>Muro externo continua com pintura desgastada do Terminal de Caruaru em 25/09/2025.</w:t>
       </w:r>
     </w:p>
     <w:p>
@@ -1337,15 +1337,15 @@
           <w:u w:val="single"/>
           <w:lang w:val="pt-BR" w:eastAsia="pt-BR" w:bidi="pt-BR"/>
         </w:rPr>
-        <w:t>Não Conformidade CAR 2025_09</w:t>
-      </w:r>
-      <w:r>
-        <w:rPr>
-          <w:rFonts w:ascii="Arial" w:eastAsia="Arial" w:hAnsi="Arial"/>
-          <w:color w:val="000000"/>
-          <w:lang w:val="pt-BR" w:eastAsia="pt-BR" w:bidi="pt-BR"/>
-        </w:rPr>
-        <w:t xml:space="preserve"> - Meio-fio desgastado na entrada do Terminal de Caruaru</w:t>
+        <w:t>Não Conformidade CAR 2025_08</w:t>
+      </w:r>
+      <w:r>
+        <w:rPr>
+          <w:rFonts w:ascii="Arial" w:eastAsia="Arial" w:hAnsi="Arial"/>
+          <w:color w:val="000000"/>
+          <w:lang w:val="pt-BR" w:eastAsia="pt-BR" w:bidi="pt-BR"/>
+        </w:rPr>
+        <w:t xml:space="preserve">  Vidraças na parte administrativa precisando de limpeza no Terminal de Caruaru</w:t>
       </w:r>
     </w:p>
     <w:p>
@@ -1391,7 +1391,7 @@
           <w:color w:val="000000"/>
           <w:lang w:val="pt-BR" w:eastAsia="pt-BR" w:bidi="pt-BR"/>
         </w:rPr>
-        <w:t>N/A</w:t>
+        <w:t>Vidraças na parte administrativa precisando de limpeza no Terminal de Caruaru em 09/06/2025.</w:t>
       </w:r>
     </w:p>
     <w:p>
@@ -1434,15 +1434,15 @@
           <w:u w:val="single"/>
           <w:lang w:val="pt-BR" w:eastAsia="pt-BR" w:bidi="pt-BR"/>
         </w:rPr>
-        <w:t>Não Conformidade CAR 2025_10</w:t>
-      </w:r>
-      <w:r>
-        <w:rPr>
-          <w:rFonts w:ascii="Arial" w:eastAsia="Arial" w:hAnsi="Arial"/>
-          <w:color w:val="000000"/>
-          <w:lang w:val="pt-BR" w:eastAsia="pt-BR" w:bidi="pt-BR"/>
-        </w:rPr>
-        <w:t xml:space="preserve"> - Rampa para PCD desgastada no Terminal de Caruaru</w:t>
+        <w:t>Não Conformidade CAR 2025_09</w:t>
+      </w:r>
+      <w:r>
+        <w:rPr>
+          <w:rFonts w:ascii="Arial" w:eastAsia="Arial" w:hAnsi="Arial"/>
+          <w:color w:val="000000"/>
+          <w:lang w:val="pt-BR" w:eastAsia="pt-BR" w:bidi="pt-BR"/>
+        </w:rPr>
+        <w:t xml:space="preserve">  Meio-fio desgastado na entrada do Terminal de Caruaru</w:t>
       </w:r>
     </w:p>
     <w:p>
@@ -1488,7 +1488,7 @@
           <w:color w:val="000000"/>
           <w:lang w:val="pt-BR" w:eastAsia="pt-BR" w:bidi="pt-BR"/>
         </w:rPr>
-        <w:t>N/A</w:t>
+        <w:t>Meio-fio desgastado na entrada do Terminal de Caruaru em 09/06/2025.</w:t>
       </w:r>
     </w:p>
     <w:p>
@@ -1531,15 +1531,16 @@
           <w:u w:val="single"/>
           <w:lang w:val="pt-BR" w:eastAsia="pt-BR" w:bidi="pt-BR"/>
         </w:rPr>
-        <w:t>Não Conformidade CAR 2025_11</w:t>
-      </w:r>
-      <w:r>
-        <w:rPr>
-          <w:rFonts w:ascii="Arial" w:eastAsia="Arial" w:hAnsi="Arial"/>
-          <w:color w:val="000000"/>
-          <w:lang w:val="pt-BR" w:eastAsia="pt-BR" w:bidi="pt-BR"/>
-        </w:rPr>
-        <w:t xml:space="preserve"> - Desgaste do pavimento na rampa de carga e descarga na entrada do Terminal de Caruaru</w:t>
+        <w:lastRenderedPageBreak/>
+        <w:t>Não Conformidade CAR 2025_10</w:t>
+      </w:r>
+      <w:r>
+        <w:rPr>
+          <w:rFonts w:ascii="Arial" w:eastAsia="Arial" w:hAnsi="Arial"/>
+          <w:color w:val="000000"/>
+          <w:lang w:val="pt-BR" w:eastAsia="pt-BR" w:bidi="pt-BR"/>
+        </w:rPr>
+        <w:t xml:space="preserve">  Rampa para PCD desgastada no Terminal de Caruaru</w:t>
       </w:r>
     </w:p>
     <w:p>
@@ -1585,7 +1586,7 @@
           <w:color w:val="000000"/>
           <w:lang w:val="pt-BR" w:eastAsia="pt-BR" w:bidi="pt-BR"/>
         </w:rPr>
-        <w:t>N/A</w:t>
+        <w:t>Rampa para PCD desgastada no Terminal de Caruaru em 09/06/2025.</w:t>
       </w:r>
     </w:p>
     <w:p>
@@ -1618,22 +1619,30 @@
     </w:p>
     <w:p>
       <w:pPr>
-        <w:spacing w:before="240"/>
+        <w:jc w:val="lowKashida"/>
       </w:pPr>
       <w:r>
         <w:rPr>
           <w:rFonts w:ascii="Arial" w:eastAsia="Arial" w:hAnsi="Arial"/>
           <w:b/>
           <w:color w:val="000000"/>
-          <w:sz w:val="24"/>
-          <w:lang w:val="pt-BR" w:eastAsia="pt-BR" w:bidi="pt-BR"/>
-        </w:rPr>
-        <w:lastRenderedPageBreak/>
-        <w:t>3.2 - TERMINAL DE GARANHUNS (GAR)</w:t>
+          <w:u w:val="single"/>
+          <w:lang w:val="pt-BR" w:eastAsia="pt-BR" w:bidi="pt-BR"/>
+        </w:rPr>
+        <w:t>Não Conformidade CAR 2025_11</w:t>
+      </w:r>
+      <w:r>
+        <w:rPr>
+          <w:rFonts w:ascii="Arial" w:eastAsia="Arial" w:hAnsi="Arial"/>
+          <w:color w:val="000000"/>
+          <w:lang w:val="pt-BR" w:eastAsia="pt-BR" w:bidi="pt-BR"/>
+        </w:rPr>
+        <w:t xml:space="preserve">  Desgaste do pavimento na rampa de carga e descarga na entrada do Terminal de Caruaru</w:t>
       </w:r>
     </w:p>
     <w:p>
       <w:pPr>
+        <w:spacing w:after="0" w:line="260" w:lineRule="exact"/>
         <w:jc w:val="lowKashida"/>
       </w:pPr>
       <w:r>
@@ -1641,18 +1650,17 @@
           <w:rFonts w:ascii="Arial" w:eastAsia="Arial" w:hAnsi="Arial"/>
           <w:b/>
           <w:color w:val="000000"/>
-          <w:u w:val="single"/>
-          <w:lang w:val="pt-BR" w:eastAsia="pt-BR" w:bidi="pt-BR"/>
-        </w:rPr>
-        <w:t>Não Conformidade GAR 2025_07</w:t>
-      </w:r>
-      <w:r>
-        <w:rPr>
-          <w:rFonts w:ascii="Arial" w:eastAsia="Arial" w:hAnsi="Arial"/>
-          <w:color w:val="000000"/>
-          <w:lang w:val="pt-BR" w:eastAsia="pt-BR" w:bidi="pt-BR"/>
-        </w:rPr>
-        <w:t xml:space="preserve"> - Pintura desgastada no muro da lateral do Terminal de Garanhuns</w:t>
+          <w:lang w:val="pt-BR" w:eastAsia="pt-BR" w:bidi="pt-BR"/>
+        </w:rPr>
+        <w:t xml:space="preserve">Informação da SOCICAM: </w:t>
+      </w:r>
+      <w:r>
+        <w:rPr>
+          <w:rFonts w:ascii="Arial" w:eastAsia="Arial" w:hAnsi="Arial"/>
+          <w:color w:val="000000"/>
+          <w:lang w:val="pt-BR" w:eastAsia="pt-BR" w:bidi="pt-BR"/>
+        </w:rPr>
+        <w:t>N/A</w:t>
       </w:r>
     </w:p>
     <w:p>
@@ -1667,15 +1675,15 @@
           <w:color w:val="000000"/>
           <w:lang w:val="pt-BR" w:eastAsia="pt-BR" w:bidi="pt-BR"/>
         </w:rPr>
-        <w:t xml:space="preserve">Informação da SOCICAM: </w:t>
-      </w:r>
-      <w:r>
-        <w:rPr>
-          <w:rFonts w:ascii="Arial" w:eastAsia="Arial" w:hAnsi="Arial"/>
-          <w:color w:val="000000"/>
-          <w:lang w:val="pt-BR" w:eastAsia="pt-BR" w:bidi="pt-BR"/>
-        </w:rPr>
-        <w:t>N/A</w:t>
+        <w:t xml:space="preserve">Constatação: </w:t>
+      </w:r>
+      <w:r>
+        <w:rPr>
+          <w:rFonts w:ascii="Arial" w:eastAsia="Arial" w:hAnsi="Arial"/>
+          <w:color w:val="000000"/>
+          <w:lang w:val="pt-BR" w:eastAsia="pt-BR" w:bidi="pt-BR"/>
+        </w:rPr>
+        <w:t>Rampa de carga e descarga com desgaste no pavimento na entrada do Terminal de Caruaru em 09/06/2025.</w:t>
       </w:r>
     </w:p>
     <w:p>
@@ -1690,7 +1698,7 @@
           <w:color w:val="000000"/>
           <w:lang w:val="pt-BR" w:eastAsia="pt-BR" w:bidi="pt-BR"/>
         </w:rPr>
-        <w:t xml:space="preserve">Constatação: </w:t>
+        <w:t xml:space="preserve">Análise da ARPE: </w:t>
       </w:r>
       <w:r>
         <w:rPr>
@@ -1703,6 +1711,49 @@
     </w:p>
     <w:p>
       <w:pPr>
+        <w:spacing w:after="240"/>
+      </w:pPr>
+    </w:p>
+    <w:p>
+      <w:pPr>
+        <w:spacing w:before="240"/>
+      </w:pPr>
+      <w:r>
+        <w:rPr>
+          <w:rFonts w:ascii="Arial" w:eastAsia="Arial" w:hAnsi="Arial"/>
+          <w:b/>
+          <w:color w:val="000000"/>
+          <w:sz w:val="24"/>
+          <w:lang w:val="pt-BR" w:eastAsia="pt-BR" w:bidi="pt-BR"/>
+        </w:rPr>
+        <w:t>3.2 - TERMINAL DE GARANHUNS (GAR)</w:t>
+      </w:r>
+    </w:p>
+    <w:p>
+      <w:pPr>
+        <w:jc w:val="lowKashida"/>
+      </w:pPr>
+      <w:r>
+        <w:rPr>
+          <w:rFonts w:ascii="Arial" w:eastAsia="Arial" w:hAnsi="Arial"/>
+          <w:b/>
+          <w:color w:val="000000"/>
+          <w:u w:val="single"/>
+          <w:lang w:val="pt-BR" w:eastAsia="pt-BR" w:bidi="pt-BR"/>
+        </w:rPr>
+        <w:t>Não Conformidade GAR 2025_07</w:t>
+      </w:r>
+      <w:r>
+        <w:rPr>
+          <w:rFonts w:ascii="Arial" w:eastAsia="Arial" w:hAnsi="Arial"/>
+          <w:color w:val="000000"/>
+          <w:lang w:val="pt-BR" w:eastAsia="pt-BR" w:bidi="pt-BR"/>
+        </w:rPr>
+        <w:t xml:space="preserve">  Pintura desgastada no muro da lateral do Terminal de Garanhuns</w:t>
+      </w:r>
+    </w:p>
+    <w:p>
+      <w:pPr>
         <w:spacing w:after="0" w:line="260" w:lineRule="exact"/>
         <w:jc w:val="lowKashida"/>
       </w:pPr>
@@ -1713,7 +1764,7 @@
           <w:color w:val="000000"/>
           <w:lang w:val="pt-BR" w:eastAsia="pt-BR" w:bidi="pt-BR"/>
         </w:rPr>
-        <w:t xml:space="preserve">Análise da ARPE: </w:t>
+        <w:t xml:space="preserve">Informação da SOCICAM: </w:t>
       </w:r>
       <w:r>
         <w:rPr>
@@ -1726,11 +1777,30 @@
     </w:p>
     <w:p>
       <w:pPr>
-        <w:spacing w:after="240"/>
-      </w:pPr>
+        <w:spacing w:after="0" w:line="260" w:lineRule="exact"/>
+        <w:jc w:val="lowKashida"/>
+      </w:pPr>
+      <w:r>
+        <w:rPr>
+          <w:rFonts w:ascii="Arial" w:eastAsia="Arial" w:hAnsi="Arial"/>
+          <w:b/>
+          <w:color w:val="000000"/>
+          <w:lang w:val="pt-BR" w:eastAsia="pt-BR" w:bidi="pt-BR"/>
+        </w:rPr>
+        <w:t xml:space="preserve">Constatação: </w:t>
+      </w:r>
+      <w:r>
+        <w:rPr>
+          <w:rFonts w:ascii="Arial" w:eastAsia="Arial" w:hAnsi="Arial"/>
+          <w:color w:val="000000"/>
+          <w:lang w:val="pt-BR" w:eastAsia="pt-BR" w:bidi="pt-BR"/>
+        </w:rPr>
+        <w:t>Pintura desgastada do muro da lateral no Terminal de Garanhuns em 12/06/2025.</w:t>
+      </w:r>
     </w:p>
     <w:p>
       <w:pPr>
+        <w:spacing w:after="0" w:line="260" w:lineRule="exact"/>
         <w:jc w:val="lowKashida"/>
       </w:pPr>
       <w:r>
@@ -1738,22 +1808,49 @@
           <w:rFonts w:ascii="Arial" w:eastAsia="Arial" w:hAnsi="Arial"/>
           <w:b/>
           <w:color w:val="000000"/>
-          <w:u w:val="single"/>
-          <w:lang w:val="pt-BR" w:eastAsia="pt-BR" w:bidi="pt-BR"/>
-        </w:rPr>
-        <w:t>Não Conformidade GAR 2025_09</w:t>
-      </w:r>
-      <w:r>
-        <w:rPr>
-          <w:rFonts w:ascii="Arial" w:eastAsia="Arial" w:hAnsi="Arial"/>
-          <w:color w:val="000000"/>
-          <w:lang w:val="pt-BR" w:eastAsia="pt-BR" w:bidi="pt-BR"/>
-        </w:rPr>
-        <w:t xml:space="preserve"> - Pintura desgastada das colunas da entrada do Terminal de Garanhuns</w:t>
+          <w:lang w:val="pt-BR" w:eastAsia="pt-BR" w:bidi="pt-BR"/>
+        </w:rPr>
+        <w:t xml:space="preserve">Análise da ARPE: </w:t>
+      </w:r>
+      <w:r>
+        <w:rPr>
+          <w:rFonts w:ascii="Arial" w:eastAsia="Arial" w:hAnsi="Arial"/>
+          <w:color w:val="000000"/>
+          <w:lang w:val="pt-BR" w:eastAsia="pt-BR" w:bidi="pt-BR"/>
+        </w:rPr>
+        <w:t>N/A</w:t>
       </w:r>
     </w:p>
     <w:p>
       <w:pPr>
+        <w:spacing w:after="240"/>
+      </w:pPr>
+    </w:p>
+    <w:p>
+      <w:pPr>
+        <w:jc w:val="lowKashida"/>
+      </w:pPr>
+      <w:r>
+        <w:rPr>
+          <w:rFonts w:ascii="Arial" w:eastAsia="Arial" w:hAnsi="Arial"/>
+          <w:b/>
+          <w:color w:val="000000"/>
+          <w:u w:val="single"/>
+          <w:lang w:val="pt-BR" w:eastAsia="pt-BR" w:bidi="pt-BR"/>
+        </w:rPr>
+        <w:t>Não Conformidade GAR 2025_08</w:t>
+      </w:r>
+      <w:r>
+        <w:rPr>
+          <w:rFonts w:ascii="Arial" w:eastAsia="Arial" w:hAnsi="Arial"/>
+          <w:color w:val="000000"/>
+          <w:lang w:val="pt-BR" w:eastAsia="pt-BR" w:bidi="pt-BR"/>
+        </w:rPr>
+        <w:t xml:space="preserve">  Pintura desgastada do muro do pátio de manobras no Terminal de Garanhuns</w:t>
+      </w:r>
+    </w:p>
+    <w:p>
+      <w:pPr>
         <w:spacing w:after="0" w:line="260" w:lineRule="exact"/>
         <w:jc w:val="lowKashida"/>
       </w:pPr>
@@ -1795,7 +1892,7 @@
           <w:color w:val="000000"/>
           <w:lang w:val="pt-BR" w:eastAsia="pt-BR" w:bidi="pt-BR"/>
         </w:rPr>
-        <w:t>N/A</w:t>
+        <w:t>Pintura desgastada do muro da entrada do pátio de manobras no Terminal de Garanhuns em 12/06/2025.</w:t>
       </w:r>
     </w:p>
     <w:p>
@@ -1838,15 +1935,15 @@
           <w:u w:val="single"/>
           <w:lang w:val="pt-BR" w:eastAsia="pt-BR" w:bidi="pt-BR"/>
         </w:rPr>
-        <w:t>Não Conformidade GAR 2025_10</w:t>
-      </w:r>
-      <w:r>
-        <w:rPr>
-          <w:rFonts w:ascii="Arial" w:eastAsia="Arial" w:hAnsi="Arial"/>
-          <w:color w:val="000000"/>
-          <w:lang w:val="pt-BR" w:eastAsia="pt-BR" w:bidi="pt-BR"/>
-        </w:rPr>
-        <w:t xml:space="preserve"> - Pintura desgastada nas colunas da fachada do lado do pátio de manobras no Terminal de Garanhuns</w:t>
+        <w:t>Não Conformidade GAR 2025_09</w:t>
+      </w:r>
+      <w:r>
+        <w:rPr>
+          <w:rFonts w:ascii="Arial" w:eastAsia="Arial" w:hAnsi="Arial"/>
+          <w:color w:val="000000"/>
+          <w:lang w:val="pt-BR" w:eastAsia="pt-BR" w:bidi="pt-BR"/>
+        </w:rPr>
+        <w:t xml:space="preserve">  Pintura desgastada das colunas da entrada do Terminal de Garanhuns</w:t>
       </w:r>
     </w:p>
     <w:p>
@@ -1892,7 +1989,7 @@
           <w:color w:val="000000"/>
           <w:lang w:val="pt-BR" w:eastAsia="pt-BR" w:bidi="pt-BR"/>
         </w:rPr>
-        <w:t>N/A</w:t>
+        <w:t>Pintura desgastada das colunas da entrada do Terminal de Garanhuns em 12/06/2025.</w:t>
       </w:r>
     </w:p>
     <w:p>
@@ -1935,15 +2032,23 @@
           <w:u w:val="single"/>
           <w:lang w:val="pt-BR" w:eastAsia="pt-BR" w:bidi="pt-BR"/>
         </w:rPr>
-        <w:t>Não Conformidade GAR 2025_11</w:t>
-      </w:r>
-      <w:r>
-        <w:rPr>
-          <w:rFonts w:ascii="Arial" w:eastAsia="Arial" w:hAnsi="Arial"/>
-          <w:color w:val="000000"/>
-          <w:lang w:val="pt-BR" w:eastAsia="pt-BR" w:bidi="pt-BR"/>
-        </w:rPr>
-        <w:t xml:space="preserve"> - Pintura desgastada na parede lateral direita no Terminal de Garanhuns</w:t>
+        <w:t>Não Conformidade GAR 2025_10</w:t>
+      </w:r>
+      <w:r>
+        <w:rPr>
+          <w:rFonts w:ascii="Arial" w:eastAsia="Arial" w:hAnsi="Arial"/>
+          <w:color w:val="000000"/>
+          <w:lang w:val="pt-BR" w:eastAsia="pt-BR" w:bidi="pt-BR"/>
+        </w:rPr>
+        <w:t xml:space="preserve">  </w:t>
+      </w:r>
+      <w:r>
+        <w:rPr>
+          <w:rFonts w:ascii="Arial" w:eastAsia="Arial" w:hAnsi="Arial"/>
+          <w:color w:val="000000"/>
+          <w:lang w:val="pt-BR" w:eastAsia="pt-BR" w:bidi="pt-BR"/>
+        </w:rPr>
+        <w:t>Pintura desgastada nas colunas da fachada do lado do pátio de manobras no Terminal de Garanhuns</w:t>
       </w:r>
     </w:p>
     <w:p>
@@ -1989,7 +2094,7 @@
           <w:color w:val="000000"/>
           <w:lang w:val="pt-BR" w:eastAsia="pt-BR" w:bidi="pt-BR"/>
         </w:rPr>
-        <w:t>N/A</w:t>
+        <w:t>Pintura desgastada nas colunas do pátio de manobras do Terminal de Garanhuns em 12/06/2025.</w:t>
       </w:r>
     </w:p>
     <w:p>
@@ -2022,21 +2127,30 @@
     </w:p>
     <w:p>
       <w:pPr>
-        <w:spacing w:before="240"/>
+        <w:jc w:val="lowKashida"/>
       </w:pPr>
       <w:r>
         <w:rPr>
           <w:rFonts w:ascii="Arial" w:eastAsia="Arial" w:hAnsi="Arial"/>
           <w:b/>
           <w:color w:val="000000"/>
-          <w:sz w:val="24"/>
-          <w:lang w:val="pt-BR" w:eastAsia="pt-BR" w:bidi="pt-BR"/>
-        </w:rPr>
-        <w:t>3.3 - TERMINAL DE RECIFE (TIP)</w:t>
+          <w:u w:val="single"/>
+          <w:lang w:val="pt-BR" w:eastAsia="pt-BR" w:bidi="pt-BR"/>
+        </w:rPr>
+        <w:t>Não Conformidade GAR 2025_11</w:t>
+      </w:r>
+      <w:r>
+        <w:rPr>
+          <w:rFonts w:ascii="Arial" w:eastAsia="Arial" w:hAnsi="Arial"/>
+          <w:color w:val="000000"/>
+          <w:lang w:val="pt-BR" w:eastAsia="pt-BR" w:bidi="pt-BR"/>
+        </w:rPr>
+        <w:t xml:space="preserve">  Pintura desgastada na parede lateral direita no Terminal de Garanhuns</w:t>
       </w:r>
     </w:p>
     <w:p>
       <w:pPr>
+        <w:spacing w:after="0" w:line="260" w:lineRule="exact"/>
         <w:jc w:val="lowKashida"/>
       </w:pPr>
       <w:r>
@@ -2044,26 +2158,17 @@
           <w:rFonts w:ascii="Arial" w:eastAsia="Arial" w:hAnsi="Arial"/>
           <w:b/>
           <w:color w:val="000000"/>
-          <w:u w:val="single"/>
-          <w:lang w:val="pt-BR" w:eastAsia="pt-BR" w:bidi="pt-BR"/>
-        </w:rPr>
-        <w:t>Não Conformidade TIP 2025_01</w:t>
-      </w:r>
-      <w:r>
-        <w:rPr>
-          <w:rFonts w:ascii="Arial" w:eastAsia="Arial" w:hAnsi="Arial"/>
-          <w:color w:val="000000"/>
-          <w:lang w:val="pt-BR" w:eastAsia="pt-BR" w:bidi="pt-BR"/>
-        </w:rPr>
-        <w:t xml:space="preserve"> - </w:t>
-      </w:r>
-      <w:r>
-        <w:rPr>
-          <w:rFonts w:ascii="Arial" w:eastAsia="Arial" w:hAnsi="Arial"/>
-          <w:color w:val="000000"/>
-          <w:lang w:val="pt-BR" w:eastAsia="pt-BR" w:bidi="pt-BR"/>
-        </w:rPr>
-        <w:t>Infiltração em coluna de sustentação da estrutura metálica da área de embarque e desembarque do Terminal de Recife (TIP)</w:t>
+          <w:lang w:val="pt-BR" w:eastAsia="pt-BR" w:bidi="pt-BR"/>
+        </w:rPr>
+        <w:t xml:space="preserve">Informação da SOCICAM: </w:t>
+      </w:r>
+      <w:r>
+        <w:rPr>
+          <w:rFonts w:ascii="Arial" w:eastAsia="Arial" w:hAnsi="Arial"/>
+          <w:color w:val="000000"/>
+          <w:lang w:val="pt-BR" w:eastAsia="pt-BR" w:bidi="pt-BR"/>
+        </w:rPr>
+        <w:t>N/A</w:t>
       </w:r>
     </w:p>
     <w:p>
@@ -2078,15 +2183,15 @@
           <w:color w:val="000000"/>
           <w:lang w:val="pt-BR" w:eastAsia="pt-BR" w:bidi="pt-BR"/>
         </w:rPr>
-        <w:t xml:space="preserve">Informação da SOCICAM: </w:t>
-      </w:r>
-      <w:r>
-        <w:rPr>
-          <w:rFonts w:ascii="Arial" w:eastAsia="Arial" w:hAnsi="Arial"/>
-          <w:color w:val="000000"/>
-          <w:lang w:val="pt-BR" w:eastAsia="pt-BR" w:bidi="pt-BR"/>
-        </w:rPr>
-        <w:t>A SOCICAM informou que o serviço estava em andamento com a equipe interna de manutenção, com previsão de conclusão em setembro de 2025 (Carta SAP/PER/ARPE N° 002/2025).</w:t>
+        <w:t xml:space="preserve">Constatação: </w:t>
+      </w:r>
+      <w:r>
+        <w:rPr>
+          <w:rFonts w:ascii="Arial" w:eastAsia="Arial" w:hAnsi="Arial"/>
+          <w:color w:val="000000"/>
+          <w:lang w:val="pt-BR" w:eastAsia="pt-BR" w:bidi="pt-BR"/>
+        </w:rPr>
+        <w:t>Pintura desgastada na parede lateral direita do Terminal de Garanhuns em 12/06/2025.</w:t>
       </w:r>
     </w:p>
     <w:p>
@@ -2101,19 +2206,62 @@
           <w:color w:val="000000"/>
           <w:lang w:val="pt-BR" w:eastAsia="pt-BR" w:bidi="pt-BR"/>
         </w:rPr>
-        <w:t xml:space="preserve">Constatação: </w:t>
-      </w:r>
-      <w:r>
-        <w:rPr>
-          <w:rFonts w:ascii="Arial" w:eastAsia="Arial" w:hAnsi="Arial"/>
-          <w:color w:val="000000"/>
-          <w:lang w:val="pt-BR" w:eastAsia="pt-BR" w:bidi="pt-BR"/>
-        </w:rPr>
-        <w:t>O serviço de pintura está em andamento, conforme demonstrado no Memorial Fotográfico pelo comparativo entre a Foto 01 de 18/06/2025 e a Foto 02 de 30/09/2025.</w:t>
+        <w:t xml:space="preserve">Análise da ARPE: </w:t>
+      </w:r>
+      <w:r>
+        <w:rPr>
+          <w:rFonts w:ascii="Arial" w:eastAsia="Arial" w:hAnsi="Arial"/>
+          <w:color w:val="000000"/>
+          <w:lang w:val="pt-BR" w:eastAsia="pt-BR" w:bidi="pt-BR"/>
+        </w:rPr>
+        <w:t>N/A</w:t>
       </w:r>
     </w:p>
     <w:p>
       <w:pPr>
+        <w:spacing w:after="240"/>
+      </w:pPr>
+    </w:p>
+    <w:p>
+      <w:pPr>
+        <w:spacing w:before="240"/>
+      </w:pPr>
+      <w:r>
+        <w:rPr>
+          <w:rFonts w:ascii="Arial" w:eastAsia="Arial" w:hAnsi="Arial"/>
+          <w:b/>
+          <w:color w:val="000000"/>
+          <w:sz w:val="24"/>
+          <w:lang w:val="pt-BR" w:eastAsia="pt-BR" w:bidi="pt-BR"/>
+        </w:rPr>
+        <w:t>3.3 - TERMINAL DE RECIFE (TIP)</w:t>
+      </w:r>
+    </w:p>
+    <w:p>
+      <w:pPr>
+        <w:jc w:val="lowKashida"/>
+      </w:pPr>
+      <w:r>
+        <w:rPr>
+          <w:rFonts w:ascii="Arial" w:eastAsia="Arial" w:hAnsi="Arial"/>
+          <w:b/>
+          <w:color w:val="000000"/>
+          <w:u w:val="single"/>
+          <w:lang w:val="pt-BR" w:eastAsia="pt-BR" w:bidi="pt-BR"/>
+        </w:rPr>
+        <w:t>Não Conformidade TIP 2025_01</w:t>
+      </w:r>
+      <w:r>
+        <w:rPr>
+          <w:rFonts w:ascii="Arial" w:eastAsia="Arial" w:hAnsi="Arial"/>
+          <w:color w:val="000000"/>
+          <w:lang w:val="pt-BR" w:eastAsia="pt-BR" w:bidi="pt-BR"/>
+        </w:rPr>
+        <w:t xml:space="preserve">  Infiltração em coluna de sustentação da estrutura metálica da área de embarque e desembarque do Terminal de Recife (TIP)</w:t>
+      </w:r>
+    </w:p>
+    <w:p>
+      <w:pPr>
         <w:spacing w:after="0" w:line="260" w:lineRule="exact"/>
         <w:jc w:val="lowKashida"/>
       </w:pPr>
@@ -2124,24 +2272,43 @@
           <w:color w:val="000000"/>
           <w:lang w:val="pt-BR" w:eastAsia="pt-BR" w:bidi="pt-BR"/>
         </w:rPr>
-        <w:t xml:space="preserve">Análise da ARPE: </w:t>
-      </w:r>
-      <w:r>
-        <w:rPr>
-          <w:rFonts w:ascii="Arial" w:eastAsia="Arial" w:hAnsi="Arial"/>
-          <w:color w:val="000000"/>
-          <w:lang w:val="pt-BR" w:eastAsia="pt-BR" w:bidi="pt-BR"/>
-        </w:rPr>
-        <w:t>Não Conformidade pendente. Recomenda-se que a SOCICAM encaminhe comprovação de conclusão desses serviços, que se encontram em atraso considerando a informação da SOCICAM constante da Carta SAP/PER/ARPE N° 002/2025.</w:t>
+        <w:t xml:space="preserve">Informação da SOCICAM: </w:t>
+      </w:r>
+      <w:r>
+        <w:rPr>
+          <w:rFonts w:ascii="Arial" w:eastAsia="Arial" w:hAnsi="Arial"/>
+          <w:color w:val="000000"/>
+          <w:lang w:val="pt-BR" w:eastAsia="pt-BR" w:bidi="pt-BR"/>
+        </w:rPr>
+        <w:t>A SOCICAM informou que o serviço estava em andamento com a equipe interna de manutenção, com previsão de conclusão em setembro de 2025 (Carta SAP/PER/ARPE N° 002/2025).</w:t>
       </w:r>
     </w:p>
     <w:p>
       <w:pPr>
-        <w:spacing w:after="240"/>
-      </w:pPr>
+        <w:spacing w:after="0" w:line="260" w:lineRule="exact"/>
+        <w:jc w:val="lowKashida"/>
+      </w:pPr>
+      <w:r>
+        <w:rPr>
+          <w:rFonts w:ascii="Arial" w:eastAsia="Arial" w:hAnsi="Arial"/>
+          <w:b/>
+          <w:color w:val="000000"/>
+          <w:lang w:val="pt-BR" w:eastAsia="pt-BR" w:bidi="pt-BR"/>
+        </w:rPr>
+        <w:t xml:space="preserve">Constatação: </w:t>
+      </w:r>
+      <w:r>
+        <w:rPr>
+          <w:rFonts w:ascii="Arial" w:eastAsia="Arial" w:hAnsi="Arial"/>
+          <w:color w:val="000000"/>
+          <w:lang w:val="pt-BR" w:eastAsia="pt-BR" w:bidi="pt-BR"/>
+        </w:rPr>
+        <w:t>Situação da infiltração em coluna de sustentação do Terminal de Recife em 18/06/2025.</w:t>
+      </w:r>
     </w:p>
     <w:p>
       <w:pPr>
+        <w:spacing w:after="0" w:line="260" w:lineRule="exact"/>
         <w:jc w:val="lowKashida"/>
       </w:pPr>
       <w:r>
@@ -2149,10 +2316,133 @@
           <w:rFonts w:ascii="Arial" w:eastAsia="Arial" w:hAnsi="Arial"/>
           <w:b/>
           <w:color w:val="000000"/>
+          <w:lang w:val="pt-BR" w:eastAsia="pt-BR" w:bidi="pt-BR"/>
+        </w:rPr>
+        <w:t xml:space="preserve">Análise da ARPE: </w:t>
+      </w:r>
+      <w:r>
+        <w:rPr>
+          <w:rFonts w:ascii="Arial" w:eastAsia="Arial" w:hAnsi="Arial"/>
+          <w:color w:val="000000"/>
+          <w:lang w:val="pt-BR" w:eastAsia="pt-BR" w:bidi="pt-BR"/>
+        </w:rPr>
+        <w:t>Não Conformidade pendente. Recomenda-se que a SOCICAM encaminhe comprovação de conclusão desses serviços, que se encontram em atraso considerando a informação da SOCICAM constante da Carta SAP/PER/ARPE N° 002/2025.</w:t>
+      </w:r>
+    </w:p>
+    <w:p>
+      <w:pPr>
+        <w:spacing w:after="240"/>
+      </w:pPr>
+    </w:p>
+    <w:p>
+      <w:pPr>
+        <w:jc w:val="lowKashida"/>
+      </w:pPr>
+      <w:r>
+        <w:rPr>
+          <w:rFonts w:ascii="Arial" w:eastAsia="Arial" w:hAnsi="Arial"/>
+          <w:b/>
+          <w:color w:val="000000"/>
           <w:u w:val="single"/>
           <w:lang w:val="pt-BR" w:eastAsia="pt-BR" w:bidi="pt-BR"/>
         </w:rPr>
-        <w:lastRenderedPageBreak/>
+        <w:t>Não Conformidade TIP 2025_03</w:t>
+      </w:r>
+      <w:r>
+        <w:rPr>
+          <w:rFonts w:ascii="Arial" w:eastAsia="Arial" w:hAnsi="Arial"/>
+          <w:color w:val="000000"/>
+          <w:lang w:val="pt-BR" w:eastAsia="pt-BR" w:bidi="pt-BR"/>
+        </w:rPr>
+        <w:t xml:space="preserve">  Piso desgastado no banheiro feminino do primeiro andar do Terminal de Recife (TIP)</w:t>
+      </w:r>
+    </w:p>
+    <w:p>
+      <w:pPr>
+        <w:spacing w:after="0" w:line="260" w:lineRule="exact"/>
+        <w:jc w:val="lowKashida"/>
+      </w:pPr>
+      <w:r>
+        <w:rPr>
+          <w:rFonts w:ascii="Arial" w:eastAsia="Arial" w:hAnsi="Arial"/>
+          <w:b/>
+          <w:color w:val="000000"/>
+          <w:lang w:val="pt-BR" w:eastAsia="pt-BR" w:bidi="pt-BR"/>
+        </w:rPr>
+        <w:t xml:space="preserve">Informação da SOCICAM: </w:t>
+      </w:r>
+      <w:r>
+        <w:rPr>
+          <w:rFonts w:ascii="Arial" w:eastAsia="Arial" w:hAnsi="Arial"/>
+          <w:color w:val="000000"/>
+          <w:lang w:val="pt-BR" w:eastAsia="pt-BR" w:bidi="pt-BR"/>
+        </w:rPr>
+        <w:t>N/A</w:t>
+      </w:r>
+    </w:p>
+    <w:p>
+      <w:pPr>
+        <w:spacing w:after="0" w:line="260" w:lineRule="exact"/>
+        <w:jc w:val="lowKashida"/>
+      </w:pPr>
+      <w:r>
+        <w:rPr>
+          <w:rFonts w:ascii="Arial" w:eastAsia="Arial" w:hAnsi="Arial"/>
+          <w:b/>
+          <w:color w:val="000000"/>
+          <w:lang w:val="pt-BR" w:eastAsia="pt-BR" w:bidi="pt-BR"/>
+        </w:rPr>
+        <w:t xml:space="preserve">Constatação: </w:t>
+      </w:r>
+      <w:r>
+        <w:rPr>
+          <w:rFonts w:ascii="Arial" w:eastAsia="Arial" w:hAnsi="Arial"/>
+          <w:color w:val="000000"/>
+          <w:lang w:val="pt-BR" w:eastAsia="pt-BR" w:bidi="pt-BR"/>
+        </w:rPr>
+        <w:t>Barras repintadas, mas espelho ainda oxidado no banheiro feminino para PCD do Terminal de Recife em 18/06/2025</w:t>
+      </w:r>
+    </w:p>
+    <w:p>
+      <w:pPr>
+        <w:spacing w:after="0" w:line="260" w:lineRule="exact"/>
+        <w:jc w:val="lowKashida"/>
+      </w:pPr>
+      <w:r>
+        <w:rPr>
+          <w:rFonts w:ascii="Arial" w:eastAsia="Arial" w:hAnsi="Arial"/>
+          <w:b/>
+          <w:color w:val="000000"/>
+          <w:lang w:val="pt-BR" w:eastAsia="pt-BR" w:bidi="pt-BR"/>
+        </w:rPr>
+        <w:t xml:space="preserve">Análise da ARPE: </w:t>
+      </w:r>
+      <w:r>
+        <w:rPr>
+          <w:rFonts w:ascii="Arial" w:eastAsia="Arial" w:hAnsi="Arial"/>
+          <w:color w:val="000000"/>
+          <w:lang w:val="pt-BR" w:eastAsia="pt-BR" w:bidi="pt-BR"/>
+        </w:rPr>
+        <w:t>N/A</w:t>
+      </w:r>
+    </w:p>
+    <w:p>
+      <w:pPr>
+        <w:spacing w:after="240"/>
+      </w:pPr>
+    </w:p>
+    <w:p>
+      <w:pPr>
+        <w:jc w:val="lowKashida"/>
+      </w:pPr>
+      <w:r>
+        <w:rPr>
+          <w:rFonts w:ascii="Arial" w:eastAsia="Arial" w:hAnsi="Arial"/>
+          <w:b/>
+          <w:color w:val="000000"/>
+          <w:u w:val="single"/>
+          <w:lang w:val="pt-BR" w:eastAsia="pt-BR" w:bidi="pt-BR"/>
+        </w:rPr>
         <w:t>Não Conformidade TIP 2025_02</w:t>
       </w:r>
       <w:r>
@@ -2161,7 +2451,7 @@
           <w:color w:val="000000"/>
           <w:lang w:val="pt-BR" w:eastAsia="pt-BR" w:bidi="pt-BR"/>
         </w:rPr>
-        <w:t xml:space="preserve"> - Falta de manutenção adequada no banheiro feminino para PCD localizado no primeiro andar do Terminal de Recife (TIP) associada a três Não Conformidades.</w:t>
+        <w:t xml:space="preserve">  Falta de manutenção adequada no banheiro feminino para PCD localizado no primeiro andar do Terminal de Recife (TIP) associada a três Não Conformidades.</w:t>
       </w:r>
     </w:p>
     <w:p>
@@ -2180,7 +2470,7 @@
         <w:t>Não Conformidade TIP 2025_02.1</w:t>
       </w:r>
       <w:r>
-        <w:t xml:space="preserve"> - </w:t>
+        <w:t xml:space="preserve">  </w:t>
       </w:r>
       <w:r>
         <w:rPr>
@@ -2207,7 +2497,7 @@
         <w:t>Não Conformidade TIP 2025_02.2</w:t>
       </w:r>
       <w:r>
-        <w:t xml:space="preserve"> - </w:t>
+        <w:t xml:space="preserve">  </w:t>
       </w:r>
       <w:r>
         <w:rPr>
@@ -2234,7 +2524,7 @@
         <w:t>Não Conformidade TIP 2025_02.3</w:t>
       </w:r>
       <w:r>
-        <w:t xml:space="preserve"> - </w:t>
+        <w:t xml:space="preserve">  </w:t>
       </w:r>
       <w:r>
         <w:rPr>
@@ -2265,7 +2555,7 @@
           <w:color w:val="000000"/>
           <w:lang w:val="pt-BR" w:eastAsia="pt-BR" w:bidi="pt-BR"/>
         </w:rPr>
-        <w:t>A SOCICAM informou que os serviços estavam em andamento com prazo previsto para julho/2025 (Carta SAP/PER/ARPE N° 002/2025).</w:t>
+        <w:t>N/A</w:t>
       </w:r>
     </w:p>
     <w:p>
@@ -2288,7 +2578,7 @@
           <w:color w:val="000000"/>
           <w:lang w:val="pt-BR" w:eastAsia="pt-BR" w:bidi="pt-BR"/>
         </w:rPr>
-        <w:t>A pintura na porta foi finalizada, conforme demonstra o Memorial Fotográfico pelo comparativo entre a Foto 05 de 18/06/2025 e a Foto 06 de 30/09/2025.</w:t>
+        <w:t>Espelho substituído no banheiro feminino para PCD 30/09/2025.</w:t>
       </w:r>
     </w:p>
     <w:p>
@@ -2311,7 +2601,7 @@
           <w:color w:val="000000"/>
           <w:lang w:val="pt-BR" w:eastAsia="pt-BR" w:bidi="pt-BR"/>
         </w:rPr>
-        <w:t>Não Conformidade sanada.</w:t>
+        <w:t>N/A</w:t>
       </w:r>
     </w:p>
     <w:p>
@@ -2339,7 +2629,7 @@
           <w:color w:val="000000"/>
           <w:lang w:val="pt-BR" w:eastAsia="pt-BR" w:bidi="pt-BR"/>
         </w:rPr>
-        <w:t xml:space="preserve"> - Porta com avaria no banheiro feminino do primeiro andar do Terminal de Recife (TIP)</w:t>
+        <w:t xml:space="preserve">  Porta com avaria no banheiro feminino do primeiro andar do Terminal de Recife (TIP)</w:t>
       </w:r>
     </w:p>
     <w:p>
@@ -2377,6 +2667,7 @@
           <w:color w:val="000000"/>
           <w:lang w:val="pt-BR" w:eastAsia="pt-BR" w:bidi="pt-BR"/>
         </w:rPr>
+        <w:lastRenderedPageBreak/>
         <w:t xml:space="preserve">Constatação: </w:t>
       </w:r>
       <w:r>
@@ -2385,7 +2676,7 @@
           <w:color w:val="000000"/>
           <w:lang w:val="pt-BR" w:eastAsia="pt-BR" w:bidi="pt-BR"/>
         </w:rPr>
-        <w:t>N/A</w:t>
+        <w:t>Porta com avaria no banheiro feminino no Terminal de Recife em 18/06/2025.</w:t>
       </w:r>
     </w:p>
     <w:p>
@@ -2436,7 +2727,7 @@
           <w:color w:val="000000"/>
           <w:lang w:val="pt-BR" w:eastAsia="pt-BR" w:bidi="pt-BR"/>
         </w:rPr>
-        <w:t xml:space="preserve"> - Pintura do meio-fio desgastada na área de circulação e manobra dos ônibus no pátio interno do Terminal de Recife (TIP)</w:t>
+        <w:t xml:space="preserve">  Pintura do meio-fio desgastada na área de circulação e manobra dos ônibus no pátio interno do Terminal de Recife (TIP)</w:t>
       </w:r>
     </w:p>
     <w:p>
@@ -2482,7 +2773,7 @@
           <w:color w:val="000000"/>
           <w:lang w:val="pt-BR" w:eastAsia="pt-BR" w:bidi="pt-BR"/>
         </w:rPr>
-        <w:t>N/A</w:t>
+        <w:t>Detalhe da pintura do meio-fio iniciada no pátio interno no Terminal de Recife 18/06/2025.</w:t>
       </w:r>
     </w:p>
     <w:p>
@@ -2533,7 +2824,7 @@
           <w:color w:val="000000"/>
           <w:lang w:val="pt-BR" w:eastAsia="pt-BR" w:bidi="pt-BR"/>
         </w:rPr>
-        <w:t xml:space="preserve"> - Falta de manutenção adequada na infraestrutura do ponto de embarque e desembarque dos ônibus urbanos da RMR e na sinalização horizontal (faixa de pedestre) na entrada do Terminal de Recife (TIP), que se associa a duas Não Conformidades.</w:t>
+        <w:t xml:space="preserve">  Falta de manutenção adequada na infraestrutura do ponto de embarque e desembarque dos ônibus urbanos da RMR e na sinalização horizontal (faixa de pedestre) na entrada do Terminal de Recife (TIP), que se associa a duas Não Conformidades.</w:t>
       </w:r>
     </w:p>
     <w:p>
@@ -2552,7 +2843,7 @@
         <w:t>Não Conformidade TIP 2025_06.1</w:t>
       </w:r>
       <w:r>
-        <w:t xml:space="preserve"> - </w:t>
+        <w:t xml:space="preserve">  </w:t>
       </w:r>
       <w:r>
         <w:rPr>
@@ -2579,7 +2870,7 @@
         <w:t>Não Conformidade TIP 2025_06.2</w:t>
       </w:r>
       <w:r>
-        <w:t xml:space="preserve"> - </w:t>
+        <w:t xml:space="preserve">  </w:t>
       </w:r>
       <w:r>
         <w:rPr>
@@ -2633,7 +2924,7 @@
           <w:color w:val="000000"/>
           <w:lang w:val="pt-BR" w:eastAsia="pt-BR" w:bidi="pt-BR"/>
         </w:rPr>
-        <w:t>N/A</w:t>
+        <w:t>Pintura da faixa de pedestres iniciada, na entrada do Terminal de Recife em 18/06/2025.</w:t>
       </w:r>
     </w:p>
     <w:p>
@@ -2674,7 +2965,7 @@
         <w:pStyle w:val="Ttulo1"/>
         <w:spacing w:after="120"/>
       </w:pPr>
-      <w:bookmarkStart w:id="3" w:name="_Toc214961116"/>
+      <w:bookmarkStart w:id="3" w:name="_Toc215211542"/>
       <w:r>
         <w:rPr>
           <w:rFonts w:ascii="Arial" w:eastAsia="Arial" w:hAnsi="Arial"/>
@@ -2791,6 +3082,14 @@
                 <w:lang w:val="pt-BR" w:eastAsia="pt-BR" w:bidi="pt-BR"/>
               </w:rPr>
               <w:br/>
+            </w:r>
+            <w:r>
+              <w:rPr>
+                <w:rFonts w:ascii="Arial" w:eastAsia="Arial" w:hAnsi="Arial"/>
+                <w:b/>
+                <w:color w:val="000000"/>
+                <w:lang w:val="pt-BR" w:eastAsia="pt-BR" w:bidi="pt-BR"/>
+              </w:rPr>
               <w:t>Carta SAP/PER/ARPE</w:t>
             </w:r>
             <w:r>
@@ -2801,17 +3100,7 @@
                 <w:lang w:val="pt-BR" w:eastAsia="pt-BR" w:bidi="pt-BR"/>
               </w:rPr>
               <w:br/>
-              <w:t xml:space="preserve">001/2025 </w:t>
-            </w:r>
-            <w:r>
-              <w:rPr>
-                <w:rFonts w:ascii="Arial" w:eastAsia="Arial" w:hAnsi="Arial"/>
-                <w:b/>
-                <w:color w:val="000000"/>
-                <w:lang w:val="pt-BR" w:eastAsia="pt-BR" w:bidi="pt-BR"/>
-              </w:rPr>
-              <w:lastRenderedPageBreak/>
-              <w:t>002/2025</w:t>
+              <w:t>001/2025 002/2025</w:t>
             </w:r>
           </w:p>
         </w:tc>
@@ -2831,7 +3120,6 @@
                 <w:color w:val="000000"/>
                 <w:lang w:val="pt-BR" w:eastAsia="pt-BR" w:bidi="pt-BR"/>
               </w:rPr>
-              <w:lastRenderedPageBreak/>
               <w:t>VISTORIA DA ARPE</w:t>
             </w:r>
             <w:r>
@@ -2842,17 +3130,7 @@
                 <w:lang w:val="pt-BR" w:eastAsia="pt-BR" w:bidi="pt-BR"/>
               </w:rPr>
               <w:br/>
-              <w:t xml:space="preserve">01 A 22/09/2025 e   </w:t>
-            </w:r>
-            <w:r>
-              <w:rPr>
-                <w:rFonts w:ascii="Arial" w:eastAsia="Arial" w:hAnsi="Arial"/>
-                <w:b/>
-                <w:color w:val="000000"/>
-                <w:lang w:val="pt-BR" w:eastAsia="pt-BR" w:bidi="pt-BR"/>
-              </w:rPr>
-              <w:lastRenderedPageBreak/>
-              <w:t>30/09/2025</w:t>
+              <w:t>01 A 22/09/2025 e   30/09/2025</w:t>
             </w:r>
           </w:p>
         </w:tc>
@@ -2872,7 +3150,6 @@
                 <w:color w:val="000000"/>
                 <w:lang w:val="pt-BR" w:eastAsia="pt-BR" w:bidi="pt-BR"/>
               </w:rPr>
-              <w:lastRenderedPageBreak/>
               <w:t>SITUAÇÃO</w:t>
             </w:r>
           </w:p>
@@ -3040,7 +3317,7 @@
                 <w:color w:val="000000"/>
                 <w:lang w:val="pt-BR" w:eastAsia="pt-BR" w:bidi="pt-BR"/>
               </w:rPr>
-              <w:t>LOREM IPSUM</w:t>
+              <w:t>N/A</w:t>
             </w:r>
           </w:p>
         </w:tc>
@@ -3215,6 +3492,102 @@
                 <w:lang w:val="pt-BR" w:eastAsia="pt-BR" w:bidi="pt-BR"/>
               </w:rPr>
               <w:t xml:space="preserve"> – Pintura desgastada no muro e na grade do pátio de manobra no Terminal de Caruaru</w:t>
+            </w:r>
+          </w:p>
+        </w:tc>
+        <w:tc>
+          <w:tcPr>
+            <w:tcW w:w="1728" w:type="dxa"/>
+          </w:tcPr>
+          <w:p>
+            <w:pPr>
+              <w:spacing w:line="260" w:lineRule="exact"/>
+            </w:pPr>
+            <w:r>
+              <w:rPr>
+                <w:rFonts w:ascii="Arial" w:eastAsia="Arial" w:hAnsi="Arial"/>
+                <w:color w:val="000000"/>
+                <w:lang w:val="pt-BR" w:eastAsia="pt-BR" w:bidi="pt-BR"/>
+              </w:rPr>
+              <w:t>N/A</w:t>
+            </w:r>
+          </w:p>
+        </w:tc>
+        <w:tc>
+          <w:tcPr>
+            <w:tcW w:w="1728" w:type="dxa"/>
+            <w:vAlign w:val="center"/>
+          </w:tcPr>
+          <w:p>
+            <w:pPr>
+              <w:jc w:val="center"/>
+            </w:pPr>
+            <w:r>
+              <w:rPr>
+                <w:rFonts w:ascii="Arial" w:eastAsia="Arial" w:hAnsi="Arial"/>
+                <w:color w:val="000000"/>
+                <w:lang w:val="pt-BR" w:eastAsia="pt-BR" w:bidi="pt-BR"/>
+              </w:rPr>
+              <w:t>09/06/2025</w:t>
+            </w:r>
+          </w:p>
+        </w:tc>
+        <w:tc>
+          <w:tcPr>
+            <w:tcW w:w="1728" w:type="dxa"/>
+            <w:vAlign w:val="center"/>
+          </w:tcPr>
+          <w:p>
+            <w:pPr>
+              <w:jc w:val="center"/>
+            </w:pPr>
+            <w:r>
+              <w:rPr>
+                <w:rFonts w:ascii="Arial" w:eastAsia="Arial" w:hAnsi="Arial"/>
+                <w:b/>
+                <w:color w:val="000000"/>
+                <w:lang w:val="pt-BR" w:eastAsia="pt-BR" w:bidi="pt-BR"/>
+              </w:rPr>
+              <w:t>PENDENTE</w:t>
+            </w:r>
+          </w:p>
+        </w:tc>
+      </w:tr>
+      <w:tr>
+        <w:trPr>
+          <w:jc w:val="center"/>
+        </w:trPr>
+        <w:tc>
+          <w:tcPr>
+            <w:tcW w:w="1728" w:type="dxa"/>
+            <w:vMerge/>
+          </w:tcPr>
+          <w:p/>
+        </w:tc>
+        <w:tc>
+          <w:tcPr>
+            <w:tcW w:w="1728" w:type="dxa"/>
+          </w:tcPr>
+          <w:p>
+            <w:pPr>
+              <w:spacing w:line="260" w:lineRule="exact"/>
+            </w:pPr>
+            <w:r>
+              <w:rPr>
+                <w:rFonts w:ascii="Arial" w:eastAsia="Arial" w:hAnsi="Arial"/>
+                <w:b/>
+                <w:color w:val="000000"/>
+                <w:lang w:val="pt-BR" w:eastAsia="pt-BR" w:bidi="pt-BR"/>
+              </w:rPr>
+              <w:t>CAR 2025_07</w:t>
+            </w:r>
+            <w:r>
+              <w:rPr>
+                <w:rFonts w:ascii="Arial" w:eastAsia="Arial" w:hAnsi="Arial"/>
+                <w:color w:val="000000"/>
+                <w:lang w:val="pt-BR" w:eastAsia="pt-BR" w:bidi="pt-BR"/>
+              </w:rPr>
+              <w:t xml:space="preserve"> – Pintura desgastada no muro lateral no Terminal de Caruaru</w:t>
             </w:r>
           </w:p>
         </w:tc>
@@ -3796,6 +4169,102 @@
                 <w:color w:val="000000"/>
                 <w:lang w:val="pt-BR" w:eastAsia="pt-BR" w:bidi="pt-BR"/>
               </w:rPr>
+              <w:t>GAR 2025_08</w:t>
+            </w:r>
+            <w:r>
+              <w:rPr>
+                <w:rFonts w:ascii="Arial" w:eastAsia="Arial" w:hAnsi="Arial"/>
+                <w:color w:val="000000"/>
+                <w:lang w:val="pt-BR" w:eastAsia="pt-BR" w:bidi="pt-BR"/>
+              </w:rPr>
+              <w:t xml:space="preserve"> – Pintura desgastada do muro do pátio de manobras no Terminal de Garanhuns</w:t>
+            </w:r>
+          </w:p>
+        </w:tc>
+        <w:tc>
+          <w:tcPr>
+            <w:tcW w:w="1728" w:type="dxa"/>
+          </w:tcPr>
+          <w:p>
+            <w:pPr>
+              <w:spacing w:line="260" w:lineRule="exact"/>
+            </w:pPr>
+            <w:r>
+              <w:rPr>
+                <w:rFonts w:ascii="Arial" w:eastAsia="Arial" w:hAnsi="Arial"/>
+                <w:color w:val="000000"/>
+                <w:lang w:val="pt-BR" w:eastAsia="pt-BR" w:bidi="pt-BR"/>
+              </w:rPr>
+              <w:t>N/A</w:t>
+            </w:r>
+          </w:p>
+        </w:tc>
+        <w:tc>
+          <w:tcPr>
+            <w:tcW w:w="1728" w:type="dxa"/>
+            <w:vAlign w:val="center"/>
+          </w:tcPr>
+          <w:p>
+            <w:pPr>
+              <w:jc w:val="center"/>
+            </w:pPr>
+            <w:r>
+              <w:rPr>
+                <w:rFonts w:ascii="Arial" w:eastAsia="Arial" w:hAnsi="Arial"/>
+                <w:color w:val="000000"/>
+                <w:lang w:val="pt-BR" w:eastAsia="pt-BR" w:bidi="pt-BR"/>
+              </w:rPr>
+              <w:t>12/06/2025</w:t>
+            </w:r>
+          </w:p>
+        </w:tc>
+        <w:tc>
+          <w:tcPr>
+            <w:tcW w:w="1728" w:type="dxa"/>
+            <w:vAlign w:val="center"/>
+          </w:tcPr>
+          <w:p>
+            <w:pPr>
+              <w:jc w:val="center"/>
+            </w:pPr>
+            <w:r>
+              <w:rPr>
+                <w:rFonts w:ascii="Arial" w:eastAsia="Arial" w:hAnsi="Arial"/>
+                <w:b/>
+                <w:color w:val="000000"/>
+                <w:lang w:val="pt-BR" w:eastAsia="pt-BR" w:bidi="pt-BR"/>
+              </w:rPr>
+              <w:t>PENDENTE</w:t>
+            </w:r>
+          </w:p>
+        </w:tc>
+      </w:tr>
+      <w:tr>
+        <w:trPr>
+          <w:jc w:val="center"/>
+        </w:trPr>
+        <w:tc>
+          <w:tcPr>
+            <w:tcW w:w="1728" w:type="dxa"/>
+            <w:vMerge/>
+          </w:tcPr>
+          <w:p/>
+        </w:tc>
+        <w:tc>
+          <w:tcPr>
+            <w:tcW w:w="1728" w:type="dxa"/>
+          </w:tcPr>
+          <w:p>
+            <w:pPr>
+              <w:spacing w:line="260" w:lineRule="exact"/>
+            </w:pPr>
+            <w:r>
+              <w:rPr>
+                <w:rFonts w:ascii="Arial" w:eastAsia="Arial" w:hAnsi="Arial"/>
+                <w:b/>
+                <w:color w:val="000000"/>
+                <w:lang w:val="pt-BR" w:eastAsia="pt-BR" w:bidi="pt-BR"/>
+              </w:rPr>
               <w:t>GAR 2025_09</w:t>
             </w:r>
             <w:r>
@@ -3900,16 +4369,7 @@
                 <w:color w:val="000000"/>
                 <w:lang w:val="pt-BR" w:eastAsia="pt-BR" w:bidi="pt-BR"/>
               </w:rPr>
-              <w:t xml:space="preserve"> – </w:t>
-            </w:r>
-            <w:r>
-              <w:rPr>
-                <w:rFonts w:ascii="Arial" w:eastAsia="Arial" w:hAnsi="Arial"/>
-                <w:color w:val="000000"/>
-                <w:lang w:val="pt-BR" w:eastAsia="pt-BR" w:bidi="pt-BR"/>
-              </w:rPr>
-              <w:lastRenderedPageBreak/>
-              <w:t>Pintura desgastada nas colunas da fachada do lado do pátio de manobras no Terminal de Garanhuns</w:t>
+              <w:t xml:space="preserve"> – Pintura desgastada nas colunas da fachada do lado do pátio de manobras no Terminal de Garanhuns</w:t>
             </w:r>
           </w:p>
         </w:tc>
@@ -3927,7 +4387,6 @@
                 <w:color w:val="000000"/>
                 <w:lang w:val="pt-BR" w:eastAsia="pt-BR" w:bidi="pt-BR"/>
               </w:rPr>
-              <w:lastRenderedPageBreak/>
               <w:t>N/A</w:t>
             </w:r>
           </w:p>
@@ -4221,7 +4680,7 @@
                 <w:lang w:val="pt-BR" w:eastAsia="pt-BR" w:bidi="pt-BR"/>
               </w:rPr>
               <w:br/>
-              <w:t>TIP 02.1  TIP 02.1 – Espelho oxidado</w:t>
+              <w:t>TIP 02.1 - TIP 02.1 – Espelho oxidado</w:t>
             </w:r>
             <w:r>
               <w:rPr>
@@ -4230,7 +4689,7 @@
                 <w:lang w:val="pt-BR" w:eastAsia="pt-BR" w:bidi="pt-BR"/>
               </w:rPr>
               <w:br/>
-              <w:t>TIP 02.2  TIP 02.2 Barra oxidada em torno da pia</w:t>
+              <w:t>TIP 02.2 - TIP 02.2 Barra oxidada em torno da pia</w:t>
             </w:r>
             <w:r>
               <w:rPr>
@@ -4239,199 +4698,7 @@
                 <w:lang w:val="pt-BR" w:eastAsia="pt-BR" w:bidi="pt-BR"/>
               </w:rPr>
               <w:br/>
-              <w:t>TIP 02.3  TIP 02.3 -Barra de apoio vertical oxidada</w:t>
-            </w:r>
-          </w:p>
-        </w:tc>
-        <w:tc>
-          <w:tcPr>
-            <w:tcW w:w="1728" w:type="dxa"/>
-          </w:tcPr>
-          <w:p>
-            <w:pPr>
-              <w:spacing w:line="260" w:lineRule="exact"/>
-            </w:pPr>
-            <w:r>
-              <w:rPr>
-                <w:rFonts w:ascii="Arial" w:eastAsia="Arial" w:hAnsi="Arial"/>
-                <w:color w:val="000000"/>
-                <w:lang w:val="pt-BR" w:eastAsia="pt-BR" w:bidi="pt-BR"/>
-              </w:rPr>
-              <w:t>LOREM IPSUM</w:t>
-            </w:r>
-          </w:p>
-        </w:tc>
-        <w:tc>
-          <w:tcPr>
-            <w:tcW w:w="1728" w:type="dxa"/>
-            <w:vAlign w:val="center"/>
-          </w:tcPr>
-          <w:p>
-            <w:pPr>
-              <w:jc w:val="center"/>
-            </w:pPr>
-            <w:r>
-              <w:rPr>
-                <w:rFonts w:ascii="Arial" w:eastAsia="Arial" w:hAnsi="Arial"/>
-                <w:color w:val="000000"/>
-                <w:lang w:val="pt-BR" w:eastAsia="pt-BR" w:bidi="pt-BR"/>
-              </w:rPr>
-              <w:t>18/06/2025</w:t>
-            </w:r>
-          </w:p>
-        </w:tc>
-        <w:tc>
-          <w:tcPr>
-            <w:tcW w:w="1728" w:type="dxa"/>
-            <w:vAlign w:val="center"/>
-          </w:tcPr>
-          <w:p>
-            <w:pPr>
-              <w:jc w:val="center"/>
-            </w:pPr>
-            <w:r>
-              <w:rPr>
-                <w:rFonts w:ascii="Arial" w:eastAsia="Arial" w:hAnsi="Arial"/>
-                <w:b/>
-                <w:color w:val="000000"/>
-                <w:lang w:val="pt-BR" w:eastAsia="pt-BR" w:bidi="pt-BR"/>
-              </w:rPr>
-              <w:t>PENDENTE</w:t>
-            </w:r>
-          </w:p>
-        </w:tc>
-      </w:tr>
-      <w:tr>
-        <w:trPr>
-          <w:jc w:val="center"/>
-        </w:trPr>
-        <w:tc>
-          <w:tcPr>
-            <w:tcW w:w="1728" w:type="dxa"/>
-            <w:vMerge/>
-          </w:tcPr>
-          <w:p/>
-        </w:tc>
-        <w:tc>
-          <w:tcPr>
-            <w:tcW w:w="1728" w:type="dxa"/>
-          </w:tcPr>
-          <w:p>
-            <w:pPr>
-              <w:spacing w:line="260" w:lineRule="exact"/>
-            </w:pPr>
-            <w:r>
-              <w:rPr>
-                <w:rFonts w:ascii="Arial" w:eastAsia="Arial" w:hAnsi="Arial"/>
-                <w:b/>
-                <w:color w:val="000000"/>
-                <w:lang w:val="pt-BR" w:eastAsia="pt-BR" w:bidi="pt-BR"/>
-              </w:rPr>
-              <w:t>TIP 2025_04</w:t>
-            </w:r>
-            <w:r>
-              <w:rPr>
-                <w:rFonts w:ascii="Arial" w:eastAsia="Arial" w:hAnsi="Arial"/>
-                <w:color w:val="000000"/>
-                <w:lang w:val="pt-BR" w:eastAsia="pt-BR" w:bidi="pt-BR"/>
-              </w:rPr>
-              <w:t xml:space="preserve"> – Porta com avaria no banheiro feminino do primeiro andar do Terminal de Recife (TIP)</w:t>
-            </w:r>
-          </w:p>
-        </w:tc>
-        <w:tc>
-          <w:tcPr>
-            <w:tcW w:w="1728" w:type="dxa"/>
-          </w:tcPr>
-          <w:p>
-            <w:pPr>
-              <w:spacing w:line="260" w:lineRule="exact"/>
-            </w:pPr>
-            <w:r>
-              <w:rPr>
-                <w:rFonts w:ascii="Arial" w:eastAsia="Arial" w:hAnsi="Arial"/>
-                <w:color w:val="000000"/>
-                <w:lang w:val="pt-BR" w:eastAsia="pt-BR" w:bidi="pt-BR"/>
-              </w:rPr>
-              <w:t>lalala</w:t>
-            </w:r>
-          </w:p>
-        </w:tc>
-        <w:tc>
-          <w:tcPr>
-            <w:tcW w:w="1728" w:type="dxa"/>
-            <w:vAlign w:val="center"/>
-          </w:tcPr>
-          <w:p>
-            <w:pPr>
-              <w:jc w:val="center"/>
-            </w:pPr>
-            <w:r>
-              <w:rPr>
-                <w:rFonts w:ascii="Arial" w:eastAsia="Arial" w:hAnsi="Arial"/>
-                <w:color w:val="000000"/>
-                <w:lang w:val="pt-BR" w:eastAsia="pt-BR" w:bidi="pt-BR"/>
-              </w:rPr>
-              <w:t>18/06/2025</w:t>
-            </w:r>
-          </w:p>
-        </w:tc>
-        <w:tc>
-          <w:tcPr>
-            <w:tcW w:w="1728" w:type="dxa"/>
-            <w:vAlign w:val="center"/>
-          </w:tcPr>
-          <w:p>
-            <w:pPr>
-              <w:jc w:val="center"/>
-            </w:pPr>
-            <w:r>
-              <w:rPr>
-                <w:rFonts w:ascii="Arial" w:eastAsia="Arial" w:hAnsi="Arial"/>
-                <w:b/>
-                <w:color w:val="000000"/>
-                <w:lang w:val="pt-BR" w:eastAsia="pt-BR" w:bidi="pt-BR"/>
-              </w:rPr>
-              <w:t>PENDENTE</w:t>
-            </w:r>
-          </w:p>
-        </w:tc>
-      </w:tr>
-      <w:tr>
-        <w:trPr>
-          <w:jc w:val="center"/>
-        </w:trPr>
-        <w:tc>
-          <w:tcPr>
-            <w:tcW w:w="1728" w:type="dxa"/>
-            <w:vMerge/>
-          </w:tcPr>
-          <w:p/>
-        </w:tc>
-        <w:tc>
-          <w:tcPr>
-            <w:tcW w:w="1728" w:type="dxa"/>
-          </w:tcPr>
-          <w:p>
-            <w:pPr>
-              <w:spacing w:line="260" w:lineRule="exact"/>
-            </w:pPr>
-            <w:r>
-              <w:rPr>
-                <w:rFonts w:ascii="Arial" w:eastAsia="Arial" w:hAnsi="Arial"/>
-                <w:b/>
-                <w:color w:val="000000"/>
-                <w:lang w:val="pt-BR" w:eastAsia="pt-BR" w:bidi="pt-BR"/>
-              </w:rPr>
-              <w:t>TIP 2025_05</w:t>
-            </w:r>
-            <w:r>
-              <w:rPr>
-                <w:rFonts w:ascii="Arial" w:eastAsia="Arial" w:hAnsi="Arial"/>
-                <w:color w:val="000000"/>
-                <w:lang w:val="pt-BR" w:eastAsia="pt-BR" w:bidi="pt-BR"/>
-              </w:rPr>
-              <w:t xml:space="preserve"> – Pintura do meio-fio desgastada na área de circulação e manobra dos ônibus no pátio interno do Terminal de Recife (TIP)</w:t>
+              <w:t>TIP 02.3 - TIP 02.3 -Barra de apoio vertical oxidada</w:t>
             </w:r>
           </w:p>
         </w:tc>
@@ -4519,7 +4786,7 @@
                 <w:color w:val="000000"/>
                 <w:lang w:val="pt-BR" w:eastAsia="pt-BR" w:bidi="pt-BR"/>
               </w:rPr>
-              <w:t>TIP 2025_06</w:t>
+              <w:t>TIP 2025_03</w:t>
             </w:r>
             <w:r>
               <w:rPr>
@@ -4527,7 +4794,94 @@
                 <w:color w:val="000000"/>
                 <w:lang w:val="pt-BR" w:eastAsia="pt-BR" w:bidi="pt-BR"/>
               </w:rPr>
-              <w:t xml:space="preserve"> – Falta de manutenção adequada na infraestrutura do ponto de embarque e desembarque dos ônibus urbanos da RMR e na sinalização horizontal (faixa de pedestre) na entrada do Terminal de Recife (TIP), que se associa a duas Não Conformidades.</w:t>
+              <w:t xml:space="preserve"> – Piso desgastado no banheiro feminino do primeiro andar do Terminal de Recife (TIP)</w:t>
+            </w:r>
+          </w:p>
+        </w:tc>
+        <w:tc>
+          <w:tcPr>
+            <w:tcW w:w="1728" w:type="dxa"/>
+          </w:tcPr>
+          <w:p>
+            <w:pPr>
+              <w:spacing w:line="260" w:lineRule="exact"/>
+            </w:pPr>
+            <w:r>
+              <w:rPr>
+                <w:rFonts w:ascii="Arial" w:eastAsia="Arial" w:hAnsi="Arial"/>
+                <w:color w:val="000000"/>
+                <w:lang w:val="pt-BR" w:eastAsia="pt-BR" w:bidi="pt-BR"/>
+              </w:rPr>
+              <w:t>lalala</w:t>
+            </w:r>
+          </w:p>
+        </w:tc>
+        <w:tc>
+          <w:tcPr>
+            <w:tcW w:w="1728" w:type="dxa"/>
+            <w:vAlign w:val="center"/>
+          </w:tcPr>
+          <w:p>
+            <w:pPr>
+              <w:jc w:val="center"/>
+            </w:pPr>
+            <w:r>
+              <w:rPr>
+                <w:rFonts w:ascii="Arial" w:eastAsia="Arial" w:hAnsi="Arial"/>
+                <w:color w:val="000000"/>
+                <w:lang w:val="pt-BR" w:eastAsia="pt-BR" w:bidi="pt-BR"/>
+              </w:rPr>
+              <w:t>18/06/2025</w:t>
+            </w:r>
+          </w:p>
+        </w:tc>
+        <w:tc>
+          <w:tcPr>
+            <w:tcW w:w="1728" w:type="dxa"/>
+            <w:vAlign w:val="center"/>
+          </w:tcPr>
+          <w:p>
+            <w:pPr>
+              <w:jc w:val="center"/>
+            </w:pPr>
+            <w:r>
+              <w:rPr>
+                <w:rFonts w:ascii="Arial" w:eastAsia="Arial" w:hAnsi="Arial"/>
+                <w:color w:val="000000"/>
+                <w:lang w:val="pt-BR" w:eastAsia="pt-BR" w:bidi="pt-BR"/>
+              </w:rPr>
+              <w:t>SANADA</w:t>
+            </w:r>
+          </w:p>
+        </w:tc>
+      </w:tr>
+      <w:tr>
+        <w:trPr>
+          <w:jc w:val="center"/>
+        </w:trPr>
+        <w:tc>
+          <w:tcPr>
+            <w:tcW w:w="1728" w:type="dxa"/>
+            <w:vMerge/>
+          </w:tcPr>
+          <w:p/>
+        </w:tc>
+        <w:tc>
+          <w:tcPr>
+            <w:tcW w:w="1728" w:type="dxa"/>
+          </w:tcPr>
+          <w:p>
+            <w:pPr>
+              <w:spacing w:line="260" w:lineRule="exact"/>
+            </w:pPr>
+            <w:r>
+              <w:rPr>
+                <w:rFonts w:ascii="Arial" w:eastAsia="Arial" w:hAnsi="Arial"/>
+                <w:b/>
+                <w:color w:val="000000"/>
+                <w:lang w:val="pt-BR" w:eastAsia="pt-BR" w:bidi="pt-BR"/>
+              </w:rPr>
+              <w:t>TIP 2025_04</w:t>
             </w:r>
             <w:r>
               <w:rPr>
@@ -4535,17 +4889,7 @@
                 <w:color w:val="000000"/>
                 <w:lang w:val="pt-BR" w:eastAsia="pt-BR" w:bidi="pt-BR"/>
               </w:rPr>
-              <w:br/>
-              <w:t>TIP 06.1  TIP 06.1 - Parada de ônibus com pintura desgastada,</w:t>
-            </w:r>
-            <w:r>
-              <w:rPr>
-                <w:rFonts w:ascii="Arial" w:eastAsia="Arial" w:hAnsi="Arial"/>
-                <w:color w:val="000000"/>
-                <w:lang w:val="pt-BR" w:eastAsia="pt-BR" w:bidi="pt-BR"/>
-              </w:rPr>
-              <w:br/>
-              <w:t>TIP 06.2  TIP 06.2 – Faixa de pedestre com pintura desgastada</w:t>
+              <w:t xml:space="preserve"> – Porta com avaria no banheiro feminino do primeiro andar do Terminal de Recife (TIP)</w:t>
             </w:r>
           </w:p>
         </w:tc>
@@ -4607,6 +4951,226 @@
           </w:p>
         </w:tc>
       </w:tr>
+      <w:tr>
+        <w:trPr>
+          <w:jc w:val="center"/>
+        </w:trPr>
+        <w:tc>
+          <w:tcPr>
+            <w:tcW w:w="1728" w:type="dxa"/>
+            <w:vMerge/>
+          </w:tcPr>
+          <w:p/>
+        </w:tc>
+        <w:tc>
+          <w:tcPr>
+            <w:tcW w:w="1728" w:type="dxa"/>
+          </w:tcPr>
+          <w:p>
+            <w:pPr>
+              <w:spacing w:line="260" w:lineRule="exact"/>
+            </w:pPr>
+            <w:r>
+              <w:rPr>
+                <w:rFonts w:ascii="Arial" w:eastAsia="Arial" w:hAnsi="Arial"/>
+                <w:b/>
+                <w:color w:val="000000"/>
+                <w:lang w:val="pt-BR" w:eastAsia="pt-BR" w:bidi="pt-BR"/>
+              </w:rPr>
+              <w:t>TIP 2025_05</w:t>
+            </w:r>
+            <w:r>
+              <w:rPr>
+                <w:rFonts w:ascii="Arial" w:eastAsia="Arial" w:hAnsi="Arial"/>
+                <w:color w:val="000000"/>
+                <w:lang w:val="pt-BR" w:eastAsia="pt-BR" w:bidi="pt-BR"/>
+              </w:rPr>
+              <w:t xml:space="preserve"> – Pintura do meio-fio desgastada na área de circulação e manobra dos ônibus no pátio interno do Terminal de Recife </w:t>
+            </w:r>
+            <w:r>
+              <w:rPr>
+                <w:rFonts w:ascii="Arial" w:eastAsia="Arial" w:hAnsi="Arial"/>
+                <w:color w:val="000000"/>
+                <w:lang w:val="pt-BR" w:eastAsia="pt-BR" w:bidi="pt-BR"/>
+              </w:rPr>
+              <w:lastRenderedPageBreak/>
+              <w:t>(TIP)</w:t>
+            </w:r>
+          </w:p>
+        </w:tc>
+        <w:tc>
+          <w:tcPr>
+            <w:tcW w:w="1728" w:type="dxa"/>
+          </w:tcPr>
+          <w:p>
+            <w:pPr>
+              <w:spacing w:line="260" w:lineRule="exact"/>
+            </w:pPr>
+            <w:r>
+              <w:rPr>
+                <w:rFonts w:ascii="Arial" w:eastAsia="Arial" w:hAnsi="Arial"/>
+                <w:color w:val="000000"/>
+                <w:lang w:val="pt-BR" w:eastAsia="pt-BR" w:bidi="pt-BR"/>
+              </w:rPr>
+              <w:lastRenderedPageBreak/>
+              <w:t>N/A</w:t>
+            </w:r>
+          </w:p>
+        </w:tc>
+        <w:tc>
+          <w:tcPr>
+            <w:tcW w:w="1728" w:type="dxa"/>
+            <w:vAlign w:val="center"/>
+          </w:tcPr>
+          <w:p>
+            <w:pPr>
+              <w:jc w:val="center"/>
+            </w:pPr>
+            <w:r>
+              <w:rPr>
+                <w:rFonts w:ascii="Arial" w:eastAsia="Arial" w:hAnsi="Arial"/>
+                <w:color w:val="000000"/>
+                <w:lang w:val="pt-BR" w:eastAsia="pt-BR" w:bidi="pt-BR"/>
+              </w:rPr>
+              <w:t>18/06/2025</w:t>
+            </w:r>
+          </w:p>
+        </w:tc>
+        <w:tc>
+          <w:tcPr>
+            <w:tcW w:w="1728" w:type="dxa"/>
+            <w:vAlign w:val="center"/>
+          </w:tcPr>
+          <w:p>
+            <w:pPr>
+              <w:jc w:val="center"/>
+            </w:pPr>
+            <w:r>
+              <w:rPr>
+                <w:rFonts w:ascii="Arial" w:eastAsia="Arial" w:hAnsi="Arial"/>
+                <w:b/>
+                <w:color w:val="000000"/>
+                <w:lang w:val="pt-BR" w:eastAsia="pt-BR" w:bidi="pt-BR"/>
+              </w:rPr>
+              <w:t>PENDENTE</w:t>
+            </w:r>
+          </w:p>
+        </w:tc>
+      </w:tr>
+      <w:tr>
+        <w:trPr>
+          <w:jc w:val="center"/>
+        </w:trPr>
+        <w:tc>
+          <w:tcPr>
+            <w:tcW w:w="1728" w:type="dxa"/>
+            <w:vMerge/>
+          </w:tcPr>
+          <w:p/>
+        </w:tc>
+        <w:tc>
+          <w:tcPr>
+            <w:tcW w:w="1728" w:type="dxa"/>
+          </w:tcPr>
+          <w:p>
+            <w:pPr>
+              <w:spacing w:line="260" w:lineRule="exact"/>
+            </w:pPr>
+            <w:r>
+              <w:rPr>
+                <w:rFonts w:ascii="Arial" w:eastAsia="Arial" w:hAnsi="Arial"/>
+                <w:b/>
+                <w:color w:val="000000"/>
+                <w:lang w:val="pt-BR" w:eastAsia="pt-BR" w:bidi="pt-BR"/>
+              </w:rPr>
+              <w:t>TIP 2025_06</w:t>
+            </w:r>
+            <w:r>
+              <w:rPr>
+                <w:rFonts w:ascii="Arial" w:eastAsia="Arial" w:hAnsi="Arial"/>
+                <w:color w:val="000000"/>
+                <w:lang w:val="pt-BR" w:eastAsia="pt-BR" w:bidi="pt-BR"/>
+              </w:rPr>
+              <w:t xml:space="preserve"> – Falta de manutenção adequada na infraestrutura do ponto de embarque e desembarque dos ônibus urbanos da RMR e na sinalização horizontal (faixa de pedestre) na entrada do Terminal de Recife (TIP), que se associa a duas Não Conformidades.</w:t>
+            </w:r>
+            <w:r>
+              <w:rPr>
+                <w:rFonts w:ascii="Arial" w:eastAsia="Arial" w:hAnsi="Arial"/>
+                <w:color w:val="000000"/>
+                <w:lang w:val="pt-BR" w:eastAsia="pt-BR" w:bidi="pt-BR"/>
+              </w:rPr>
+              <w:br/>
+              <w:t>TIP 06.1 - TIP 06.1 - Parada de ônibus com pintura desgastada,</w:t>
+            </w:r>
+            <w:r>
+              <w:rPr>
+                <w:rFonts w:ascii="Arial" w:eastAsia="Arial" w:hAnsi="Arial"/>
+                <w:color w:val="000000"/>
+                <w:lang w:val="pt-BR" w:eastAsia="pt-BR" w:bidi="pt-BR"/>
+              </w:rPr>
+              <w:br/>
+              <w:t>TIP 06.2 - TIP 06.2 – Faixa de pedestre com pintura desgastada</w:t>
+            </w:r>
+          </w:p>
+        </w:tc>
+        <w:tc>
+          <w:tcPr>
+            <w:tcW w:w="1728" w:type="dxa"/>
+          </w:tcPr>
+          <w:p>
+            <w:pPr>
+              <w:spacing w:line="260" w:lineRule="exact"/>
+            </w:pPr>
+            <w:r>
+              <w:rPr>
+                <w:rFonts w:ascii="Arial" w:eastAsia="Arial" w:hAnsi="Arial"/>
+                <w:color w:val="000000"/>
+                <w:lang w:val="pt-BR" w:eastAsia="pt-BR" w:bidi="pt-BR"/>
+              </w:rPr>
+              <w:t>N/A</w:t>
+            </w:r>
+          </w:p>
+        </w:tc>
+        <w:tc>
+          <w:tcPr>
+            <w:tcW w:w="1728" w:type="dxa"/>
+            <w:vAlign w:val="center"/>
+          </w:tcPr>
+          <w:p>
+            <w:pPr>
+              <w:jc w:val="center"/>
+            </w:pPr>
+            <w:r>
+              <w:rPr>
+                <w:rFonts w:ascii="Arial" w:eastAsia="Arial" w:hAnsi="Arial"/>
+                <w:color w:val="000000"/>
+                <w:lang w:val="pt-BR" w:eastAsia="pt-BR" w:bidi="pt-BR"/>
+              </w:rPr>
+              <w:t>18/06/2025</w:t>
+            </w:r>
+          </w:p>
+        </w:tc>
+        <w:tc>
+          <w:tcPr>
+            <w:tcW w:w="1728" w:type="dxa"/>
+            <w:vAlign w:val="center"/>
+          </w:tcPr>
+          <w:p>
+            <w:pPr>
+              <w:jc w:val="center"/>
+            </w:pPr>
+            <w:r>
+              <w:rPr>
+                <w:rFonts w:ascii="Arial" w:eastAsia="Arial" w:hAnsi="Arial"/>
+                <w:b/>
+                <w:color w:val="000000"/>
+                <w:lang w:val="pt-BR" w:eastAsia="pt-BR" w:bidi="pt-BR"/>
+              </w:rPr>
+              <w:t>PENDENTE</w:t>
+            </w:r>
+          </w:p>
+        </w:tc>
+      </w:tr>
     </w:tbl>
     <w:p/>
     <w:p>
@@ -4614,7 +5178,7 @@
         <w:pStyle w:val="Ttulo1"/>
         <w:spacing w:after="120"/>
       </w:pPr>
-      <w:bookmarkStart w:id="4" w:name="_Toc214961117"/>
+      <w:bookmarkStart w:id="4" w:name="_Toc215211543"/>
       <w:r>
         <w:rPr>
           <w:rFonts w:ascii="Arial" w:eastAsia="Arial" w:hAnsi="Arial"/>
@@ -4650,7 +5214,7 @@
           <w:color w:val="000000"/>
           <w:lang w:val="pt-BR" w:eastAsia="pt-BR" w:bidi="pt-BR"/>
         </w:rPr>
-        <w:t>Recife, 25/11/2025.</w:t>
+        <w:t>Recife, 28/11/2025.</w:t>
       </w:r>
     </w:p>
     <w:p/>
@@ -4749,6 +5313,7 @@
           <w:color w:val="000000"/>
           <w:lang w:val="pt-BR" w:eastAsia="pt-BR" w:bidi="pt-BR"/>
         </w:rPr>
+        <w:lastRenderedPageBreak/>
         <w:t>Ciente.</w:t>
       </w:r>
     </w:p>
@@ -4764,7 +5329,6 @@
           <w:sz w:val="24"/>
           <w:lang w:val="pt-BR" w:eastAsia="pt-BR" w:bidi="pt-BR"/>
         </w:rPr>
-        <w:lastRenderedPageBreak/>
         <w:t>Maria Ângela Albuquerque de Freitas</w:t>
       </w:r>
     </w:p>
@@ -4808,7 +5372,7 @@
         <w:shd w:val="clear" w:color="auto" w:fill="BFBFBF"/>
         <w:spacing w:after="120"/>
       </w:pPr>
-      <w:bookmarkStart w:id="5" w:name="_Toc214961118"/>
+      <w:bookmarkStart w:id="5" w:name="_Toc215211544"/>
       <w:r>
         <w:rPr>
           <w:rFonts w:ascii="Arial" w:eastAsia="Arial" w:hAnsi="Arial"/>
@@ -4846,7 +5410,7 @@
         <w:pStyle w:val="Ttulo2"/>
         <w:spacing w:after="120"/>
       </w:pPr>
-      <w:bookmarkStart w:id="6" w:name="_Toc214961119"/>
+      <w:bookmarkStart w:id="6" w:name="_Toc215211545"/>
       <w:r>
         <w:rPr>
           <w:rFonts w:ascii="Arial" w:eastAsia="Arial" w:hAnsi="Arial"/>
@@ -4910,7 +5474,7 @@
                 <w:noProof/>
               </w:rPr>
               <w:drawing>
-                <wp:inline distT="0" distB="0" distL="0" distR="0" wp14:anchorId="58BDC3DA" wp14:editId="030F7A3C">
+                <wp:inline distT="0" distB="0" distL="0" distR="0" wp14:anchorId="3B32C2B6" wp14:editId="2564A652">
                   <wp:extent cx="2743200" cy="2468880"/>
                   <wp:effectExtent l="0" t="0" r="0" b="0"/>
                   <wp:docPr id="2" name="Picture 2"/>
@@ -4960,7 +5524,7 @@
                 <w:noProof/>
               </w:rPr>
               <w:drawing>
-                <wp:inline distT="0" distB="0" distL="0" distR="0" wp14:anchorId="03D102D4" wp14:editId="046626E2">
+                <wp:inline distT="0" distB="0" distL="0" distR="0" wp14:anchorId="214D6857" wp14:editId="31A88F33">
                   <wp:extent cx="2743200" cy="2468880"/>
                   <wp:effectExtent l="0" t="0" r="0" b="0"/>
                   <wp:docPr id="3" name="Picture 3"/>
@@ -5053,15 +5617,15 @@
           <w:sz w:val="24"/>
           <w:lang w:val="pt-BR" w:eastAsia="pt-BR" w:bidi="pt-BR"/>
         </w:rPr>
-        <w:t>TIP 2025_02</w:t>
-      </w:r>
-      <w:r>
-        <w:rPr>
-          <w:rFonts w:ascii="Arial" w:eastAsia="Arial" w:hAnsi="Arial"/>
-          <w:color w:val="000000"/>
-          <w:lang w:val="pt-BR" w:eastAsia="pt-BR" w:bidi="pt-BR"/>
-        </w:rPr>
-        <w:t xml:space="preserve"> - Falta de manutenção adequada no banheiro feminino para PCD localizado no primeiro andar do Terminal de Recife (TIP) associada a três Não Conformidades.</w:t>
+        <w:t>TIP 2025_03</w:t>
+      </w:r>
+      <w:r>
+        <w:rPr>
+          <w:rFonts w:ascii="Arial" w:eastAsia="Arial" w:hAnsi="Arial"/>
+          <w:color w:val="000000"/>
+          <w:lang w:val="pt-BR" w:eastAsia="pt-BR" w:bidi="pt-BR"/>
+        </w:rPr>
+        <w:t xml:space="preserve"> - Piso desgastado no banheiro feminino do primeiro andar do Terminal de Recife (TIP)</w:t>
       </w:r>
     </w:p>
     <w:tbl>
@@ -5091,9 +5655,8 @@
               <w:rPr>
                 <w:noProof/>
               </w:rPr>
-              <w:lastRenderedPageBreak/>
               <w:drawing>
-                <wp:inline distT="0" distB="0" distL="0" distR="0" wp14:anchorId="5DEE687C" wp14:editId="1E2B3711">
+                <wp:inline distT="0" distB="0" distL="0" distR="0" wp14:anchorId="2A8A56D8" wp14:editId="1832629B">
                   <wp:extent cx="2743200" cy="2468880"/>
                   <wp:effectExtent l="0" t="0" r="0" b="0"/>
                   <wp:docPr id="4" name="Picture 4"/>
@@ -5143,7 +5706,7 @@
                 <w:noProof/>
               </w:rPr>
               <w:drawing>
-                <wp:inline distT="0" distB="0" distL="0" distR="0" wp14:anchorId="7AEC47D6" wp14:editId="558CD394">
+                <wp:inline distT="0" distB="0" distL="0" distR="0" wp14:anchorId="5FFD8862" wp14:editId="1C65FAA9">
                   <wp:extent cx="2743200" cy="2468880"/>
                   <wp:effectExtent l="0" t="0" r="0" b="0"/>
                   <wp:docPr id="5" name="Picture 5"/>
@@ -5197,7 +5760,17 @@
                 <w:sz w:val="20"/>
                 <w:lang w:val="pt-BR" w:eastAsia="pt-BR" w:bidi="pt-BR"/>
               </w:rPr>
-              <w:t>Barras repintadas, mas espelho ainda oxidado no banheiro feminino para PCD do Terminal de Recife em 18/06/2025</w:t>
+              <w:t xml:space="preserve">Barras repintadas, mas espelho ainda oxidado </w:t>
+            </w:r>
+            <w:r>
+              <w:rPr>
+                <w:rFonts w:ascii="Arial" w:eastAsia="Arial" w:hAnsi="Arial"/>
+                <w:color w:val="5A5A5A"/>
+                <w:sz w:val="20"/>
+                <w:lang w:val="pt-BR" w:eastAsia="pt-BR" w:bidi="pt-BR"/>
+              </w:rPr>
+              <w:lastRenderedPageBreak/>
+              <w:t>no banheiro feminino para PCD do Terminal de Recife em 18/06/2025</w:t>
             </w:r>
           </w:p>
         </w:tc>
@@ -5213,7 +5786,18 @@
                 <w:sz w:val="20"/>
                 <w:lang w:val="pt-BR" w:eastAsia="pt-BR" w:bidi="pt-BR"/>
               </w:rPr>
-              <w:t>Espelho substituído no banheiro feminino para PCD 30/09/2025.</w:t>
+              <w:lastRenderedPageBreak/>
+              <w:t xml:space="preserve">Espelho substituído no banheiro feminino para </w:t>
+            </w:r>
+            <w:r>
+              <w:rPr>
+                <w:rFonts w:ascii="Arial" w:eastAsia="Arial" w:hAnsi="Arial"/>
+                <w:color w:val="5A5A5A"/>
+                <w:sz w:val="20"/>
+                <w:lang w:val="pt-BR" w:eastAsia="pt-BR" w:bidi="pt-BR"/>
+              </w:rPr>
+              <w:lastRenderedPageBreak/>
+              <w:t>PCD 30/09/2025.</w:t>
             </w:r>
           </w:p>
         </w:tc>
@@ -5274,7 +5858,7 @@
                 <w:noProof/>
               </w:rPr>
               <w:drawing>
-                <wp:inline distT="0" distB="0" distL="0" distR="0" wp14:anchorId="169DB1E8" wp14:editId="3ABEBC4A">
+                <wp:inline distT="0" distB="0" distL="0" distR="0" wp14:anchorId="0F4DDDD2" wp14:editId="39436C26">
                   <wp:extent cx="5486400" cy="3082916"/>
                   <wp:effectExtent l="0" t="0" r="0" b="0"/>
                   <wp:docPr id="6" name="Picture 6"/>
@@ -5527,31 +6111,31 @@
       </w:rPr>
     </w:lvl>
   </w:abstractNum>
-  <w:num w:numId="1" w16cid:durableId="258147621">
+  <w:num w:numId="1" w16cid:durableId="151533743">
     <w:abstractNumId w:val="8"/>
   </w:num>
-  <w:num w:numId="2" w16cid:durableId="551844274">
+  <w:num w:numId="2" w16cid:durableId="1660884337">
     <w:abstractNumId w:val="6"/>
   </w:num>
-  <w:num w:numId="3" w16cid:durableId="1739205807">
+  <w:num w:numId="3" w16cid:durableId="1202285951">
     <w:abstractNumId w:val="5"/>
   </w:num>
-  <w:num w:numId="4" w16cid:durableId="134415020">
+  <w:num w:numId="4" w16cid:durableId="989358467">
     <w:abstractNumId w:val="4"/>
   </w:num>
-  <w:num w:numId="5" w16cid:durableId="954679691">
+  <w:num w:numId="5" w16cid:durableId="1319455215">
     <w:abstractNumId w:val="7"/>
   </w:num>
-  <w:num w:numId="6" w16cid:durableId="501312862">
+  <w:num w:numId="6" w16cid:durableId="1547987713">
     <w:abstractNumId w:val="3"/>
   </w:num>
-  <w:num w:numId="7" w16cid:durableId="444615351">
+  <w:num w:numId="7" w16cid:durableId="1816676425">
     <w:abstractNumId w:val="2"/>
   </w:num>
-  <w:num w:numId="8" w16cid:durableId="716321873">
+  <w:num w:numId="8" w16cid:durableId="652029146">
     <w:abstractNumId w:val="1"/>
   </w:num>
-  <w:num w:numId="9" w16cid:durableId="2131196261">
+  <w:num w:numId="9" w16cid:durableId="86535829">
     <w:abstractNumId w:val="0"/>
   </w:num>
 </w:numbering>
@@ -16944,7 +17528,7 @@
     <w:autoRedefine/>
     <w:uiPriority w:val="39"/>
     <w:unhideWhenUsed/>
-    <w:rsid w:val="00370CC1"/>
+    <w:rsid w:val="00DC31C7"/>
     <w:pPr>
       <w:spacing w:after="100"/>
     </w:pPr>
@@ -16956,7 +17540,7 @@
     <w:autoRedefine/>
     <w:uiPriority w:val="39"/>
     <w:unhideWhenUsed/>
-    <w:rsid w:val="00370CC1"/>
+    <w:rsid w:val="00DC31C7"/>
     <w:pPr>
       <w:spacing w:after="100"/>
       <w:ind w:left="220"/>
@@ -16967,7 +17551,7 @@
     <w:basedOn w:val="Fontepargpadro"/>
     <w:uiPriority w:val="99"/>
     <w:unhideWhenUsed/>
-    <w:rsid w:val="00370CC1"/>
+    <w:rsid w:val="00DC31C7"/>
     <w:rPr>
       <w:color w:val="0000FF" w:themeColor="hyperlink"/>
       <w:u w:val="single"/>

</xml_diff>

<commit_message>
fix: aprimora precisão da busca de NCs e corrige formatação de texto
</commit_message>
<xml_diff>
--- a/src/reports/relatorio_1.docx
+++ b/src/reports/relatorio_1.docx
@@ -44,7 +44,7 @@
           <w:noProof/>
         </w:rPr>
         <w:drawing>
-          <wp:inline distT="0" distB="0" distL="0" distR="0" wp14:anchorId="11558DF2" wp14:editId="1A334034">
+          <wp:inline distT="0" distB="0" distL="0" distR="0" wp14:anchorId="7C9FDD7C" wp14:editId="1C00DF27">
             <wp:extent cx="5943600" cy="5029200"/>
             <wp:effectExtent l="0" t="0" r="0" b="0"/>
             <wp:docPr id="1" name="Picture 1"/>
@@ -187,7 +187,7 @@
       <w:r>
         <w:fldChar w:fldCharType="separate"/>
       </w:r>
-      <w:hyperlink w:anchor="_Toc215211539" w:history="1">
+      <w:hyperlink w:anchor="_Toc215215028" w:history="1">
         <w:r>
           <w:rPr>
             <w:rStyle w:val="Hyperlink"/>
@@ -217,7 +217,7 @@
             <w:noProof/>
             <w:webHidden/>
           </w:rPr>
-          <w:instrText xml:space="preserve"> PAGEREF _Toc215211539 \h </w:instrText>
+          <w:instrText xml:space="preserve"> PAGEREF _Toc215215028 \h </w:instrText>
         </w:r>
         <w:r>
           <w:rPr>
@@ -258,7 +258,7 @@
           <w:noProof/>
         </w:rPr>
       </w:pPr>
-      <w:hyperlink w:anchor="_Toc215211540" w:history="1">
+      <w:hyperlink w:anchor="_Toc215215029" w:history="1">
         <w:r>
           <w:rPr>
             <w:rStyle w:val="Hyperlink"/>
@@ -288,7 +288,7 @@
             <w:noProof/>
             <w:webHidden/>
           </w:rPr>
-          <w:instrText xml:space="preserve"> PAGEREF _Toc215211540 \h </w:instrText>
+          <w:instrText xml:space="preserve"> PAGEREF _Toc215215029 \h </w:instrText>
         </w:r>
         <w:r>
           <w:rPr>
@@ -329,7 +329,7 @@
           <w:noProof/>
         </w:rPr>
       </w:pPr>
-      <w:hyperlink w:anchor="_Toc215211541" w:history="1">
+      <w:hyperlink w:anchor="_Toc215215030" w:history="1">
         <w:r>
           <w:rPr>
             <w:rStyle w:val="Hyperlink"/>
@@ -359,7 +359,7 @@
             <w:noProof/>
             <w:webHidden/>
           </w:rPr>
-          <w:instrText xml:space="preserve"> PAGEREF _Toc215211541 \h </w:instrText>
+          <w:instrText xml:space="preserve"> PAGEREF _Toc215215030 \h </w:instrText>
         </w:r>
         <w:r>
           <w:rPr>
@@ -400,7 +400,7 @@
           <w:noProof/>
         </w:rPr>
       </w:pPr>
-      <w:hyperlink w:anchor="_Toc215211542" w:history="1">
+      <w:hyperlink w:anchor="_Toc215215031" w:history="1">
         <w:r>
           <w:rPr>
             <w:rStyle w:val="Hyperlink"/>
@@ -430,7 +430,7 @@
             <w:noProof/>
             <w:webHidden/>
           </w:rPr>
-          <w:instrText xml:space="preserve"> PAGEREF _Toc215211542 \h </w:instrText>
+          <w:instrText xml:space="preserve"> PAGEREF _Toc215215031 \h </w:instrText>
         </w:r>
         <w:r>
           <w:rPr>
@@ -471,7 +471,7 @@
           <w:noProof/>
         </w:rPr>
       </w:pPr>
-      <w:hyperlink w:anchor="_Toc215211543" w:history="1">
+      <w:hyperlink w:anchor="_Toc215215032" w:history="1">
         <w:r>
           <w:rPr>
             <w:rStyle w:val="Hyperlink"/>
@@ -501,7 +501,7 @@
             <w:noProof/>
             <w:webHidden/>
           </w:rPr>
-          <w:instrText xml:space="preserve"> PAGEREF _Toc215211543 \h </w:instrText>
+          <w:instrText xml:space="preserve"> PAGEREF _Toc215215032 \h </w:instrText>
         </w:r>
         <w:r>
           <w:rPr>
@@ -542,7 +542,7 @@
           <w:noProof/>
         </w:rPr>
       </w:pPr>
-      <w:hyperlink w:anchor="_Toc215211544" w:history="1">
+      <w:hyperlink w:anchor="_Toc215215033" w:history="1">
         <w:r>
           <w:rPr>
             <w:rStyle w:val="Hyperlink"/>
@@ -572,7 +572,7 @@
             <w:noProof/>
             <w:webHidden/>
           </w:rPr>
-          <w:instrText xml:space="preserve"> PAGEREF _Toc215211544 \h </w:instrText>
+          <w:instrText xml:space="preserve"> PAGEREF _Toc215215033 \h </w:instrText>
         </w:r>
         <w:r>
           <w:rPr>
@@ -613,7 +613,7 @@
           <w:noProof/>
         </w:rPr>
       </w:pPr>
-      <w:hyperlink w:anchor="_Toc215211545" w:history="1">
+      <w:hyperlink w:anchor="_Toc215215034" w:history="1">
         <w:r>
           <w:rPr>
             <w:rStyle w:val="Hyperlink"/>
@@ -643,7 +643,7 @@
             <w:noProof/>
             <w:webHidden/>
           </w:rPr>
-          <w:instrText xml:space="preserve"> PAGEREF _Toc215211545 \h </w:instrText>
+          <w:instrText xml:space="preserve"> PAGEREF _Toc215215034 \h </w:instrText>
         </w:r>
         <w:r>
           <w:rPr>
@@ -694,7 +694,7 @@
         <w:pStyle w:val="Ttulo1"/>
         <w:spacing w:after="120"/>
       </w:pPr>
-      <w:bookmarkStart w:id="0" w:name="_Toc215211539"/>
+      <w:bookmarkStart w:id="0" w:name="_Toc215215028"/>
       <w:r>
         <w:rPr>
           <w:rFonts w:ascii="Arial" w:eastAsia="Arial" w:hAnsi="Arial"/>
@@ -767,7 +767,7 @@
         <w:pStyle w:val="Ttulo1"/>
         <w:spacing w:after="120"/>
       </w:pPr>
-      <w:bookmarkStart w:id="1" w:name="_Toc215211540"/>
+      <w:bookmarkStart w:id="1" w:name="_Toc215215029"/>
       <w:r>
         <w:rPr>
           <w:rFonts w:ascii="Arial" w:eastAsia="Arial" w:hAnsi="Arial"/>
@@ -798,7 +798,7 @@
         <w:pStyle w:val="Ttulo1"/>
         <w:spacing w:after="120"/>
       </w:pPr>
-      <w:bookmarkStart w:id="2" w:name="_Toc215211541"/>
+      <w:bookmarkStart w:id="2" w:name="_Toc215215030"/>
       <w:r>
         <w:rPr>
           <w:rFonts w:ascii="Arial" w:eastAsia="Arial" w:hAnsi="Arial"/>
@@ -859,7 +859,7 @@
           <w:color w:val="000000"/>
           <w:lang w:val="pt-BR" w:eastAsia="pt-BR" w:bidi="pt-BR"/>
         </w:rPr>
-        <w:t xml:space="preserve">  Área precisando de capinação no pátio de manobras do Terminal de Caruaru</w:t>
+        <w:t xml:space="preserve"> - Área precisando de capinação no pátio de manobras do Terminal de Caruaru</w:t>
       </w:r>
     </w:p>
     <w:p>
@@ -957,7 +957,7 @@
           <w:color w:val="000000"/>
           <w:lang w:val="pt-BR" w:eastAsia="pt-BR" w:bidi="pt-BR"/>
         </w:rPr>
-        <w:t xml:space="preserve">  Área precisando de capinação no terreno lateral do Terminal de Caruaru</w:t>
+        <w:t xml:space="preserve"> - Área precisando de capinação no terreno lateral do Terminal de Caruaru</w:t>
       </w:r>
     </w:p>
     <w:p>
@@ -1054,7 +1054,7 @@
           <w:color w:val="000000"/>
           <w:lang w:val="pt-BR" w:eastAsia="pt-BR" w:bidi="pt-BR"/>
         </w:rPr>
-        <w:t xml:space="preserve">  Área com infiltração na fachada lateral do Terminal de Caruaru</w:t>
+        <w:t xml:space="preserve"> - Área com infiltração na fachada lateral do Terminal de Caruaru</w:t>
       </w:r>
     </w:p>
     <w:p>
@@ -1151,7 +1151,7 @@
           <w:color w:val="000000"/>
           <w:lang w:val="pt-BR" w:eastAsia="pt-BR" w:bidi="pt-BR"/>
         </w:rPr>
-        <w:t xml:space="preserve">  Pintura desgastada no muro e na grade do pátio de manobra no Terminal de Caruaru</w:t>
+        <w:t xml:space="preserve"> - Pintura desgastada no muro e na grade do pátio de manobra no Terminal de Caruaru</w:t>
       </w:r>
     </w:p>
     <w:p>
@@ -1248,7 +1248,7 @@
           <w:color w:val="000000"/>
           <w:lang w:val="pt-BR" w:eastAsia="pt-BR" w:bidi="pt-BR"/>
         </w:rPr>
-        <w:t xml:space="preserve">  Pintura desgastada no muro lateral no Terminal de Caruaru</w:t>
+        <w:t xml:space="preserve"> - Pintura desgastada no muro lateral no Terminal de Caruaru</w:t>
       </w:r>
     </w:p>
     <w:p>
@@ -1345,7 +1345,7 @@
           <w:color w:val="000000"/>
           <w:lang w:val="pt-BR" w:eastAsia="pt-BR" w:bidi="pt-BR"/>
         </w:rPr>
-        <w:t xml:space="preserve">  Vidraças na parte administrativa precisando de limpeza no Terminal de Caruaru</w:t>
+        <w:t xml:space="preserve"> - Vidraças na parte administrativa precisando de limpeza no Terminal de Caruaru</w:t>
       </w:r>
     </w:p>
     <w:p>
@@ -1442,7 +1442,7 @@
           <w:color w:val="000000"/>
           <w:lang w:val="pt-BR" w:eastAsia="pt-BR" w:bidi="pt-BR"/>
         </w:rPr>
-        <w:t xml:space="preserve">  Meio-fio desgastado na entrada do Terminal de Caruaru</w:t>
+        <w:t xml:space="preserve"> - Meio-fio desgastado na entrada do Terminal de Caruaru</w:t>
       </w:r>
     </w:p>
     <w:p>
@@ -1540,7 +1540,7 @@
           <w:color w:val="000000"/>
           <w:lang w:val="pt-BR" w:eastAsia="pt-BR" w:bidi="pt-BR"/>
         </w:rPr>
-        <w:t xml:space="preserve">  Rampa para PCD desgastada no Terminal de Caruaru</w:t>
+        <w:t xml:space="preserve"> - Rampa para PCD desgastada no Terminal de Caruaru</w:t>
       </w:r>
     </w:p>
     <w:p>
@@ -1637,7 +1637,7 @@
           <w:color w:val="000000"/>
           <w:lang w:val="pt-BR" w:eastAsia="pt-BR" w:bidi="pt-BR"/>
         </w:rPr>
-        <w:t xml:space="preserve">  Desgaste do pavimento na rampa de carga e descarga na entrada do Terminal de Caruaru</w:t>
+        <w:t xml:space="preserve"> - Desgaste do pavimento na rampa de carga e descarga na entrada do Terminal de Caruaru</w:t>
       </w:r>
     </w:p>
     <w:p>
@@ -1749,7 +1749,7 @@
           <w:color w:val="000000"/>
           <w:lang w:val="pt-BR" w:eastAsia="pt-BR" w:bidi="pt-BR"/>
         </w:rPr>
-        <w:t xml:space="preserve">  Pintura desgastada no muro da lateral do Terminal de Garanhuns</w:t>
+        <w:t xml:space="preserve"> - Pintura desgastada no muro da lateral do Terminal de Garanhuns</w:t>
       </w:r>
     </w:p>
     <w:p>
@@ -1846,7 +1846,7 @@
           <w:color w:val="000000"/>
           <w:lang w:val="pt-BR" w:eastAsia="pt-BR" w:bidi="pt-BR"/>
         </w:rPr>
-        <w:t xml:space="preserve">  Pintura desgastada do muro do pátio de manobras no Terminal de Garanhuns</w:t>
+        <w:t xml:space="preserve"> - Pintura desgastada do muro do pátio de manobras no Terminal de Garanhuns</w:t>
       </w:r>
     </w:p>
     <w:p>
@@ -1943,7 +1943,7 @@
           <w:color w:val="000000"/>
           <w:lang w:val="pt-BR" w:eastAsia="pt-BR" w:bidi="pt-BR"/>
         </w:rPr>
-        <w:t xml:space="preserve">  Pintura desgastada das colunas da entrada do Terminal de Garanhuns</w:t>
+        <w:t xml:space="preserve"> - Pintura desgastada das colunas da entrada do Terminal de Garanhuns</w:t>
       </w:r>
     </w:p>
     <w:p>
@@ -2040,7 +2040,7 @@
           <w:color w:val="000000"/>
           <w:lang w:val="pt-BR" w:eastAsia="pt-BR" w:bidi="pt-BR"/>
         </w:rPr>
-        <w:t xml:space="preserve">  </w:t>
+        <w:t xml:space="preserve"> - </w:t>
       </w:r>
       <w:r>
         <w:rPr>
@@ -2145,7 +2145,7 @@
           <w:color w:val="000000"/>
           <w:lang w:val="pt-BR" w:eastAsia="pt-BR" w:bidi="pt-BR"/>
         </w:rPr>
-        <w:t xml:space="preserve">  Pintura desgastada na parede lateral direita no Terminal de Garanhuns</w:t>
+        <w:t xml:space="preserve"> - Pintura desgastada na parede lateral direita no Terminal de Garanhuns</w:t>
       </w:r>
     </w:p>
     <w:p>
@@ -2257,7 +2257,7 @@
           <w:color w:val="000000"/>
           <w:lang w:val="pt-BR" w:eastAsia="pt-BR" w:bidi="pt-BR"/>
         </w:rPr>
-        <w:t xml:space="preserve">  Infiltração em coluna de sustentação da estrutura metálica da área de embarque e desembarque do Terminal de Recife (TIP)</w:t>
+        <w:t xml:space="preserve"> - Infiltração em coluna de sustentação da estrutura metálica da área de embarque e desembarque do Terminal de Recife (TIP)</w:t>
       </w:r>
     </w:p>
     <w:p>
@@ -2303,7 +2303,7 @@
           <w:color w:val="000000"/>
           <w:lang w:val="pt-BR" w:eastAsia="pt-BR" w:bidi="pt-BR"/>
         </w:rPr>
-        <w:t>Situação da infiltração em coluna de sustentação do Terminal de Recife em 18/06/2025.</w:t>
+        <w:t>Foto 01 - Situação da infiltração em coluna de sustentação do Terminal de Recife em 18/06/2025.</w:t>
       </w:r>
     </w:p>
     <w:p>
@@ -2346,103 +2346,6 @@
           <w:u w:val="single"/>
           <w:lang w:val="pt-BR" w:eastAsia="pt-BR" w:bidi="pt-BR"/>
         </w:rPr>
-        <w:t>Não Conformidade TIP 2025_03</w:t>
-      </w:r>
-      <w:r>
-        <w:rPr>
-          <w:rFonts w:ascii="Arial" w:eastAsia="Arial" w:hAnsi="Arial"/>
-          <w:color w:val="000000"/>
-          <w:lang w:val="pt-BR" w:eastAsia="pt-BR" w:bidi="pt-BR"/>
-        </w:rPr>
-        <w:t xml:space="preserve">  Piso desgastado no banheiro feminino do primeiro andar do Terminal de Recife (TIP)</w:t>
-      </w:r>
-    </w:p>
-    <w:p>
-      <w:pPr>
-        <w:spacing w:after="0" w:line="260" w:lineRule="exact"/>
-        <w:jc w:val="lowKashida"/>
-      </w:pPr>
-      <w:r>
-        <w:rPr>
-          <w:rFonts w:ascii="Arial" w:eastAsia="Arial" w:hAnsi="Arial"/>
-          <w:b/>
-          <w:color w:val="000000"/>
-          <w:lang w:val="pt-BR" w:eastAsia="pt-BR" w:bidi="pt-BR"/>
-        </w:rPr>
-        <w:t xml:space="preserve">Informação da SOCICAM: </w:t>
-      </w:r>
-      <w:r>
-        <w:rPr>
-          <w:rFonts w:ascii="Arial" w:eastAsia="Arial" w:hAnsi="Arial"/>
-          <w:color w:val="000000"/>
-          <w:lang w:val="pt-BR" w:eastAsia="pt-BR" w:bidi="pt-BR"/>
-        </w:rPr>
-        <w:t>N/A</w:t>
-      </w:r>
-    </w:p>
-    <w:p>
-      <w:pPr>
-        <w:spacing w:after="0" w:line="260" w:lineRule="exact"/>
-        <w:jc w:val="lowKashida"/>
-      </w:pPr>
-      <w:r>
-        <w:rPr>
-          <w:rFonts w:ascii="Arial" w:eastAsia="Arial" w:hAnsi="Arial"/>
-          <w:b/>
-          <w:color w:val="000000"/>
-          <w:lang w:val="pt-BR" w:eastAsia="pt-BR" w:bidi="pt-BR"/>
-        </w:rPr>
-        <w:t xml:space="preserve">Constatação: </w:t>
-      </w:r>
-      <w:r>
-        <w:rPr>
-          <w:rFonts w:ascii="Arial" w:eastAsia="Arial" w:hAnsi="Arial"/>
-          <w:color w:val="000000"/>
-          <w:lang w:val="pt-BR" w:eastAsia="pt-BR" w:bidi="pt-BR"/>
-        </w:rPr>
-        <w:t>Barras repintadas, mas espelho ainda oxidado no banheiro feminino para PCD do Terminal de Recife em 18/06/2025</w:t>
-      </w:r>
-    </w:p>
-    <w:p>
-      <w:pPr>
-        <w:spacing w:after="0" w:line="260" w:lineRule="exact"/>
-        <w:jc w:val="lowKashida"/>
-      </w:pPr>
-      <w:r>
-        <w:rPr>
-          <w:rFonts w:ascii="Arial" w:eastAsia="Arial" w:hAnsi="Arial"/>
-          <w:b/>
-          <w:color w:val="000000"/>
-          <w:lang w:val="pt-BR" w:eastAsia="pt-BR" w:bidi="pt-BR"/>
-        </w:rPr>
-        <w:t xml:space="preserve">Análise da ARPE: </w:t>
-      </w:r>
-      <w:r>
-        <w:rPr>
-          <w:rFonts w:ascii="Arial" w:eastAsia="Arial" w:hAnsi="Arial"/>
-          <w:color w:val="000000"/>
-          <w:lang w:val="pt-BR" w:eastAsia="pt-BR" w:bidi="pt-BR"/>
-        </w:rPr>
-        <w:t>N/A</w:t>
-      </w:r>
-    </w:p>
-    <w:p>
-      <w:pPr>
-        <w:spacing w:after="240"/>
-      </w:pPr>
-    </w:p>
-    <w:p>
-      <w:pPr>
-        <w:jc w:val="lowKashida"/>
-      </w:pPr>
-      <w:r>
-        <w:rPr>
-          <w:rFonts w:ascii="Arial" w:eastAsia="Arial" w:hAnsi="Arial"/>
-          <w:b/>
-          <w:color w:val="000000"/>
-          <w:u w:val="single"/>
-          <w:lang w:val="pt-BR" w:eastAsia="pt-BR" w:bidi="pt-BR"/>
-        </w:rPr>
         <w:t>Não Conformidade TIP 2025_02</w:t>
       </w:r>
       <w:r>
@@ -2451,7 +2354,7 @@
           <w:color w:val="000000"/>
           <w:lang w:val="pt-BR" w:eastAsia="pt-BR" w:bidi="pt-BR"/>
         </w:rPr>
-        <w:t xml:space="preserve">  Falta de manutenção adequada no banheiro feminino para PCD localizado no primeiro andar do Terminal de Recife (TIP) associada a três Não Conformidades.</w:t>
+        <w:t xml:space="preserve"> - Falta de manutenção adequada no banheiro feminino para PCD localizado no primeiro andar do Terminal de Recife (TIP) associada a três Não Conformidades.</w:t>
       </w:r>
     </w:p>
     <w:p>
@@ -2470,7 +2373,7 @@
         <w:t>Não Conformidade TIP 2025_02.1</w:t>
       </w:r>
       <w:r>
-        <w:t xml:space="preserve">  </w:t>
+        <w:t xml:space="preserve"> - </w:t>
       </w:r>
       <w:r>
         <w:rPr>
@@ -2497,7 +2400,7 @@
         <w:t>Não Conformidade TIP 2025_02.2</w:t>
       </w:r>
       <w:r>
-        <w:t xml:space="preserve">  </w:t>
+        <w:t xml:space="preserve"> - </w:t>
       </w:r>
       <w:r>
         <w:rPr>
@@ -2524,7 +2427,7 @@
         <w:t>Não Conformidade TIP 2025_02.3</w:t>
       </w:r>
       <w:r>
-        <w:t xml:space="preserve">  </w:t>
+        <w:t xml:space="preserve"> - </w:t>
       </w:r>
       <w:r>
         <w:rPr>
@@ -2629,7 +2532,15 @@
           <w:color w:val="000000"/>
           <w:lang w:val="pt-BR" w:eastAsia="pt-BR" w:bidi="pt-BR"/>
         </w:rPr>
-        <w:t xml:space="preserve">  Porta com avaria no banheiro feminino do primeiro andar do Terminal de Recife (TIP)</w:t>
+        <w:t xml:space="preserve"> - </w:t>
+      </w:r>
+      <w:r>
+        <w:rPr>
+          <w:rFonts w:ascii="Arial" w:eastAsia="Arial" w:hAnsi="Arial"/>
+          <w:color w:val="000000"/>
+          <w:lang w:val="pt-BR" w:eastAsia="pt-BR" w:bidi="pt-BR"/>
+        </w:rPr>
+        <w:t>Porta com avaria no banheiro feminino do primeiro andar do Terminal de Recife (TIP)</w:t>
       </w:r>
     </w:p>
     <w:p>
@@ -2667,6 +2578,103 @@
           <w:color w:val="000000"/>
           <w:lang w:val="pt-BR" w:eastAsia="pt-BR" w:bidi="pt-BR"/>
         </w:rPr>
+        <w:t xml:space="preserve">Constatação: </w:t>
+      </w:r>
+      <w:r>
+        <w:rPr>
+          <w:rFonts w:ascii="Arial" w:eastAsia="Arial" w:hAnsi="Arial"/>
+          <w:color w:val="000000"/>
+          <w:lang w:val="pt-BR" w:eastAsia="pt-BR" w:bidi="pt-BR"/>
+        </w:rPr>
+        <w:t>Porta com avaria no banheiro feminino no Terminal de Recife em 18/06/2025.</w:t>
+      </w:r>
+    </w:p>
+    <w:p>
+      <w:pPr>
+        <w:spacing w:after="0" w:line="260" w:lineRule="exact"/>
+        <w:jc w:val="lowKashida"/>
+      </w:pPr>
+      <w:r>
+        <w:rPr>
+          <w:rFonts w:ascii="Arial" w:eastAsia="Arial" w:hAnsi="Arial"/>
+          <w:b/>
+          <w:color w:val="000000"/>
+          <w:lang w:val="pt-BR" w:eastAsia="pt-BR" w:bidi="pt-BR"/>
+        </w:rPr>
+        <w:t xml:space="preserve">Análise da ARPE: </w:t>
+      </w:r>
+      <w:r>
+        <w:rPr>
+          <w:rFonts w:ascii="Arial" w:eastAsia="Arial" w:hAnsi="Arial"/>
+          <w:color w:val="000000"/>
+          <w:lang w:val="pt-BR" w:eastAsia="pt-BR" w:bidi="pt-BR"/>
+        </w:rPr>
+        <w:t>N/A</w:t>
+      </w:r>
+    </w:p>
+    <w:p>
+      <w:pPr>
+        <w:spacing w:after="240"/>
+      </w:pPr>
+    </w:p>
+    <w:p>
+      <w:pPr>
+        <w:jc w:val="lowKashida"/>
+      </w:pPr>
+      <w:r>
+        <w:rPr>
+          <w:rFonts w:ascii="Arial" w:eastAsia="Arial" w:hAnsi="Arial"/>
+          <w:b/>
+          <w:color w:val="000000"/>
+          <w:u w:val="single"/>
+          <w:lang w:val="pt-BR" w:eastAsia="pt-BR" w:bidi="pt-BR"/>
+        </w:rPr>
+        <w:t>Não Conformidade TIP 2025_05</w:t>
+      </w:r>
+      <w:r>
+        <w:rPr>
+          <w:rFonts w:ascii="Arial" w:eastAsia="Arial" w:hAnsi="Arial"/>
+          <w:color w:val="000000"/>
+          <w:lang w:val="pt-BR" w:eastAsia="pt-BR" w:bidi="pt-BR"/>
+        </w:rPr>
+        <w:t xml:space="preserve"> - Pintura do meio-fio desgastada na área de circulação e manobra dos ônibus no pátio interno do Terminal de Recife (TIP)</w:t>
+      </w:r>
+    </w:p>
+    <w:p>
+      <w:pPr>
+        <w:spacing w:after="0" w:line="260" w:lineRule="exact"/>
+        <w:jc w:val="lowKashida"/>
+      </w:pPr>
+      <w:r>
+        <w:rPr>
+          <w:rFonts w:ascii="Arial" w:eastAsia="Arial" w:hAnsi="Arial"/>
+          <w:b/>
+          <w:color w:val="000000"/>
+          <w:lang w:val="pt-BR" w:eastAsia="pt-BR" w:bidi="pt-BR"/>
+        </w:rPr>
+        <w:t xml:space="preserve">Informação da SOCICAM: </w:t>
+      </w:r>
+      <w:r>
+        <w:rPr>
+          <w:rFonts w:ascii="Arial" w:eastAsia="Arial" w:hAnsi="Arial"/>
+          <w:color w:val="000000"/>
+          <w:lang w:val="pt-BR" w:eastAsia="pt-BR" w:bidi="pt-BR"/>
+        </w:rPr>
+        <w:t>N/A</w:t>
+      </w:r>
+    </w:p>
+    <w:p>
+      <w:pPr>
+        <w:spacing w:after="0" w:line="260" w:lineRule="exact"/>
+        <w:jc w:val="lowKashida"/>
+      </w:pPr>
+      <w:r>
+        <w:rPr>
+          <w:rFonts w:ascii="Arial" w:eastAsia="Arial" w:hAnsi="Arial"/>
+          <w:b/>
+          <w:color w:val="000000"/>
+          <w:lang w:val="pt-BR" w:eastAsia="pt-BR" w:bidi="pt-BR"/>
+        </w:rPr>
         <w:lastRenderedPageBreak/>
         <w:t xml:space="preserve">Constatação: </w:t>
       </w:r>
@@ -2676,7 +2684,7 @@
           <w:color w:val="000000"/>
           <w:lang w:val="pt-BR" w:eastAsia="pt-BR" w:bidi="pt-BR"/>
         </w:rPr>
-        <w:t>Porta com avaria no banheiro feminino no Terminal de Recife em 18/06/2025.</w:t>
+        <w:t>Detalhe da pintura do meio-fio iniciada no pátio interno no Terminal de Recife 18/06/2025.</w:t>
       </w:r>
     </w:p>
     <w:p>
@@ -2719,103 +2727,6 @@
           <w:u w:val="single"/>
           <w:lang w:val="pt-BR" w:eastAsia="pt-BR" w:bidi="pt-BR"/>
         </w:rPr>
-        <w:t>Não Conformidade TIP 2025_05</w:t>
-      </w:r>
-      <w:r>
-        <w:rPr>
-          <w:rFonts w:ascii="Arial" w:eastAsia="Arial" w:hAnsi="Arial"/>
-          <w:color w:val="000000"/>
-          <w:lang w:val="pt-BR" w:eastAsia="pt-BR" w:bidi="pt-BR"/>
-        </w:rPr>
-        <w:t xml:space="preserve">  Pintura do meio-fio desgastada na área de circulação e manobra dos ônibus no pátio interno do Terminal de Recife (TIP)</w:t>
-      </w:r>
-    </w:p>
-    <w:p>
-      <w:pPr>
-        <w:spacing w:after="0" w:line="260" w:lineRule="exact"/>
-        <w:jc w:val="lowKashida"/>
-      </w:pPr>
-      <w:r>
-        <w:rPr>
-          <w:rFonts w:ascii="Arial" w:eastAsia="Arial" w:hAnsi="Arial"/>
-          <w:b/>
-          <w:color w:val="000000"/>
-          <w:lang w:val="pt-BR" w:eastAsia="pt-BR" w:bidi="pt-BR"/>
-        </w:rPr>
-        <w:t xml:space="preserve">Informação da SOCICAM: </w:t>
-      </w:r>
-      <w:r>
-        <w:rPr>
-          <w:rFonts w:ascii="Arial" w:eastAsia="Arial" w:hAnsi="Arial"/>
-          <w:color w:val="000000"/>
-          <w:lang w:val="pt-BR" w:eastAsia="pt-BR" w:bidi="pt-BR"/>
-        </w:rPr>
-        <w:t>N/A</w:t>
-      </w:r>
-    </w:p>
-    <w:p>
-      <w:pPr>
-        <w:spacing w:after="0" w:line="260" w:lineRule="exact"/>
-        <w:jc w:val="lowKashida"/>
-      </w:pPr>
-      <w:r>
-        <w:rPr>
-          <w:rFonts w:ascii="Arial" w:eastAsia="Arial" w:hAnsi="Arial"/>
-          <w:b/>
-          <w:color w:val="000000"/>
-          <w:lang w:val="pt-BR" w:eastAsia="pt-BR" w:bidi="pt-BR"/>
-        </w:rPr>
-        <w:t xml:space="preserve">Constatação: </w:t>
-      </w:r>
-      <w:r>
-        <w:rPr>
-          <w:rFonts w:ascii="Arial" w:eastAsia="Arial" w:hAnsi="Arial"/>
-          <w:color w:val="000000"/>
-          <w:lang w:val="pt-BR" w:eastAsia="pt-BR" w:bidi="pt-BR"/>
-        </w:rPr>
-        <w:t>Detalhe da pintura do meio-fio iniciada no pátio interno no Terminal de Recife 18/06/2025.</w:t>
-      </w:r>
-    </w:p>
-    <w:p>
-      <w:pPr>
-        <w:spacing w:after="0" w:line="260" w:lineRule="exact"/>
-        <w:jc w:val="lowKashida"/>
-      </w:pPr>
-      <w:r>
-        <w:rPr>
-          <w:rFonts w:ascii="Arial" w:eastAsia="Arial" w:hAnsi="Arial"/>
-          <w:b/>
-          <w:color w:val="000000"/>
-          <w:lang w:val="pt-BR" w:eastAsia="pt-BR" w:bidi="pt-BR"/>
-        </w:rPr>
-        <w:t xml:space="preserve">Análise da ARPE: </w:t>
-      </w:r>
-      <w:r>
-        <w:rPr>
-          <w:rFonts w:ascii="Arial" w:eastAsia="Arial" w:hAnsi="Arial"/>
-          <w:color w:val="000000"/>
-          <w:lang w:val="pt-BR" w:eastAsia="pt-BR" w:bidi="pt-BR"/>
-        </w:rPr>
-        <w:t>N/A</w:t>
-      </w:r>
-    </w:p>
-    <w:p>
-      <w:pPr>
-        <w:spacing w:after="240"/>
-      </w:pPr>
-    </w:p>
-    <w:p>
-      <w:pPr>
-        <w:jc w:val="lowKashida"/>
-      </w:pPr>
-      <w:r>
-        <w:rPr>
-          <w:rFonts w:ascii="Arial" w:eastAsia="Arial" w:hAnsi="Arial"/>
-          <w:b/>
-          <w:color w:val="000000"/>
-          <w:u w:val="single"/>
-          <w:lang w:val="pt-BR" w:eastAsia="pt-BR" w:bidi="pt-BR"/>
-        </w:rPr>
         <w:t>Não Conformidade TIP 2025_06</w:t>
       </w:r>
       <w:r>
@@ -2824,7 +2735,7 @@
           <w:color w:val="000000"/>
           <w:lang w:val="pt-BR" w:eastAsia="pt-BR" w:bidi="pt-BR"/>
         </w:rPr>
-        <w:t xml:space="preserve">  Falta de manutenção adequada na infraestrutura do ponto de embarque e desembarque dos ônibus urbanos da RMR e na sinalização horizontal (faixa de pedestre) na entrada do Terminal de Recife (TIP), que se associa a duas Não Conformidades.</w:t>
+        <w:t xml:space="preserve"> - Falta de manutenção adequada na infraestrutura do ponto de embarque e desembarque dos ônibus urbanos da RMR e na sinalização horizontal (faixa de pedestre) na entrada do Terminal de Recife (TIP), que se associa a duas Não Conformidades.</w:t>
       </w:r>
     </w:p>
     <w:p>
@@ -2843,7 +2754,7 @@
         <w:t>Não Conformidade TIP 2025_06.1</w:t>
       </w:r>
       <w:r>
-        <w:t xml:space="preserve">  </w:t>
+        <w:t xml:space="preserve"> - </w:t>
       </w:r>
       <w:r>
         <w:rPr>
@@ -2870,7 +2781,7 @@
         <w:t>Não Conformidade TIP 2025_06.2</w:t>
       </w:r>
       <w:r>
-        <w:t xml:space="preserve">  </w:t>
+        <w:t xml:space="preserve"> - </w:t>
       </w:r>
       <w:r>
         <w:rPr>
@@ -2965,7 +2876,7 @@
         <w:pStyle w:val="Ttulo1"/>
         <w:spacing w:after="120"/>
       </w:pPr>
-      <w:bookmarkStart w:id="3" w:name="_Toc215211542"/>
+      <w:bookmarkStart w:id="3" w:name="_Toc215215031"/>
       <w:r>
         <w:rPr>
           <w:rFonts w:ascii="Arial" w:eastAsia="Arial" w:hAnsi="Arial"/>
@@ -3082,14 +2993,6 @@
                 <w:lang w:val="pt-BR" w:eastAsia="pt-BR" w:bidi="pt-BR"/>
               </w:rPr>
               <w:br/>
-            </w:r>
-            <w:r>
-              <w:rPr>
-                <w:rFonts w:ascii="Arial" w:eastAsia="Arial" w:hAnsi="Arial"/>
-                <w:b/>
-                <w:color w:val="000000"/>
-                <w:lang w:val="pt-BR" w:eastAsia="pt-BR" w:bidi="pt-BR"/>
-              </w:rPr>
               <w:t>Carta SAP/PER/ARPE</w:t>
             </w:r>
             <w:r>
@@ -3203,7 +3106,7 @@
                 <w:color w:val="000000"/>
                 <w:lang w:val="pt-BR" w:eastAsia="pt-BR" w:bidi="pt-BR"/>
               </w:rPr>
-              <w:t xml:space="preserve"> – Área precisando de capinação no pátio de manobras do Terminal de Caruaru</w:t>
+              <w:t xml:space="preserve"> - Área precisando de capinação no pátio de manobras do Terminal de Caruaru</w:t>
             </w:r>
           </w:p>
         </w:tc>
@@ -3299,7 +3202,7 @@
                 <w:color w:val="000000"/>
                 <w:lang w:val="pt-BR" w:eastAsia="pt-BR" w:bidi="pt-BR"/>
               </w:rPr>
-              <w:t xml:space="preserve"> – Área precisando de capinação no terreno lateral do Terminal de Caruaru</w:t>
+              <w:t xml:space="preserve"> - Área precisando de capinação no terreno lateral do Terminal de Caruaru</w:t>
             </w:r>
           </w:p>
         </w:tc>
@@ -3395,7 +3298,7 @@
                 <w:color w:val="000000"/>
                 <w:lang w:val="pt-BR" w:eastAsia="pt-BR" w:bidi="pt-BR"/>
               </w:rPr>
-              <w:t xml:space="preserve"> – Área com infiltração na fachada lateral do Terminal de Caruaru</w:t>
+              <w:t xml:space="preserve"> - Área com infiltração na fachada lateral do Terminal de Caruaru</w:t>
             </w:r>
           </w:p>
         </w:tc>
@@ -3491,7 +3394,7 @@
                 <w:color w:val="000000"/>
                 <w:lang w:val="pt-BR" w:eastAsia="pt-BR" w:bidi="pt-BR"/>
               </w:rPr>
-              <w:t xml:space="preserve"> – Pintura desgastada no muro e na grade do pátio de manobra no Terminal de Caruaru</w:t>
+              <w:t xml:space="preserve"> - Pintura desgastada no muro e na grade do pátio de manobra no Terminal de Caruaru</w:t>
             </w:r>
           </w:p>
         </w:tc>
@@ -3587,7 +3490,16 @@
                 <w:color w:val="000000"/>
                 <w:lang w:val="pt-BR" w:eastAsia="pt-BR" w:bidi="pt-BR"/>
               </w:rPr>
-              <w:t xml:space="preserve"> – Pintura desgastada no muro lateral no Terminal de Caruaru</w:t>
+              <w:t xml:space="preserve"> - Pintura desgastada no muro lateral no </w:t>
+            </w:r>
+            <w:r>
+              <w:rPr>
+                <w:rFonts w:ascii="Arial" w:eastAsia="Arial" w:hAnsi="Arial"/>
+                <w:color w:val="000000"/>
+                <w:lang w:val="pt-BR" w:eastAsia="pt-BR" w:bidi="pt-BR"/>
+              </w:rPr>
+              <w:lastRenderedPageBreak/>
+              <w:t>Terminal de Caruaru</w:t>
             </w:r>
           </w:p>
         </w:tc>
@@ -3605,6 +3517,7 @@
                 <w:color w:val="000000"/>
                 <w:lang w:val="pt-BR" w:eastAsia="pt-BR" w:bidi="pt-BR"/>
               </w:rPr>
+              <w:lastRenderedPageBreak/>
               <w:t>N/A</w:t>
             </w:r>
           </w:p>
@@ -3683,7 +3596,7 @@
                 <w:color w:val="000000"/>
                 <w:lang w:val="pt-BR" w:eastAsia="pt-BR" w:bidi="pt-BR"/>
               </w:rPr>
-              <w:t xml:space="preserve"> – Vidraças na parte administrativa precisando de limpeza no Terminal de Caruaru</w:t>
+              <w:t xml:space="preserve"> - Vidraças na parte administrativa precisando de limpeza no Terminal de Caruaru</w:t>
             </w:r>
           </w:p>
         </w:tc>
@@ -3779,7 +3692,7 @@
                 <w:color w:val="000000"/>
                 <w:lang w:val="pt-BR" w:eastAsia="pt-BR" w:bidi="pt-BR"/>
               </w:rPr>
-              <w:t xml:space="preserve"> – Meio-fio desgastado na entrada do Terminal de Caruaru</w:t>
+              <w:t xml:space="preserve"> - Meio-fio desgastado na entrada do Terminal de Caruaru</w:t>
             </w:r>
           </w:p>
         </w:tc>
@@ -3875,7 +3788,7 @@
                 <w:color w:val="000000"/>
                 <w:lang w:val="pt-BR" w:eastAsia="pt-BR" w:bidi="pt-BR"/>
               </w:rPr>
-              <w:t xml:space="preserve"> – Rampa para PCD desgastada no Terminal de Caruaru</w:t>
+              <w:t xml:space="preserve"> - Rampa para PCD desgastada no Terminal de Caruaru</w:t>
             </w:r>
           </w:p>
         </w:tc>
@@ -3971,7 +3884,7 @@
                 <w:color w:val="000000"/>
                 <w:lang w:val="pt-BR" w:eastAsia="pt-BR" w:bidi="pt-BR"/>
               </w:rPr>
-              <w:t xml:space="preserve"> – Desgaste do pavimento na rampa de carga e descarga na entrada do Terminal de Caruaru</w:t>
+              <w:t xml:space="preserve"> - Desgaste do pavimento na rampa de carga e descarga na entrada do Terminal de Caruaru</w:t>
             </w:r>
           </w:p>
         </w:tc>
@@ -4081,7 +3994,7 @@
                 <w:color w:val="000000"/>
                 <w:lang w:val="pt-BR" w:eastAsia="pt-BR" w:bidi="pt-BR"/>
               </w:rPr>
-              <w:t xml:space="preserve"> – Pintura desgastada no muro da lateral do Terminal de Garanhuns</w:t>
+              <w:t xml:space="preserve"> - Pintura desgastada no muro da lateral do Terminal de Garanhuns</w:t>
             </w:r>
           </w:p>
         </w:tc>
@@ -4177,7 +4090,7 @@
                 <w:color w:val="000000"/>
                 <w:lang w:val="pt-BR" w:eastAsia="pt-BR" w:bidi="pt-BR"/>
               </w:rPr>
-              <w:t xml:space="preserve"> – Pintura desgastada do muro do pátio de manobras no Terminal de Garanhuns</w:t>
+              <w:t xml:space="preserve"> - Pintura desgastada do muro do pátio de manobras no Terminal de Garanhuns</w:t>
             </w:r>
           </w:p>
         </w:tc>
@@ -4273,7 +4186,7 @@
                 <w:color w:val="000000"/>
                 <w:lang w:val="pt-BR" w:eastAsia="pt-BR" w:bidi="pt-BR"/>
               </w:rPr>
-              <w:t xml:space="preserve"> – Pintura desgastada das colunas da entrada do Terminal de Garanhuns</w:t>
+              <w:t xml:space="preserve"> - Pintura desgastada das colunas da entrada do Terminal de Garanhuns</w:t>
             </w:r>
           </w:p>
         </w:tc>
@@ -4369,7 +4282,7 @@
                 <w:color w:val="000000"/>
                 <w:lang w:val="pt-BR" w:eastAsia="pt-BR" w:bidi="pt-BR"/>
               </w:rPr>
-              <w:t xml:space="preserve"> – Pintura desgastada nas colunas da fachada do lado do pátio de manobras no Terminal de Garanhuns</w:t>
+              <w:t xml:space="preserve"> - Pintura desgastada nas colunas da fachada do lado do pátio de manobras no Terminal de Garanhuns</w:t>
             </w:r>
           </w:p>
         </w:tc>
@@ -4465,7 +4378,7 @@
                 <w:color w:val="000000"/>
                 <w:lang w:val="pt-BR" w:eastAsia="pt-BR" w:bidi="pt-BR"/>
               </w:rPr>
-              <w:t xml:space="preserve"> – Pintura desgastada na parede lateral direita no Terminal de Garanhuns</w:t>
+              <w:t xml:space="preserve"> - Pintura desgastada na parede lateral direita no Terminal de Garanhuns</w:t>
             </w:r>
           </w:p>
         </w:tc>
@@ -4575,7 +4488,16 @@
                 <w:color w:val="000000"/>
                 <w:lang w:val="pt-BR" w:eastAsia="pt-BR" w:bidi="pt-BR"/>
               </w:rPr>
-              <w:t xml:space="preserve"> – Infiltração em coluna de sustentação da estrutura metálica da área de embarque e desembarque do Terminal de Recife (TIP)</w:t>
+              <w:t xml:space="preserve"> - Infiltração em coluna de sustentação da </w:t>
+            </w:r>
+            <w:r>
+              <w:rPr>
+                <w:rFonts w:ascii="Arial" w:eastAsia="Arial" w:hAnsi="Arial"/>
+                <w:color w:val="000000"/>
+                <w:lang w:val="pt-BR" w:eastAsia="pt-BR" w:bidi="pt-BR"/>
+              </w:rPr>
+              <w:lastRenderedPageBreak/>
+              <w:t>estrutura metálica da área de embarque e desembarque do Terminal de Recife (TIP)</w:t>
             </w:r>
           </w:p>
         </w:tc>
@@ -4593,6 +4515,7 @@
                 <w:color w:val="000000"/>
                 <w:lang w:val="pt-BR" w:eastAsia="pt-BR" w:bidi="pt-BR"/>
               </w:rPr>
+              <w:lastRenderedPageBreak/>
               <w:t>LOREM IPSUM</w:t>
             </w:r>
           </w:p>
@@ -4671,7 +4594,7 @@
                 <w:color w:val="000000"/>
                 <w:lang w:val="pt-BR" w:eastAsia="pt-BR" w:bidi="pt-BR"/>
               </w:rPr>
-              <w:t xml:space="preserve"> – Falta de manutenção adequada no banheiro feminino para PCD localizado no primeiro andar do Terminal de Recife (TIP) associada a três Não Conformidades.</w:t>
+              <w:t xml:space="preserve"> - Falta de manutenção adequada no banheiro feminino para PCD localizado no primeiro andar do Terminal de Recife (TIP) associada a três Não Conformidades.</w:t>
             </w:r>
             <w:r>
               <w:rPr>
@@ -4794,7 +4717,7 @@
                 <w:color w:val="000000"/>
                 <w:lang w:val="pt-BR" w:eastAsia="pt-BR" w:bidi="pt-BR"/>
               </w:rPr>
-              <w:t xml:space="preserve"> – Piso desgastado no banheiro feminino do primeiro andar do Terminal de Recife (TIP)</w:t>
+              <w:t xml:space="preserve"> - Piso desgastado no banheiro feminino do primeiro andar do Terminal de Recife (TIP)</w:t>
             </w:r>
           </w:p>
         </w:tc>
@@ -4889,7 +4812,7 @@
                 <w:color w:val="000000"/>
                 <w:lang w:val="pt-BR" w:eastAsia="pt-BR" w:bidi="pt-BR"/>
               </w:rPr>
-              <w:t xml:space="preserve"> – Porta com avaria no banheiro feminino do primeiro andar do Terminal de Recife (TIP)</w:t>
+              <w:t xml:space="preserve"> - Porta com avaria no banheiro feminino do primeiro andar do Terminal de Recife (TIP)</w:t>
             </w:r>
           </w:p>
         </w:tc>
@@ -4985,16 +4908,7 @@
                 <w:color w:val="000000"/>
                 <w:lang w:val="pt-BR" w:eastAsia="pt-BR" w:bidi="pt-BR"/>
               </w:rPr>
-              <w:t xml:space="preserve"> – Pintura do meio-fio desgastada na área de circulação e manobra dos ônibus no pátio interno do Terminal de Recife </w:t>
-            </w:r>
-            <w:r>
-              <w:rPr>
-                <w:rFonts w:ascii="Arial" w:eastAsia="Arial" w:hAnsi="Arial"/>
-                <w:color w:val="000000"/>
-                <w:lang w:val="pt-BR" w:eastAsia="pt-BR" w:bidi="pt-BR"/>
-              </w:rPr>
-              <w:lastRenderedPageBreak/>
-              <w:t>(TIP)</w:t>
+              <w:t xml:space="preserve"> - Pintura do meio-fio desgastada na área de circulação e manobra dos ônibus no pátio interno do Terminal de Recife (TIP)</w:t>
             </w:r>
           </w:p>
         </w:tc>
@@ -5012,7 +4926,6 @@
                 <w:color w:val="000000"/>
                 <w:lang w:val="pt-BR" w:eastAsia="pt-BR" w:bidi="pt-BR"/>
               </w:rPr>
-              <w:lastRenderedPageBreak/>
               <w:t>N/A</w:t>
             </w:r>
           </w:p>
@@ -5091,7 +5004,16 @@
                 <w:color w:val="000000"/>
                 <w:lang w:val="pt-BR" w:eastAsia="pt-BR" w:bidi="pt-BR"/>
               </w:rPr>
-              <w:t xml:space="preserve"> – Falta de manutenção adequada na infraestrutura do ponto de embarque e desembarque dos ônibus urbanos da RMR e na sinalização horizontal (faixa de pedestre) na entrada do Terminal de Recife (TIP), que se associa a duas Não Conformidades.</w:t>
+              <w:t xml:space="preserve"> - Falta de manutenção adequada na infraestrutura do ponto de embarque e desembarque dos ônibus urbanos da RMR e na </w:t>
+            </w:r>
+            <w:r>
+              <w:rPr>
+                <w:rFonts w:ascii="Arial" w:eastAsia="Arial" w:hAnsi="Arial"/>
+                <w:color w:val="000000"/>
+                <w:lang w:val="pt-BR" w:eastAsia="pt-BR" w:bidi="pt-BR"/>
+              </w:rPr>
+              <w:lastRenderedPageBreak/>
+              <w:t>sinalização horizontal (faixa de pedestre) na entrada do Terminal de Recife (TIP), que se associa a duas Não Conformidades.</w:t>
             </w:r>
             <w:r>
               <w:rPr>
@@ -5127,6 +5049,7 @@
                 <w:color w:val="000000"/>
                 <w:lang w:val="pt-BR" w:eastAsia="pt-BR" w:bidi="pt-BR"/>
               </w:rPr>
+              <w:lastRenderedPageBreak/>
               <w:t>N/A</w:t>
             </w:r>
           </w:p>
@@ -5178,7 +5101,7 @@
         <w:pStyle w:val="Ttulo1"/>
         <w:spacing w:after="120"/>
       </w:pPr>
-      <w:bookmarkStart w:id="4" w:name="_Toc215211543"/>
+      <w:bookmarkStart w:id="4" w:name="_Toc215215032"/>
       <w:r>
         <w:rPr>
           <w:rFonts w:ascii="Arial" w:eastAsia="Arial" w:hAnsi="Arial"/>
@@ -5313,7 +5236,6 @@
           <w:color w:val="000000"/>
           <w:lang w:val="pt-BR" w:eastAsia="pt-BR" w:bidi="pt-BR"/>
         </w:rPr>
-        <w:lastRenderedPageBreak/>
         <w:t>Ciente.</w:t>
       </w:r>
     </w:p>
@@ -5363,6 +5285,7 @@
     <w:p/>
     <w:p>
       <w:r>
+        <w:lastRenderedPageBreak/>
         <w:br w:type="page"/>
       </w:r>
     </w:p>
@@ -5372,7 +5295,7 @@
         <w:shd w:val="clear" w:color="auto" w:fill="BFBFBF"/>
         <w:spacing w:after="120"/>
       </w:pPr>
-      <w:bookmarkStart w:id="5" w:name="_Toc215211544"/>
+      <w:bookmarkStart w:id="5" w:name="_Toc215215033"/>
       <w:r>
         <w:rPr>
           <w:rFonts w:ascii="Arial" w:eastAsia="Arial" w:hAnsi="Arial"/>
@@ -5410,7 +5333,7 @@
         <w:pStyle w:val="Ttulo2"/>
         <w:spacing w:after="120"/>
       </w:pPr>
-      <w:bookmarkStart w:id="6" w:name="_Toc215211545"/>
+      <w:bookmarkStart w:id="6" w:name="_Toc215215034"/>
       <w:r>
         <w:rPr>
           <w:rFonts w:ascii="Arial" w:eastAsia="Arial" w:hAnsi="Arial"/>
@@ -5474,7 +5397,7 @@
                 <w:noProof/>
               </w:rPr>
               <w:drawing>
-                <wp:inline distT="0" distB="0" distL="0" distR="0" wp14:anchorId="3B32C2B6" wp14:editId="2564A652">
+                <wp:inline distT="0" distB="0" distL="0" distR="0" wp14:anchorId="2D12BC6E" wp14:editId="42D3A64C">
                   <wp:extent cx="2743200" cy="2468880"/>
                   <wp:effectExtent l="0" t="0" r="0" b="0"/>
                   <wp:docPr id="2" name="Picture 2"/>
@@ -5524,7 +5447,7 @@
                 <w:noProof/>
               </w:rPr>
               <w:drawing>
-                <wp:inline distT="0" distB="0" distL="0" distR="0" wp14:anchorId="214D6857" wp14:editId="31A88F33">
+                <wp:inline distT="0" distB="0" distL="0" distR="0" wp14:anchorId="4C9F7F62" wp14:editId="1DE6C146">
                   <wp:extent cx="2743200" cy="2468880"/>
                   <wp:effectExtent l="0" t="0" r="0" b="0"/>
                   <wp:docPr id="3" name="Picture 3"/>
@@ -5578,7 +5501,7 @@
                 <w:sz w:val="20"/>
                 <w:lang w:val="pt-BR" w:eastAsia="pt-BR" w:bidi="pt-BR"/>
               </w:rPr>
-              <w:t>Situação da infiltração em coluna de sustentação do Terminal de Recife em 18/06/2025.</w:t>
+              <w:t>Foto 01 - Situação da infiltração em coluna de sustentação do Terminal de Recife em 18/06/2025.</w:t>
             </w:r>
           </w:p>
         </w:tc>
@@ -5594,7 +5517,7 @@
                 <w:sz w:val="20"/>
                 <w:lang w:val="pt-BR" w:eastAsia="pt-BR" w:bidi="pt-BR"/>
               </w:rPr>
-              <w:t>Situação da coluna de sustentação em processo de restauração no Terminal de Recife em 30/09/2025.</w:t>
+              <w:t>Foto 2- Situação da coluna de sustentação em processo de restauração no Terminal de Recife em 30/09/2025.</w:t>
             </w:r>
           </w:p>
         </w:tc>
@@ -5656,7 +5579,7 @@
                 <w:noProof/>
               </w:rPr>
               <w:drawing>
-                <wp:inline distT="0" distB="0" distL="0" distR="0" wp14:anchorId="2A8A56D8" wp14:editId="1832629B">
+                <wp:inline distT="0" distB="0" distL="0" distR="0" wp14:anchorId="389158C5" wp14:editId="3B075C34">
                   <wp:extent cx="2743200" cy="2468880"/>
                   <wp:effectExtent l="0" t="0" r="0" b="0"/>
                   <wp:docPr id="4" name="Picture 4"/>
@@ -5706,7 +5629,7 @@
                 <w:noProof/>
               </w:rPr>
               <w:drawing>
-                <wp:inline distT="0" distB="0" distL="0" distR="0" wp14:anchorId="5FFD8862" wp14:editId="1C65FAA9">
+                <wp:inline distT="0" distB="0" distL="0" distR="0" wp14:anchorId="2468FA2E" wp14:editId="6A526E88">
                   <wp:extent cx="2743200" cy="2468880"/>
                   <wp:effectExtent l="0" t="0" r="0" b="0"/>
                   <wp:docPr id="5" name="Picture 5"/>
@@ -5858,7 +5781,7 @@
                 <w:noProof/>
               </w:rPr>
               <w:drawing>
-                <wp:inline distT="0" distB="0" distL="0" distR="0" wp14:anchorId="0F4DDDD2" wp14:editId="39436C26">
+                <wp:inline distT="0" distB="0" distL="0" distR="0" wp14:anchorId="77673D9B" wp14:editId="4EB35A38">
                   <wp:extent cx="5486400" cy="3082916"/>
                   <wp:effectExtent l="0" t="0" r="0" b="0"/>
                   <wp:docPr id="6" name="Picture 6"/>
@@ -6111,31 +6034,31 @@
       </w:rPr>
     </w:lvl>
   </w:abstractNum>
-  <w:num w:numId="1" w16cid:durableId="151533743">
+  <w:num w:numId="1" w16cid:durableId="1875655765">
     <w:abstractNumId w:val="8"/>
   </w:num>
-  <w:num w:numId="2" w16cid:durableId="1660884337">
+  <w:num w:numId="2" w16cid:durableId="294678719">
     <w:abstractNumId w:val="6"/>
   </w:num>
-  <w:num w:numId="3" w16cid:durableId="1202285951">
+  <w:num w:numId="3" w16cid:durableId="1948661182">
     <w:abstractNumId w:val="5"/>
   </w:num>
-  <w:num w:numId="4" w16cid:durableId="989358467">
+  <w:num w:numId="4" w16cid:durableId="1184444349">
     <w:abstractNumId w:val="4"/>
   </w:num>
-  <w:num w:numId="5" w16cid:durableId="1319455215">
+  <w:num w:numId="5" w16cid:durableId="334261108">
     <w:abstractNumId w:val="7"/>
   </w:num>
-  <w:num w:numId="6" w16cid:durableId="1547987713">
+  <w:num w:numId="6" w16cid:durableId="471142316">
     <w:abstractNumId w:val="3"/>
   </w:num>
-  <w:num w:numId="7" w16cid:durableId="1816676425">
+  <w:num w:numId="7" w16cid:durableId="1592935717">
     <w:abstractNumId w:val="2"/>
   </w:num>
-  <w:num w:numId="8" w16cid:durableId="652029146">
+  <w:num w:numId="8" w16cid:durableId="1099330651">
     <w:abstractNumId w:val="1"/>
   </w:num>
-  <w:num w:numId="9" w16cid:durableId="86535829">
+  <w:num w:numId="9" w16cid:durableId="174850200">
     <w:abstractNumId w:val="0"/>
   </w:num>
 </w:numbering>
@@ -17528,7 +17451,7 @@
     <w:autoRedefine/>
     <w:uiPriority w:val="39"/>
     <w:unhideWhenUsed/>
-    <w:rsid w:val="00DC31C7"/>
+    <w:rsid w:val="006E3DC5"/>
     <w:pPr>
       <w:spacing w:after="100"/>
     </w:pPr>
@@ -17540,7 +17463,7 @@
     <w:autoRedefine/>
     <w:uiPriority w:val="39"/>
     <w:unhideWhenUsed/>
-    <w:rsid w:val="00DC31C7"/>
+    <w:rsid w:val="006E3DC5"/>
     <w:pPr>
       <w:spacing w:after="100"/>
       <w:ind w:left="220"/>
@@ -17551,7 +17474,7 @@
     <w:basedOn w:val="Fontepargpadro"/>
     <w:uiPriority w:val="99"/>
     <w:unhideWhenUsed/>
-    <w:rsid w:val="00DC31C7"/>
+    <w:rsid w:val="006E3DC5"/>
     <w:rPr>
       <w:color w:val="0000FF" w:themeColor="hyperlink"/>
       <w:u w:val="single"/>

</xml_diff>

<commit_message>
fix: alinhamento de índices de texto e filtro de falsos positivos nas NCs
</commit_message>
<xml_diff>
--- a/src/reports/relatorio_1.docx
+++ b/src/reports/relatorio_1.docx
@@ -44,7 +44,7 @@
           <w:noProof/>
         </w:rPr>
         <w:drawing>
-          <wp:inline distT="0" distB="0" distL="0" distR="0" wp14:anchorId="7C9FDD7C" wp14:editId="1C00DF27">
+          <wp:inline distT="0" distB="0" distL="0" distR="0" wp14:anchorId="1A117791" wp14:editId="2B24C387">
             <wp:extent cx="5943600" cy="5029200"/>
             <wp:effectExtent l="0" t="0" r="0" b="0"/>
             <wp:docPr id="1" name="Picture 1"/>
@@ -187,7 +187,7 @@
       <w:r>
         <w:fldChar w:fldCharType="separate"/>
       </w:r>
-      <w:hyperlink w:anchor="_Toc215215028" w:history="1">
+      <w:hyperlink w:anchor="_Toc215477646" w:history="1">
         <w:r>
           <w:rPr>
             <w:rStyle w:val="Hyperlink"/>
@@ -217,7 +217,7 @@
             <w:noProof/>
             <w:webHidden/>
           </w:rPr>
-          <w:instrText xml:space="preserve"> PAGEREF _Toc215215028 \h </w:instrText>
+          <w:instrText xml:space="preserve"> PAGEREF _Toc215477646 \h </w:instrText>
         </w:r>
         <w:r>
           <w:rPr>
@@ -258,7 +258,7 @@
           <w:noProof/>
         </w:rPr>
       </w:pPr>
-      <w:hyperlink w:anchor="_Toc215215029" w:history="1">
+      <w:hyperlink w:anchor="_Toc215477647" w:history="1">
         <w:r>
           <w:rPr>
             <w:rStyle w:val="Hyperlink"/>
@@ -288,7 +288,7 @@
             <w:noProof/>
             <w:webHidden/>
           </w:rPr>
-          <w:instrText xml:space="preserve"> PAGEREF _Toc215215029 \h </w:instrText>
+          <w:instrText xml:space="preserve"> PAGEREF _Toc215477647 \h </w:instrText>
         </w:r>
         <w:r>
           <w:rPr>
@@ -329,7 +329,7 @@
           <w:noProof/>
         </w:rPr>
       </w:pPr>
-      <w:hyperlink w:anchor="_Toc215215030" w:history="1">
+      <w:hyperlink w:anchor="_Toc215477648" w:history="1">
         <w:r>
           <w:rPr>
             <w:rStyle w:val="Hyperlink"/>
@@ -359,7 +359,7 @@
             <w:noProof/>
             <w:webHidden/>
           </w:rPr>
-          <w:instrText xml:space="preserve"> PAGEREF _Toc215215030 \h </w:instrText>
+          <w:instrText xml:space="preserve"> PAGEREF _Toc215477648 \h </w:instrText>
         </w:r>
         <w:r>
           <w:rPr>
@@ -400,7 +400,7 @@
           <w:noProof/>
         </w:rPr>
       </w:pPr>
-      <w:hyperlink w:anchor="_Toc215215031" w:history="1">
+      <w:hyperlink w:anchor="_Toc215477649" w:history="1">
         <w:r>
           <w:rPr>
             <w:rStyle w:val="Hyperlink"/>
@@ -430,7 +430,7 @@
             <w:noProof/>
             <w:webHidden/>
           </w:rPr>
-          <w:instrText xml:space="preserve"> PAGEREF _Toc215215031 \h </w:instrText>
+          <w:instrText xml:space="preserve"> PAGEREF _Toc215477649 \h </w:instrText>
         </w:r>
         <w:r>
           <w:rPr>
@@ -471,7 +471,7 @@
           <w:noProof/>
         </w:rPr>
       </w:pPr>
-      <w:hyperlink w:anchor="_Toc215215032" w:history="1">
+      <w:hyperlink w:anchor="_Toc215477650" w:history="1">
         <w:r>
           <w:rPr>
             <w:rStyle w:val="Hyperlink"/>
@@ -501,7 +501,7 @@
             <w:noProof/>
             <w:webHidden/>
           </w:rPr>
-          <w:instrText xml:space="preserve"> PAGEREF _Toc215215032 \h </w:instrText>
+          <w:instrText xml:space="preserve"> PAGEREF _Toc215477650 \h </w:instrText>
         </w:r>
         <w:r>
           <w:rPr>
@@ -542,7 +542,7 @@
           <w:noProof/>
         </w:rPr>
       </w:pPr>
-      <w:hyperlink w:anchor="_Toc215215033" w:history="1">
+      <w:hyperlink w:anchor="_Toc215477651" w:history="1">
         <w:r>
           <w:rPr>
             <w:rStyle w:val="Hyperlink"/>
@@ -572,7 +572,7 @@
             <w:noProof/>
             <w:webHidden/>
           </w:rPr>
-          <w:instrText xml:space="preserve"> PAGEREF _Toc215215033 \h </w:instrText>
+          <w:instrText xml:space="preserve"> PAGEREF _Toc215477651 \h </w:instrText>
         </w:r>
         <w:r>
           <w:rPr>
@@ -592,7 +592,7 @@
             <w:noProof/>
             <w:webHidden/>
           </w:rPr>
-          <w:t>12</w:t>
+          <w:t>11</w:t>
         </w:r>
         <w:r>
           <w:rPr>
@@ -613,7 +613,7 @@
           <w:noProof/>
         </w:rPr>
       </w:pPr>
-      <w:hyperlink w:anchor="_Toc215215034" w:history="1">
+      <w:hyperlink w:anchor="_Toc215477652" w:history="1">
         <w:r>
           <w:rPr>
             <w:rStyle w:val="Hyperlink"/>
@@ -643,7 +643,7 @@
             <w:noProof/>
             <w:webHidden/>
           </w:rPr>
-          <w:instrText xml:space="preserve"> PAGEREF _Toc215215034 \h </w:instrText>
+          <w:instrText xml:space="preserve"> PAGEREF _Toc215477652 \h </w:instrText>
         </w:r>
         <w:r>
           <w:rPr>
@@ -663,7 +663,7 @@
             <w:noProof/>
             <w:webHidden/>
           </w:rPr>
-          <w:t>12</w:t>
+          <w:t>11</w:t>
         </w:r>
         <w:r>
           <w:rPr>
@@ -694,7 +694,7 @@
         <w:pStyle w:val="Ttulo1"/>
         <w:spacing w:after="120"/>
       </w:pPr>
-      <w:bookmarkStart w:id="0" w:name="_Toc215215028"/>
+      <w:bookmarkStart w:id="0" w:name="_Toc215477646"/>
       <w:r>
         <w:rPr>
           <w:rFonts w:ascii="Arial" w:eastAsia="Arial" w:hAnsi="Arial"/>
@@ -767,7 +767,7 @@
         <w:pStyle w:val="Ttulo1"/>
         <w:spacing w:after="120"/>
       </w:pPr>
-      <w:bookmarkStart w:id="1" w:name="_Toc215215029"/>
+      <w:bookmarkStart w:id="1" w:name="_Toc215477647"/>
       <w:r>
         <w:rPr>
           <w:rFonts w:ascii="Arial" w:eastAsia="Arial" w:hAnsi="Arial"/>
@@ -798,7 +798,7 @@
         <w:pStyle w:val="Ttulo1"/>
         <w:spacing w:after="120"/>
       </w:pPr>
-      <w:bookmarkStart w:id="2" w:name="_Toc215215030"/>
+      <w:bookmarkStart w:id="2" w:name="_Toc215477648"/>
       <w:r>
         <w:rPr>
           <w:rFonts w:ascii="Arial" w:eastAsia="Arial" w:hAnsi="Arial"/>
@@ -905,7 +905,7 @@
           <w:color w:val="000000"/>
           <w:lang w:val="pt-BR" w:eastAsia="pt-BR" w:bidi="pt-BR"/>
         </w:rPr>
-        <w:t>Falta de capinação no pátio de manobras do Terminal de Caruaru em 09/06/2025.</w:t>
+        <w:t>N/A</w:t>
       </w:r>
     </w:p>
     <w:p>
@@ -948,7 +948,6 @@
           <w:u w:val="single"/>
           <w:lang w:val="pt-BR" w:eastAsia="pt-BR" w:bidi="pt-BR"/>
         </w:rPr>
-        <w:lastRenderedPageBreak/>
         <w:t>Não Conformidade CAR 2025_04</w:t>
       </w:r>
       <w:r>
@@ -972,6 +971,7 @@
           <w:color w:val="000000"/>
           <w:lang w:val="pt-BR" w:eastAsia="pt-BR" w:bidi="pt-BR"/>
         </w:rPr>
+        <w:lastRenderedPageBreak/>
         <w:t xml:space="preserve">Informação da SOCICAM: </w:t>
       </w:r>
       <w:r>
@@ -1003,7 +1003,7 @@
           <w:color w:val="000000"/>
           <w:lang w:val="pt-BR" w:eastAsia="pt-BR" w:bidi="pt-BR"/>
         </w:rPr>
-        <w:t>Falta capinação no terreno lateral do Terminal de Caruaru em 09/06/2025.</w:t>
+        <w:t>N/A</w:t>
       </w:r>
     </w:p>
     <w:p>
@@ -1100,7 +1100,7 @@
           <w:color w:val="000000"/>
           <w:lang w:val="pt-BR" w:eastAsia="pt-BR" w:bidi="pt-BR"/>
         </w:rPr>
-        <w:t>Detalhe da infiltração na parte lateral do Terminal de Caruaru em 09/06/2025.</w:t>
+        <w:t>N/A</w:t>
       </w:r>
     </w:p>
     <w:p>
@@ -1197,7 +1197,7 @@
           <w:color w:val="000000"/>
           <w:lang w:val="pt-BR" w:eastAsia="pt-BR" w:bidi="pt-BR"/>
         </w:rPr>
-        <w:t>Muro e grade internos com pinturas desgastadas no pátio de manobras do Terminal de Caruaru em 09/06/2025.</w:t>
+        <w:t>N/A</w:t>
       </w:r>
     </w:p>
     <w:p>
@@ -1294,7 +1294,7 @@
           <w:color w:val="000000"/>
           <w:lang w:val="pt-BR" w:eastAsia="pt-BR" w:bidi="pt-BR"/>
         </w:rPr>
-        <w:t>Muro externo continua com pintura desgastada do Terminal de Caruaru em 25/09/2025.</w:t>
+        <w:t>N/A</w:t>
       </w:r>
     </w:p>
     <w:p>
@@ -1391,7 +1391,7 @@
           <w:color w:val="000000"/>
           <w:lang w:val="pt-BR" w:eastAsia="pt-BR" w:bidi="pt-BR"/>
         </w:rPr>
-        <w:t>Vidraças na parte administrativa precisando de limpeza no Terminal de Caruaru em 09/06/2025.</w:t>
+        <w:t>N/A</w:t>
       </w:r>
     </w:p>
     <w:p>
@@ -1488,7 +1488,7 @@
           <w:color w:val="000000"/>
           <w:lang w:val="pt-BR" w:eastAsia="pt-BR" w:bidi="pt-BR"/>
         </w:rPr>
-        <w:t>Meio-fio desgastado na entrada do Terminal de Caruaru em 09/06/2025.</w:t>
+        <w:t>N/A</w:t>
       </w:r>
     </w:p>
     <w:p>
@@ -1531,7 +1531,6 @@
           <w:u w:val="single"/>
           <w:lang w:val="pt-BR" w:eastAsia="pt-BR" w:bidi="pt-BR"/>
         </w:rPr>
-        <w:lastRenderedPageBreak/>
         <w:t>Não Conformidade CAR 2025_10</w:t>
       </w:r>
       <w:r>
@@ -1586,7 +1585,7 @@
           <w:color w:val="000000"/>
           <w:lang w:val="pt-BR" w:eastAsia="pt-BR" w:bidi="pt-BR"/>
         </w:rPr>
-        <w:t>Rampa para PCD desgastada no Terminal de Caruaru em 09/06/2025.</w:t>
+        <w:t>N/A</w:t>
       </w:r>
     </w:p>
     <w:p>
@@ -1629,6 +1628,7 @@
           <w:u w:val="single"/>
           <w:lang w:val="pt-BR" w:eastAsia="pt-BR" w:bidi="pt-BR"/>
         </w:rPr>
+        <w:lastRenderedPageBreak/>
         <w:t>Não Conformidade CAR 2025_11</w:t>
       </w:r>
       <w:r>
@@ -1683,7 +1683,7 @@
           <w:color w:val="000000"/>
           <w:lang w:val="pt-BR" w:eastAsia="pt-BR" w:bidi="pt-BR"/>
         </w:rPr>
-        <w:t>Rampa de carga e descarga com desgaste no pavimento na entrada do Terminal de Caruaru em 09/06/2025.</w:t>
+        <w:t>N/A</w:t>
       </w:r>
     </w:p>
     <w:p>
@@ -1795,7 +1795,7 @@
           <w:color w:val="000000"/>
           <w:lang w:val="pt-BR" w:eastAsia="pt-BR" w:bidi="pt-BR"/>
         </w:rPr>
-        <w:t>Pintura desgastada do muro da lateral no Terminal de Garanhuns em 12/06/2025.</w:t>
+        <w:t>N/A</w:t>
       </w:r>
     </w:p>
     <w:p>
@@ -1892,7 +1892,7 @@
           <w:color w:val="000000"/>
           <w:lang w:val="pt-BR" w:eastAsia="pt-BR" w:bidi="pt-BR"/>
         </w:rPr>
-        <w:t>Pintura desgastada do muro da entrada do pátio de manobras no Terminal de Garanhuns em 12/06/2025.</w:t>
+        <w:t>N/A</w:t>
       </w:r>
     </w:p>
     <w:p>
@@ -1989,7 +1989,7 @@
           <w:color w:val="000000"/>
           <w:lang w:val="pt-BR" w:eastAsia="pt-BR" w:bidi="pt-BR"/>
         </w:rPr>
-        <w:t>Pintura desgastada das colunas da entrada do Terminal de Garanhuns em 12/06/2025.</w:t>
+        <w:t>N/A</w:t>
       </w:r>
     </w:p>
     <w:p>
@@ -2094,7 +2094,7 @@
           <w:color w:val="000000"/>
           <w:lang w:val="pt-BR" w:eastAsia="pt-BR" w:bidi="pt-BR"/>
         </w:rPr>
-        <w:t>Pintura desgastada nas colunas do pátio de manobras do Terminal de Garanhuns em 12/06/2025.</w:t>
+        <w:t>N/A</w:t>
       </w:r>
     </w:p>
     <w:p>
@@ -2191,7 +2191,7 @@
           <w:color w:val="000000"/>
           <w:lang w:val="pt-BR" w:eastAsia="pt-BR" w:bidi="pt-BR"/>
         </w:rPr>
-        <w:t>Pintura desgastada na parede lateral direita do Terminal de Garanhuns em 12/06/2025.</w:t>
+        <w:t>N/A</w:t>
       </w:r>
     </w:p>
     <w:p>
@@ -2249,6 +2249,7 @@
           <w:u w:val="single"/>
           <w:lang w:val="pt-BR" w:eastAsia="pt-BR" w:bidi="pt-BR"/>
         </w:rPr>
+        <w:lastRenderedPageBreak/>
         <w:t>Não Conformidade TIP 2025_01</w:t>
       </w:r>
       <w:r>
@@ -2303,7 +2304,7 @@
           <w:color w:val="000000"/>
           <w:lang w:val="pt-BR" w:eastAsia="pt-BR" w:bidi="pt-BR"/>
         </w:rPr>
-        <w:t>Foto 01 - Situação da infiltração em coluna de sustentação do Terminal de Recife em 18/06/2025.</w:t>
+        <w:t>O serviço de pintura está em andamento, conforme demonstrado no Memorial Fotográfico pelo comparativo entre a Foto 01 de 18/06/2025 e a Foto 02 de 30/09/2025.</w:t>
       </w:r>
     </w:p>
     <w:p>
@@ -2458,7 +2459,7 @@
           <w:color w:val="000000"/>
           <w:lang w:val="pt-BR" w:eastAsia="pt-BR" w:bidi="pt-BR"/>
         </w:rPr>
-        <w:t>N/A</w:t>
+        <w:t>A SOCICAM informou que os serviços estavam em andamento com prazo previsto para julho/2025 (Carta SAP/PER/ARPE N° 002/2025).</w:t>
       </w:r>
     </w:p>
     <w:p>
@@ -2481,7 +2482,7 @@
           <w:color w:val="000000"/>
           <w:lang w:val="pt-BR" w:eastAsia="pt-BR" w:bidi="pt-BR"/>
         </w:rPr>
-        <w:t>Espelho substituído no banheiro feminino para PCD 30/09/2025.</w:t>
+        <w:t>A pintura na porta foi finalizada, conforme demonstra o Memorial Fotográfico pelo comparativo entre a Foto 05 de 18/06/2025 e a Foto 06 de 30/09/2025.</w:t>
       </w:r>
     </w:p>
     <w:p>
@@ -2504,7 +2505,7 @@
           <w:color w:val="000000"/>
           <w:lang w:val="pt-BR" w:eastAsia="pt-BR" w:bidi="pt-BR"/>
         </w:rPr>
-        <w:t>N/A</w:t>
+        <w:t>Não Conformidade sanada.</w:t>
       </w:r>
     </w:p>
     <w:p>
@@ -2532,15 +2533,7 @@
           <w:color w:val="000000"/>
           <w:lang w:val="pt-BR" w:eastAsia="pt-BR" w:bidi="pt-BR"/>
         </w:rPr>
-        <w:t xml:space="preserve"> - </w:t>
-      </w:r>
-      <w:r>
-        <w:rPr>
-          <w:rFonts w:ascii="Arial" w:eastAsia="Arial" w:hAnsi="Arial"/>
-          <w:color w:val="000000"/>
-          <w:lang w:val="pt-BR" w:eastAsia="pt-BR" w:bidi="pt-BR"/>
-        </w:rPr>
-        <w:t>Porta com avaria no banheiro feminino do primeiro andar do Terminal de Recife (TIP)</w:t>
+        <w:t xml:space="preserve"> - Porta com avaria no banheiro feminino do primeiro andar do Terminal de Recife (TIP)</w:t>
       </w:r>
     </w:p>
     <w:p>
@@ -2586,7 +2579,7 @@
           <w:color w:val="000000"/>
           <w:lang w:val="pt-BR" w:eastAsia="pt-BR" w:bidi="pt-BR"/>
         </w:rPr>
-        <w:t>Porta com avaria no banheiro feminino no Terminal de Recife em 18/06/2025.</w:t>
+        <w:t>N/A</w:t>
       </w:r>
     </w:p>
     <w:p>
@@ -2675,7 +2668,6 @@
           <w:color w:val="000000"/>
           <w:lang w:val="pt-BR" w:eastAsia="pt-BR" w:bidi="pt-BR"/>
         </w:rPr>
-        <w:lastRenderedPageBreak/>
         <w:t xml:space="preserve">Constatação: </w:t>
       </w:r>
       <w:r>
@@ -2684,7 +2676,7 @@
           <w:color w:val="000000"/>
           <w:lang w:val="pt-BR" w:eastAsia="pt-BR" w:bidi="pt-BR"/>
         </w:rPr>
-        <w:t>Detalhe da pintura do meio-fio iniciada no pátio interno no Terminal de Recife 18/06/2025.</w:t>
+        <w:t>N/A</w:t>
       </w:r>
     </w:p>
     <w:p>
@@ -2804,6 +2796,7 @@
           <w:color w:val="000000"/>
           <w:lang w:val="pt-BR" w:eastAsia="pt-BR" w:bidi="pt-BR"/>
         </w:rPr>
+        <w:lastRenderedPageBreak/>
         <w:t xml:space="preserve">Informação da SOCICAM: </w:t>
       </w:r>
       <w:r>
@@ -2835,7 +2828,7 @@
           <w:color w:val="000000"/>
           <w:lang w:val="pt-BR" w:eastAsia="pt-BR" w:bidi="pt-BR"/>
         </w:rPr>
-        <w:t>Pintura da faixa de pedestres iniciada, na entrada do Terminal de Recife em 18/06/2025.</w:t>
+        <w:t>N/A</w:t>
       </w:r>
     </w:p>
     <w:p>
@@ -2876,7 +2869,7 @@
         <w:pStyle w:val="Ttulo1"/>
         <w:spacing w:after="120"/>
       </w:pPr>
-      <w:bookmarkStart w:id="3" w:name="_Toc215215031"/>
+      <w:bookmarkStart w:id="3" w:name="_Toc215477649"/>
       <w:r>
         <w:rPr>
           <w:rFonts w:ascii="Arial" w:eastAsia="Arial" w:hAnsi="Arial"/>
@@ -3220,7 +3213,7 @@
                 <w:color w:val="000000"/>
                 <w:lang w:val="pt-BR" w:eastAsia="pt-BR" w:bidi="pt-BR"/>
               </w:rPr>
-              <w:t>N/A</w:t>
+              <w:t>LOREM IPSUM</w:t>
             </w:r>
           </w:p>
         </w:tc>
@@ -3490,16 +3483,7 @@
                 <w:color w:val="000000"/>
                 <w:lang w:val="pt-BR" w:eastAsia="pt-BR" w:bidi="pt-BR"/>
               </w:rPr>
-              <w:t xml:space="preserve"> - Pintura desgastada no muro lateral no </w:t>
-            </w:r>
-            <w:r>
-              <w:rPr>
-                <w:rFonts w:ascii="Arial" w:eastAsia="Arial" w:hAnsi="Arial"/>
-                <w:color w:val="000000"/>
-                <w:lang w:val="pt-BR" w:eastAsia="pt-BR" w:bidi="pt-BR"/>
-              </w:rPr>
-              <w:lastRenderedPageBreak/>
-              <w:t>Terminal de Caruaru</w:t>
+              <w:t xml:space="preserve"> - Pintura desgastada no muro lateral no Terminal de Caruaru</w:t>
             </w:r>
           </w:p>
         </w:tc>
@@ -3517,7 +3501,6 @@
                 <w:color w:val="000000"/>
                 <w:lang w:val="pt-BR" w:eastAsia="pt-BR" w:bidi="pt-BR"/>
               </w:rPr>
-              <w:lastRenderedPageBreak/>
               <w:t>N/A</w:t>
             </w:r>
           </w:p>
@@ -3788,7 +3771,16 @@
                 <w:color w:val="000000"/>
                 <w:lang w:val="pt-BR" w:eastAsia="pt-BR" w:bidi="pt-BR"/>
               </w:rPr>
-              <w:t xml:space="preserve"> - Rampa para PCD desgastada no Terminal de Caruaru</w:t>
+              <w:t xml:space="preserve"> - Rampa para PCD desgastada no </w:t>
+            </w:r>
+            <w:r>
+              <w:rPr>
+                <w:rFonts w:ascii="Arial" w:eastAsia="Arial" w:hAnsi="Arial"/>
+                <w:color w:val="000000"/>
+                <w:lang w:val="pt-BR" w:eastAsia="pt-BR" w:bidi="pt-BR"/>
+              </w:rPr>
+              <w:lastRenderedPageBreak/>
+              <w:t>Terminal de Caruaru</w:t>
             </w:r>
           </w:p>
         </w:tc>
@@ -3806,6 +3798,7 @@
                 <w:color w:val="000000"/>
                 <w:lang w:val="pt-BR" w:eastAsia="pt-BR" w:bidi="pt-BR"/>
               </w:rPr>
+              <w:lastRenderedPageBreak/>
               <w:t>N/A</w:t>
             </w:r>
           </w:p>
@@ -4108,7 +4101,7 @@
                 <w:color w:val="000000"/>
                 <w:lang w:val="pt-BR" w:eastAsia="pt-BR" w:bidi="pt-BR"/>
               </w:rPr>
-              <w:t>N/A</w:t>
+              <w:t>LOREM IPSUM</w:t>
             </w:r>
           </w:p>
         </w:tc>
@@ -4488,7 +4481,103 @@
                 <w:color w:val="000000"/>
                 <w:lang w:val="pt-BR" w:eastAsia="pt-BR" w:bidi="pt-BR"/>
               </w:rPr>
-              <w:t xml:space="preserve"> - Infiltração em coluna de sustentação da </w:t>
+              <w:t xml:space="preserve"> - Infiltração em coluna de sustentação da estrutura metálica da área de embarque e desembarque do Terminal de Recife (TIP)</w:t>
+            </w:r>
+          </w:p>
+        </w:tc>
+        <w:tc>
+          <w:tcPr>
+            <w:tcW w:w="1728" w:type="dxa"/>
+          </w:tcPr>
+          <w:p>
+            <w:pPr>
+              <w:spacing w:line="260" w:lineRule="exact"/>
+            </w:pPr>
+            <w:r>
+              <w:rPr>
+                <w:rFonts w:ascii="Arial" w:eastAsia="Arial" w:hAnsi="Arial"/>
+                <w:color w:val="000000"/>
+                <w:lang w:val="pt-BR" w:eastAsia="pt-BR" w:bidi="pt-BR"/>
+              </w:rPr>
+              <w:t>LOREM IPSUM</w:t>
+            </w:r>
+          </w:p>
+        </w:tc>
+        <w:tc>
+          <w:tcPr>
+            <w:tcW w:w="1728" w:type="dxa"/>
+            <w:vAlign w:val="center"/>
+          </w:tcPr>
+          <w:p>
+            <w:pPr>
+              <w:jc w:val="center"/>
+            </w:pPr>
+            <w:r>
+              <w:rPr>
+                <w:rFonts w:ascii="Arial" w:eastAsia="Arial" w:hAnsi="Arial"/>
+                <w:color w:val="000000"/>
+                <w:lang w:val="pt-BR" w:eastAsia="pt-BR" w:bidi="pt-BR"/>
+              </w:rPr>
+              <w:t>18/06/2025</w:t>
+            </w:r>
+          </w:p>
+        </w:tc>
+        <w:tc>
+          <w:tcPr>
+            <w:tcW w:w="1728" w:type="dxa"/>
+            <w:vAlign w:val="center"/>
+          </w:tcPr>
+          <w:p>
+            <w:pPr>
+              <w:jc w:val="center"/>
+            </w:pPr>
+            <w:r>
+              <w:rPr>
+                <w:rFonts w:ascii="Arial" w:eastAsia="Arial" w:hAnsi="Arial"/>
+                <w:b/>
+                <w:color w:val="000000"/>
+                <w:lang w:val="pt-BR" w:eastAsia="pt-BR" w:bidi="pt-BR"/>
+              </w:rPr>
+              <w:t>PENDENTE</w:t>
+            </w:r>
+          </w:p>
+        </w:tc>
+      </w:tr>
+      <w:tr>
+        <w:trPr>
+          <w:jc w:val="center"/>
+        </w:trPr>
+        <w:tc>
+          <w:tcPr>
+            <w:tcW w:w="1728" w:type="dxa"/>
+            <w:vMerge/>
+          </w:tcPr>
+          <w:p/>
+        </w:tc>
+        <w:tc>
+          <w:tcPr>
+            <w:tcW w:w="1728" w:type="dxa"/>
+          </w:tcPr>
+          <w:p>
+            <w:pPr>
+              <w:spacing w:line="260" w:lineRule="exact"/>
+            </w:pPr>
+            <w:r>
+              <w:rPr>
+                <w:rFonts w:ascii="Arial" w:eastAsia="Arial" w:hAnsi="Arial"/>
+                <w:b/>
+                <w:color w:val="000000"/>
+                <w:lang w:val="pt-BR" w:eastAsia="pt-BR" w:bidi="pt-BR"/>
+              </w:rPr>
+              <w:t>TIP 2025_02</w:t>
+            </w:r>
+            <w:r>
+              <w:rPr>
+                <w:rFonts w:ascii="Arial" w:eastAsia="Arial" w:hAnsi="Arial"/>
+                <w:color w:val="000000"/>
+                <w:lang w:val="pt-BR" w:eastAsia="pt-BR" w:bidi="pt-BR"/>
+              </w:rPr>
+              <w:t xml:space="preserve"> - Falta de manutenção adequada no banheiro feminino para PCD localizado no primeiro andar do Terminal de Recife (TIP) </w:t>
             </w:r>
             <w:r>
               <w:rPr>
@@ -4497,7 +4586,34 @@
                 <w:lang w:val="pt-BR" w:eastAsia="pt-BR" w:bidi="pt-BR"/>
               </w:rPr>
               <w:lastRenderedPageBreak/>
-              <w:t>estrutura metálica da área de embarque e desembarque do Terminal de Recife (TIP)</w:t>
+              <w:t>associada a três Não Conformidades.</w:t>
+            </w:r>
+            <w:r>
+              <w:rPr>
+                <w:rFonts w:ascii="Arial" w:eastAsia="Arial" w:hAnsi="Arial"/>
+                <w:color w:val="000000"/>
+                <w:lang w:val="pt-BR" w:eastAsia="pt-BR" w:bidi="pt-BR"/>
+              </w:rPr>
+              <w:br/>
+              <w:t>TIP 02.1 - TIP 02.1 – Espelho oxidado</w:t>
+            </w:r>
+            <w:r>
+              <w:rPr>
+                <w:rFonts w:ascii="Arial" w:eastAsia="Arial" w:hAnsi="Arial"/>
+                <w:color w:val="000000"/>
+                <w:lang w:val="pt-BR" w:eastAsia="pt-BR" w:bidi="pt-BR"/>
+              </w:rPr>
+              <w:br/>
+              <w:t>TIP 02.2 - TIP 02.2 Barra oxidada em torno da pia</w:t>
+            </w:r>
+            <w:r>
+              <w:rPr>
+                <w:rFonts w:ascii="Arial" w:eastAsia="Arial" w:hAnsi="Arial"/>
+                <w:color w:val="000000"/>
+                <w:lang w:val="pt-BR" w:eastAsia="pt-BR" w:bidi="pt-BR"/>
+              </w:rPr>
+              <w:br/>
+              <w:t>TIP 02.3 - TIP 02.3 -Barra de apoio vertical oxidada</w:t>
             </w:r>
           </w:p>
         </w:tc>
@@ -4586,224 +4702,6 @@
                 <w:color w:val="000000"/>
                 <w:lang w:val="pt-BR" w:eastAsia="pt-BR" w:bidi="pt-BR"/>
               </w:rPr>
-              <w:t>TIP 2025_02</w:t>
-            </w:r>
-            <w:r>
-              <w:rPr>
-                <w:rFonts w:ascii="Arial" w:eastAsia="Arial" w:hAnsi="Arial"/>
-                <w:color w:val="000000"/>
-                <w:lang w:val="pt-BR" w:eastAsia="pt-BR" w:bidi="pt-BR"/>
-              </w:rPr>
-              <w:t xml:space="preserve"> - Falta de manutenção adequada no banheiro feminino para PCD localizado no primeiro andar do Terminal de Recife (TIP) associada a três Não Conformidades.</w:t>
-            </w:r>
-            <w:r>
-              <w:rPr>
-                <w:rFonts w:ascii="Arial" w:eastAsia="Arial" w:hAnsi="Arial"/>
-                <w:color w:val="000000"/>
-                <w:lang w:val="pt-BR" w:eastAsia="pt-BR" w:bidi="pt-BR"/>
-              </w:rPr>
-              <w:br/>
-              <w:t>TIP 02.1 - TIP 02.1 – Espelho oxidado</w:t>
-            </w:r>
-            <w:r>
-              <w:rPr>
-                <w:rFonts w:ascii="Arial" w:eastAsia="Arial" w:hAnsi="Arial"/>
-                <w:color w:val="000000"/>
-                <w:lang w:val="pt-BR" w:eastAsia="pt-BR" w:bidi="pt-BR"/>
-              </w:rPr>
-              <w:br/>
-              <w:t>TIP 02.2 - TIP 02.2 Barra oxidada em torno da pia</w:t>
-            </w:r>
-            <w:r>
-              <w:rPr>
-                <w:rFonts w:ascii="Arial" w:eastAsia="Arial" w:hAnsi="Arial"/>
-                <w:color w:val="000000"/>
-                <w:lang w:val="pt-BR" w:eastAsia="pt-BR" w:bidi="pt-BR"/>
-              </w:rPr>
-              <w:br/>
-              <w:t>TIP 02.3 - TIP 02.3 -Barra de apoio vertical oxidada</w:t>
-            </w:r>
-          </w:p>
-        </w:tc>
-        <w:tc>
-          <w:tcPr>
-            <w:tcW w:w="1728" w:type="dxa"/>
-          </w:tcPr>
-          <w:p>
-            <w:pPr>
-              <w:spacing w:line="260" w:lineRule="exact"/>
-            </w:pPr>
-            <w:r>
-              <w:rPr>
-                <w:rFonts w:ascii="Arial" w:eastAsia="Arial" w:hAnsi="Arial"/>
-                <w:color w:val="000000"/>
-                <w:lang w:val="pt-BR" w:eastAsia="pt-BR" w:bidi="pt-BR"/>
-              </w:rPr>
-              <w:t>hahaha</w:t>
-            </w:r>
-          </w:p>
-        </w:tc>
-        <w:tc>
-          <w:tcPr>
-            <w:tcW w:w="1728" w:type="dxa"/>
-            <w:vAlign w:val="center"/>
-          </w:tcPr>
-          <w:p>
-            <w:pPr>
-              <w:jc w:val="center"/>
-            </w:pPr>
-            <w:r>
-              <w:rPr>
-                <w:rFonts w:ascii="Arial" w:eastAsia="Arial" w:hAnsi="Arial"/>
-                <w:color w:val="000000"/>
-                <w:lang w:val="pt-BR" w:eastAsia="pt-BR" w:bidi="pt-BR"/>
-              </w:rPr>
-              <w:t>18/06/2025</w:t>
-            </w:r>
-          </w:p>
-        </w:tc>
-        <w:tc>
-          <w:tcPr>
-            <w:tcW w:w="1728" w:type="dxa"/>
-            <w:vAlign w:val="center"/>
-          </w:tcPr>
-          <w:p>
-            <w:pPr>
-              <w:jc w:val="center"/>
-            </w:pPr>
-            <w:r>
-              <w:rPr>
-                <w:rFonts w:ascii="Arial" w:eastAsia="Arial" w:hAnsi="Arial"/>
-                <w:b/>
-                <w:color w:val="000000"/>
-                <w:lang w:val="pt-BR" w:eastAsia="pt-BR" w:bidi="pt-BR"/>
-              </w:rPr>
-              <w:t>PENDENTE</w:t>
-            </w:r>
-          </w:p>
-        </w:tc>
-      </w:tr>
-      <w:tr>
-        <w:trPr>
-          <w:jc w:val="center"/>
-        </w:trPr>
-        <w:tc>
-          <w:tcPr>
-            <w:tcW w:w="1728" w:type="dxa"/>
-            <w:vMerge/>
-          </w:tcPr>
-          <w:p/>
-        </w:tc>
-        <w:tc>
-          <w:tcPr>
-            <w:tcW w:w="1728" w:type="dxa"/>
-          </w:tcPr>
-          <w:p>
-            <w:pPr>
-              <w:spacing w:line="260" w:lineRule="exact"/>
-            </w:pPr>
-            <w:r>
-              <w:rPr>
-                <w:rFonts w:ascii="Arial" w:eastAsia="Arial" w:hAnsi="Arial"/>
-                <w:b/>
-                <w:color w:val="000000"/>
-                <w:lang w:val="pt-BR" w:eastAsia="pt-BR" w:bidi="pt-BR"/>
-              </w:rPr>
-              <w:t>TIP 2025_03</w:t>
-            </w:r>
-            <w:r>
-              <w:rPr>
-                <w:rFonts w:ascii="Arial" w:eastAsia="Arial" w:hAnsi="Arial"/>
-                <w:color w:val="000000"/>
-                <w:lang w:val="pt-BR" w:eastAsia="pt-BR" w:bidi="pt-BR"/>
-              </w:rPr>
-              <w:t xml:space="preserve"> - Piso desgastado no banheiro feminino do primeiro andar do Terminal de Recife (TIP)</w:t>
-            </w:r>
-          </w:p>
-        </w:tc>
-        <w:tc>
-          <w:tcPr>
-            <w:tcW w:w="1728" w:type="dxa"/>
-          </w:tcPr>
-          <w:p>
-            <w:pPr>
-              <w:spacing w:line="260" w:lineRule="exact"/>
-            </w:pPr>
-            <w:r>
-              <w:rPr>
-                <w:rFonts w:ascii="Arial" w:eastAsia="Arial" w:hAnsi="Arial"/>
-                <w:color w:val="000000"/>
-                <w:lang w:val="pt-BR" w:eastAsia="pt-BR" w:bidi="pt-BR"/>
-              </w:rPr>
-              <w:t>lalala</w:t>
-            </w:r>
-          </w:p>
-        </w:tc>
-        <w:tc>
-          <w:tcPr>
-            <w:tcW w:w="1728" w:type="dxa"/>
-            <w:vAlign w:val="center"/>
-          </w:tcPr>
-          <w:p>
-            <w:pPr>
-              <w:jc w:val="center"/>
-            </w:pPr>
-            <w:r>
-              <w:rPr>
-                <w:rFonts w:ascii="Arial" w:eastAsia="Arial" w:hAnsi="Arial"/>
-                <w:color w:val="000000"/>
-                <w:lang w:val="pt-BR" w:eastAsia="pt-BR" w:bidi="pt-BR"/>
-              </w:rPr>
-              <w:t>18/06/2025</w:t>
-            </w:r>
-          </w:p>
-        </w:tc>
-        <w:tc>
-          <w:tcPr>
-            <w:tcW w:w="1728" w:type="dxa"/>
-            <w:vAlign w:val="center"/>
-          </w:tcPr>
-          <w:p>
-            <w:pPr>
-              <w:jc w:val="center"/>
-            </w:pPr>
-            <w:r>
-              <w:rPr>
-                <w:rFonts w:ascii="Arial" w:eastAsia="Arial" w:hAnsi="Arial"/>
-                <w:color w:val="000000"/>
-                <w:lang w:val="pt-BR" w:eastAsia="pt-BR" w:bidi="pt-BR"/>
-              </w:rPr>
-              <w:t>SANADA</w:t>
-            </w:r>
-          </w:p>
-        </w:tc>
-      </w:tr>
-      <w:tr>
-        <w:trPr>
-          <w:jc w:val="center"/>
-        </w:trPr>
-        <w:tc>
-          <w:tcPr>
-            <w:tcW w:w="1728" w:type="dxa"/>
-            <w:vMerge/>
-          </w:tcPr>
-          <w:p/>
-        </w:tc>
-        <w:tc>
-          <w:tcPr>
-            <w:tcW w:w="1728" w:type="dxa"/>
-          </w:tcPr>
-          <w:p>
-            <w:pPr>
-              <w:spacing w:line="260" w:lineRule="exact"/>
-            </w:pPr>
-            <w:r>
-              <w:rPr>
-                <w:rFonts w:ascii="Arial" w:eastAsia="Arial" w:hAnsi="Arial"/>
-                <w:b/>
-                <w:color w:val="000000"/>
-                <w:lang w:val="pt-BR" w:eastAsia="pt-BR" w:bidi="pt-BR"/>
-              </w:rPr>
               <w:t>TIP 2025_04</w:t>
             </w:r>
             <w:r>
@@ -4830,7 +4728,7 @@
                 <w:color w:val="000000"/>
                 <w:lang w:val="pt-BR" w:eastAsia="pt-BR" w:bidi="pt-BR"/>
               </w:rPr>
-              <w:t>pipipip</w:t>
+              <w:t>lalala</w:t>
             </w:r>
           </w:p>
         </w:tc>
@@ -4926,7 +4824,7 @@
                 <w:color w:val="000000"/>
                 <w:lang w:val="pt-BR" w:eastAsia="pt-BR" w:bidi="pt-BR"/>
               </w:rPr>
-              <w:t>N/A</w:t>
+              <w:t>hahaha</w:t>
             </w:r>
           </w:p>
         </w:tc>
@@ -5004,16 +4902,7 @@
                 <w:color w:val="000000"/>
                 <w:lang w:val="pt-BR" w:eastAsia="pt-BR" w:bidi="pt-BR"/>
               </w:rPr>
-              <w:t xml:space="preserve"> - Falta de manutenção adequada na infraestrutura do ponto de embarque e desembarque dos ônibus urbanos da RMR e na </w:t>
-            </w:r>
-            <w:r>
-              <w:rPr>
-                <w:rFonts w:ascii="Arial" w:eastAsia="Arial" w:hAnsi="Arial"/>
-                <w:color w:val="000000"/>
-                <w:lang w:val="pt-BR" w:eastAsia="pt-BR" w:bidi="pt-BR"/>
-              </w:rPr>
-              <w:lastRenderedPageBreak/>
-              <w:t>sinalização horizontal (faixa de pedestre) na entrada do Terminal de Recife (TIP), que se associa a duas Não Conformidades.</w:t>
+              <w:t xml:space="preserve"> - Falta de manutenção adequada na infraestrutura do ponto de embarque e desembarque dos ônibus urbanos da RMR e na sinalização horizontal (faixa de pedestre) na entrada do Terminal de Recife (TIP), que se associa a duas Não Conformidades.</w:t>
             </w:r>
             <w:r>
               <w:rPr>
@@ -5049,8 +4938,7 @@
                 <w:color w:val="000000"/>
                 <w:lang w:val="pt-BR" w:eastAsia="pt-BR" w:bidi="pt-BR"/>
               </w:rPr>
-              <w:lastRenderedPageBreak/>
-              <w:t>N/A</w:t>
+              <w:t>pipipip</w:t>
             </w:r>
           </w:p>
         </w:tc>
@@ -5101,7 +4989,7 @@
         <w:pStyle w:val="Ttulo1"/>
         <w:spacing w:after="120"/>
       </w:pPr>
-      <w:bookmarkStart w:id="4" w:name="_Toc215215032"/>
+      <w:bookmarkStart w:id="4" w:name="_Toc215477650"/>
       <w:r>
         <w:rPr>
           <w:rFonts w:ascii="Arial" w:eastAsia="Arial" w:hAnsi="Arial"/>
@@ -5110,6 +4998,7 @@
           <w:sz w:val="24"/>
           <w:lang w:val="pt-BR" w:eastAsia="pt-BR" w:bidi="pt-BR"/>
         </w:rPr>
+        <w:lastRenderedPageBreak/>
         <w:t>5. CONCLUSÃO</w:t>
       </w:r>
       <w:bookmarkEnd w:id="4"/>
@@ -5137,7 +5026,7 @@
           <w:color w:val="000000"/>
           <w:lang w:val="pt-BR" w:eastAsia="pt-BR" w:bidi="pt-BR"/>
         </w:rPr>
-        <w:t>Recife, 28/11/2025.</w:t>
+        <w:t>Recife, 01/12/2025.</w:t>
       </w:r>
     </w:p>
     <w:p/>
@@ -5285,7 +5174,6 @@
     <w:p/>
     <w:p>
       <w:r>
-        <w:lastRenderedPageBreak/>
         <w:br w:type="page"/>
       </w:r>
     </w:p>
@@ -5295,7 +5183,7 @@
         <w:shd w:val="clear" w:color="auto" w:fill="BFBFBF"/>
         <w:spacing w:after="120"/>
       </w:pPr>
-      <w:bookmarkStart w:id="5" w:name="_Toc215215033"/>
+      <w:bookmarkStart w:id="5" w:name="_Toc215477651"/>
       <w:r>
         <w:rPr>
           <w:rFonts w:ascii="Arial" w:eastAsia="Arial" w:hAnsi="Arial"/>
@@ -5333,7 +5221,7 @@
         <w:pStyle w:val="Ttulo2"/>
         <w:spacing w:after="120"/>
       </w:pPr>
-      <w:bookmarkStart w:id="6" w:name="_Toc215215034"/>
+      <w:bookmarkStart w:id="6" w:name="_Toc215477652"/>
       <w:r>
         <w:rPr>
           <w:rFonts w:ascii="Arial" w:eastAsia="Arial" w:hAnsi="Arial"/>
@@ -5397,7 +5285,7 @@
                 <w:noProof/>
               </w:rPr>
               <w:drawing>
-                <wp:inline distT="0" distB="0" distL="0" distR="0" wp14:anchorId="2D12BC6E" wp14:editId="42D3A64C">
+                <wp:inline distT="0" distB="0" distL="0" distR="0" wp14:anchorId="3C6DE151" wp14:editId="5E69C102">
                   <wp:extent cx="2743200" cy="2468880"/>
                   <wp:effectExtent l="0" t="0" r="0" b="0"/>
                   <wp:docPr id="2" name="Picture 2"/>
@@ -5447,7 +5335,7 @@
                 <w:noProof/>
               </w:rPr>
               <w:drawing>
-                <wp:inline distT="0" distB="0" distL="0" distR="0" wp14:anchorId="4C9F7F62" wp14:editId="1DE6C146">
+                <wp:inline distT="0" distB="0" distL="0" distR="0" wp14:anchorId="1A1E48BD" wp14:editId="16D93A6D">
                   <wp:extent cx="2743200" cy="2468880"/>
                   <wp:effectExtent l="0" t="0" r="0" b="0"/>
                   <wp:docPr id="3" name="Picture 3"/>
@@ -5540,209 +5428,6 @@
           <w:sz w:val="24"/>
           <w:lang w:val="pt-BR" w:eastAsia="pt-BR" w:bidi="pt-BR"/>
         </w:rPr>
-        <w:t>TIP 2025_03</w:t>
-      </w:r>
-      <w:r>
-        <w:rPr>
-          <w:rFonts w:ascii="Arial" w:eastAsia="Arial" w:hAnsi="Arial"/>
-          <w:color w:val="000000"/>
-          <w:lang w:val="pt-BR" w:eastAsia="pt-BR" w:bidi="pt-BR"/>
-        </w:rPr>
-        <w:t xml:space="preserve"> - Piso desgastado no banheiro feminino do primeiro andar do Terminal de Recife (TIP)</w:t>
-      </w:r>
-    </w:p>
-    <w:tbl>
-      <w:tblPr>
-        <w:tblStyle w:val="Tabelacomgrade"/>
-        <w:tblW w:w="0" w:type="auto"/>
-        <w:jc w:val="center"/>
-        <w:tblLook w:val="04A0" w:firstRow="1" w:lastRow="0" w:firstColumn="1" w:lastColumn="0" w:noHBand="0" w:noVBand="1"/>
-      </w:tblPr>
-      <w:tblGrid>
-        <w:gridCol w:w="4428"/>
-        <w:gridCol w:w="4428"/>
-      </w:tblGrid>
-      <w:tr>
-        <w:trPr>
-          <w:jc w:val="center"/>
-        </w:trPr>
-        <w:tc>
-          <w:tcPr>
-            <w:tcW w:w="4680" w:type="dxa"/>
-          </w:tcPr>
-          <w:p>
-            <w:pPr>
-              <w:jc w:val="center"/>
-            </w:pPr>
-            <w:r>
-              <w:rPr>
-                <w:noProof/>
-              </w:rPr>
-              <w:drawing>
-                <wp:inline distT="0" distB="0" distL="0" distR="0" wp14:anchorId="389158C5" wp14:editId="3B075C34">
-                  <wp:extent cx="2743200" cy="2468880"/>
-                  <wp:effectExtent l="0" t="0" r="0" b="0"/>
-                  <wp:docPr id="4" name="Picture 4"/>
-                  <wp:cNvGraphicFramePr>
-                    <a:graphicFrameLocks xmlns:a="http://schemas.openxmlformats.org/drawingml/2006/main" noChangeAspect="1"/>
-                  </wp:cNvGraphicFramePr>
-                  <a:graphic xmlns:a="http://schemas.openxmlformats.org/drawingml/2006/main">
-                    <a:graphicData uri="http://schemas.openxmlformats.org/drawingml/2006/picture">
-                      <pic:pic xmlns:pic="http://schemas.openxmlformats.org/drawingml/2006/picture">
-                        <pic:nvPicPr>
-                          <pic:cNvPr id="0" name="image.jpg"/>
-                          <pic:cNvPicPr/>
-                        </pic:nvPicPr>
-                        <pic:blipFill>
-                          <a:blip r:embed="rId9"/>
-                          <a:stretch>
-                            <a:fillRect/>
-                          </a:stretch>
-                        </pic:blipFill>
-                        <pic:spPr>
-                          <a:xfrm>
-                            <a:off x="0" y="0"/>
-                            <a:ext cx="2743200" cy="2468880"/>
-                          </a:xfrm>
-                          <a:prstGeom prst="rect">
-                            <a:avLst/>
-                          </a:prstGeom>
-                        </pic:spPr>
-                      </pic:pic>
-                    </a:graphicData>
-                  </a:graphic>
-                </wp:inline>
-              </w:drawing>
-            </w:r>
-          </w:p>
-        </w:tc>
-        <w:tc>
-          <w:tcPr>
-            <w:tcW w:w="4680" w:type="dxa"/>
-          </w:tcPr>
-          <w:p>
-            <w:pPr>
-              <w:jc w:val="center"/>
-            </w:pPr>
-            <w:r>
-              <w:rPr>
-                <w:noProof/>
-              </w:rPr>
-              <w:drawing>
-                <wp:inline distT="0" distB="0" distL="0" distR="0" wp14:anchorId="2468FA2E" wp14:editId="6A526E88">
-                  <wp:extent cx="2743200" cy="2468880"/>
-                  <wp:effectExtent l="0" t="0" r="0" b="0"/>
-                  <wp:docPr id="5" name="Picture 5"/>
-                  <wp:cNvGraphicFramePr>
-                    <a:graphicFrameLocks xmlns:a="http://schemas.openxmlformats.org/drawingml/2006/main" noChangeAspect="1"/>
-                  </wp:cNvGraphicFramePr>
-                  <a:graphic xmlns:a="http://schemas.openxmlformats.org/drawingml/2006/main">
-                    <a:graphicData uri="http://schemas.openxmlformats.org/drawingml/2006/picture">
-                      <pic:pic xmlns:pic="http://schemas.openxmlformats.org/drawingml/2006/picture">
-                        <pic:nvPicPr>
-                          <pic:cNvPr id="0" name="image.jpg"/>
-                          <pic:cNvPicPr/>
-                        </pic:nvPicPr>
-                        <pic:blipFill>
-                          <a:blip r:embed="rId10"/>
-                          <a:stretch>
-                            <a:fillRect/>
-                          </a:stretch>
-                        </pic:blipFill>
-                        <pic:spPr>
-                          <a:xfrm>
-                            <a:off x="0" y="0"/>
-                            <a:ext cx="2743200" cy="2468880"/>
-                          </a:xfrm>
-                          <a:prstGeom prst="rect">
-                            <a:avLst/>
-                          </a:prstGeom>
-                        </pic:spPr>
-                      </pic:pic>
-                    </a:graphicData>
-                  </a:graphic>
-                </wp:inline>
-              </w:drawing>
-            </w:r>
-          </w:p>
-        </w:tc>
-      </w:tr>
-      <w:tr>
-        <w:trPr>
-          <w:jc w:val="center"/>
-        </w:trPr>
-        <w:tc>
-          <w:tcPr>
-            <w:tcW w:w="4680" w:type="dxa"/>
-          </w:tcPr>
-          <w:p>
-            <w:r>
-              <w:rPr>
-                <w:rFonts w:ascii="Arial" w:eastAsia="Arial" w:hAnsi="Arial"/>
-                <w:color w:val="5A5A5A"/>
-                <w:sz w:val="20"/>
-                <w:lang w:val="pt-BR" w:eastAsia="pt-BR" w:bidi="pt-BR"/>
-              </w:rPr>
-              <w:t xml:space="preserve">Barras repintadas, mas espelho ainda oxidado </w:t>
-            </w:r>
-            <w:r>
-              <w:rPr>
-                <w:rFonts w:ascii="Arial" w:eastAsia="Arial" w:hAnsi="Arial"/>
-                <w:color w:val="5A5A5A"/>
-                <w:sz w:val="20"/>
-                <w:lang w:val="pt-BR" w:eastAsia="pt-BR" w:bidi="pt-BR"/>
-              </w:rPr>
-              <w:lastRenderedPageBreak/>
-              <w:t>no banheiro feminino para PCD do Terminal de Recife em 18/06/2025</w:t>
-            </w:r>
-          </w:p>
-        </w:tc>
-        <w:tc>
-          <w:tcPr>
-            <w:tcW w:w="4680" w:type="dxa"/>
-          </w:tcPr>
-          <w:p>
-            <w:r>
-              <w:rPr>
-                <w:rFonts w:ascii="Arial" w:eastAsia="Arial" w:hAnsi="Arial"/>
-                <w:color w:val="5A5A5A"/>
-                <w:sz w:val="20"/>
-                <w:lang w:val="pt-BR" w:eastAsia="pt-BR" w:bidi="pt-BR"/>
-              </w:rPr>
-              <w:lastRenderedPageBreak/>
-              <w:t xml:space="preserve">Espelho substituído no banheiro feminino para </w:t>
-            </w:r>
-            <w:r>
-              <w:rPr>
-                <w:rFonts w:ascii="Arial" w:eastAsia="Arial" w:hAnsi="Arial"/>
-                <w:color w:val="5A5A5A"/>
-                <w:sz w:val="20"/>
-                <w:lang w:val="pt-BR" w:eastAsia="pt-BR" w:bidi="pt-BR"/>
-              </w:rPr>
-              <w:lastRenderedPageBreak/>
-              <w:t>PCD 30/09/2025.</w:t>
-            </w:r>
-          </w:p>
-        </w:tc>
-      </w:tr>
-    </w:tbl>
-    <w:p>
-      <w:pPr>
-        <w:spacing w:after="240"/>
-      </w:pPr>
-    </w:p>
-    <w:p>
-      <w:pPr>
-        <w:spacing w:before="240" w:after="120"/>
-      </w:pPr>
-      <w:r>
-        <w:rPr>
-          <w:rFonts w:ascii="Arial" w:eastAsia="Arial" w:hAnsi="Arial"/>
-          <w:b/>
-          <w:color w:val="000000"/>
-          <w:sz w:val="24"/>
-          <w:lang w:val="pt-BR" w:eastAsia="pt-BR" w:bidi="pt-BR"/>
-        </w:rPr>
         <w:t>TIP 2025_04</w:t>
       </w:r>
       <w:r>
@@ -5780,11 +5465,12 @@
               <w:rPr>
                 <w:noProof/>
               </w:rPr>
+              <w:lastRenderedPageBreak/>
               <w:drawing>
-                <wp:inline distT="0" distB="0" distL="0" distR="0" wp14:anchorId="77673D9B" wp14:editId="4EB35A38">
+                <wp:inline distT="0" distB="0" distL="0" distR="0" wp14:anchorId="26A3312E" wp14:editId="5DA2736C">
                   <wp:extent cx="5486400" cy="3082916"/>
                   <wp:effectExtent l="0" t="0" r="0" b="0"/>
-                  <wp:docPr id="6" name="Picture 6"/>
+                  <wp:docPr id="4" name="Picture 4"/>
                   <wp:cNvGraphicFramePr>
                     <a:graphicFrameLocks xmlns:a="http://schemas.openxmlformats.org/drawingml/2006/main" noChangeAspect="1"/>
                   </wp:cNvGraphicFramePr>
@@ -5796,7 +5482,7 @@
                           <pic:cNvPicPr/>
                         </pic:nvPicPr>
                         <pic:blipFill>
-                          <a:blip r:embed="rId11"/>
+                          <a:blip r:embed="rId9"/>
                           <a:stretch>
                             <a:fillRect/>
                           </a:stretch>
@@ -6034,31 +5720,31 @@
       </w:rPr>
     </w:lvl>
   </w:abstractNum>
-  <w:num w:numId="1" w16cid:durableId="1875655765">
+  <w:num w:numId="1" w16cid:durableId="1492061756">
     <w:abstractNumId w:val="8"/>
   </w:num>
-  <w:num w:numId="2" w16cid:durableId="294678719">
+  <w:num w:numId="2" w16cid:durableId="1195968451">
     <w:abstractNumId w:val="6"/>
   </w:num>
-  <w:num w:numId="3" w16cid:durableId="1948661182">
+  <w:num w:numId="3" w16cid:durableId="302390974">
     <w:abstractNumId w:val="5"/>
   </w:num>
-  <w:num w:numId="4" w16cid:durableId="1184444349">
+  <w:num w:numId="4" w16cid:durableId="1305311520">
     <w:abstractNumId w:val="4"/>
   </w:num>
-  <w:num w:numId="5" w16cid:durableId="334261108">
+  <w:num w:numId="5" w16cid:durableId="7800601">
     <w:abstractNumId w:val="7"/>
   </w:num>
-  <w:num w:numId="6" w16cid:durableId="471142316">
+  <w:num w:numId="6" w16cid:durableId="79331316">
     <w:abstractNumId w:val="3"/>
   </w:num>
-  <w:num w:numId="7" w16cid:durableId="1592935717">
+  <w:num w:numId="7" w16cid:durableId="1196770521">
     <w:abstractNumId w:val="2"/>
   </w:num>
-  <w:num w:numId="8" w16cid:durableId="1099330651">
+  <w:num w:numId="8" w16cid:durableId="114905649">
     <w:abstractNumId w:val="1"/>
   </w:num>
-  <w:num w:numId="9" w16cid:durableId="174850200">
+  <w:num w:numId="9" w16cid:durableId="1561865884">
     <w:abstractNumId w:val="0"/>
   </w:num>
 </w:numbering>
@@ -17451,7 +17137,7 @@
     <w:autoRedefine/>
     <w:uiPriority w:val="39"/>
     <w:unhideWhenUsed/>
-    <w:rsid w:val="006E3DC5"/>
+    <w:rsid w:val="009B264F"/>
     <w:pPr>
       <w:spacing w:after="100"/>
     </w:pPr>
@@ -17463,7 +17149,7 @@
     <w:autoRedefine/>
     <w:uiPriority w:val="39"/>
     <w:unhideWhenUsed/>
-    <w:rsid w:val="006E3DC5"/>
+    <w:rsid w:val="009B264F"/>
     <w:pPr>
       <w:spacing w:after="100"/>
       <w:ind w:left="220"/>
@@ -17474,7 +17160,7 @@
     <w:basedOn w:val="Fontepargpadro"/>
     <w:uiPriority w:val="99"/>
     <w:unhideWhenUsed/>
-    <w:rsid w:val="006E3DC5"/>
+    <w:rsid w:val="009B264F"/>
     <w:rPr>
       <w:color w:val="0000FF" w:themeColor="hyperlink"/>
       <w:u w:val="single"/>

</xml_diff>